<commit_message>
feat(crateus-ideb): pesquisa original com RQ, SE clusterizado, figuras e 23 testes (R426)
- Remove referências a estudo anterior/ARM/espelho do manuscrito (MD e TeX)
- Adiciona pergunta de pesquisa (RQ) explícita e seção de falsificabilidade
- Auditoria: FE com erros padrão clusterizados CRVE por município (t com G-1=8);
  IC95 cluster [-1,51; 6,73] p=0,18; MDES 5,71; TOST p=0,90
- scripts/graficos_crateus.py: 4 gráficos (niveis, serie, LOOCV, ganho x renda)
- 6 figuras (2 mapas + 4 graficos) incorporadas ao MD/TeX; PDF 13p 0 Overfull;
  DOCX com 6 imagens e 4 tabelas com bordas
- 23 testes R426; subset R423+R425+R426: 46 passed
</commit_message>
<xml_diff>
--- a/academic/papers/crateus_ideb/outputs/docx/ARTIGO_CRATEUS_RBEP.docx
+++ b/academic/papers/crateus_ideb/outputs/docx/ARTIGO_CRATEUS_RBEP.docx
@@ -28,7 +28,7 @@
         </w:p>
       </w:sdtContent>
     </w:sdt>
-    <w:bookmarkStart w:id="32" w:name="X7b4b85c5a82152c1284d87e4bcacb709da3f19f"/>
+    <w:bookmarkStart w:id="51" w:name="X7b4b85c5a82152c1284d87e4bcacb709da3f19f"/>
     <w:p>
       <w:pPr>
         <w:pStyle w:val="Heading1"/>
@@ -76,7 +76,7 @@
         <w:pStyle w:val="FirstParagraph"/>
       </w:pPr>
       <w:r>
-        <w:t xml:space="preserve">Este estudo testa, na microrregião do Sertão de Cratéus (Ceará, IBGE 23018; nove municípios), se o padrão associativo entre desempenho escolar (IDEB) e renda municipal identificado em nível nacional — forte em níveis, mas não discernível dentro das unidades ao longo do tempo — se reproduz em escala subnacional. Com dados oficiais e auditáveis (INEP, edições 2005–2025; IBGE, PIB municipal 2010–2021 e Censo Demográfico 2022) e protocolo de validação espelhado em estudo anterior (bootstrap por cluster, primeiras diferenças, efeitos fixos de município e ano, validação cruzada leave-one-out por município, MDES e TOST), encontramos: (i) correlação transversal moderada-forte entre IDEB e log do PIB per capita defasado (r = 0,49; IC95% [0,34; 0,64]), replicada fora da amostra em 9/9 municípios (LOOCV mediana r = 0,62); (ii) associação dentro da unidade nula (primeiras diferenças r = −0,05, p = 0,61) e coeficiente de efeitos fixos não significativo (β = 2,61; IC95% [−1,59; 6,80]; p = 0,23); (iii) MDES de 6,05 pontos e TOST não significativo, indicando não-detecção (não equivalência) dado o n municipal; e (iv) evidência de que a premissa de estagnação do IDEB não se sustenta com os dados mais recentes: os nove municípios atingiram a meta pactuada para 2021 e apresentaram ganho médio de 5,93 pontos (anos iniciais, 2007–2025), sem associação estatisticamente discernível entre ganho educacional e renda do responsável (r = −0,14; p = 0,73). Conclui-se que a associação renda–desempenho no Sertão de Cratéus reproduz o padrão nacional (associação em níveis, ausência de associação dentro), enquanto o crescimento educacional observado não acompanha variações de renda municipal — consistente com a literatura sobre políticas educacionais do Ceará, embora sem pretensão causal.</w:t>
+        <w:t xml:space="preserve">Este estudo testa, na microrregião do Sertão de Cratéus (Ceará, IBGE 23018; nove municípios), a relação entre desempenho escolar (IDEB) e renda municipal em duas dimensões complementares: entre unidades (níveis) e dentro das unidades ao longo do tempo. Com dados oficiais e auditáveis (INEP, edições 2005–2025; IBGE, PIB municipal 2010–2021 e Censo Demográfico 2022) e protocolo de validação robusto (bootstrap por cluster, primeiras diferenças, efeitos fixos de município e ano com erros clusterizados, validação cruzada leave-one-out por município, MDES e TOST), encontramos: (i) correlação transversal moderada-forte entre IDEB e log do PIB per capita defasado (r = 0,49; IC95% [0,34; 0,64]), replicada fora da amostra em 9/9 municípios (LOOCV mediana r = 0,62); (ii) associação dentro da unidade nula (primeiras diferenças r = −0,05, p = 0,61) e coeficiente de efeitos fixos não significativo mesmo com erros clusterizados por município (β = 2,61; IC95% cluster [−1,51; 6,73]; p = 0,18); (iii) MDES de 5,71 pontos (cluster) e TOST não significativo, indicando não-detecção (não equivalência) dado o n municipal; e (iv) evidência de que a premissa de estagnação do IDEB não se sustenta com os dados mais recentes: os nove municípios atingiram a meta pactuada para 2021 e apresentaram ganho médio de 5,93 pontos (anos iniciais, 2007–2025), sem associação estatisticamente discernível entre ganho educacional e renda do responsável (r = −0,14; p = 0,73). Conclui-se que, no Sertão de Cratéus, a associação renda–desempenho é transversal (entre municípios) e não temporal (dentro dos municípios), enquanto o crescimento educacional observado não acompanha variações de renda municipal — consistente com a literatura sobre políticas educacionais do Ceará, embora sem pretensão causal.</w:t>
       </w:r>
     </w:p>
     <w:p>
@@ -119,7 +119,7 @@
         <w:pStyle w:val="FirstParagraph"/>
       </w:pPr>
       <w:r>
-        <w:t xml:space="preserve">This study tests, in the Sertão de Cratéus microregion (Ceará state, Brazil; IBGE 23018; nine municipalities), whether the associative pattern between school performance (IDEB) and municipal income identified at the national level — strong across units, but not discernible within units over time — reproduces at the subnational scale. Using official auditable data (INEP, 2005–2025 editions; IBGE, municipal GDP 2010–2021 and 2022 Demographic Census) and a validation protocol mirrored on a previous study (cluster bootstrap, first differences, municipality-and-year fixed effects, leave-one-out cross-validation by municipality, MDES and TOST), we find: (i) moderate-to-strong cross-sectional correlation between IDEB and lagged log GDP per capita (r = 0.49; 95% CI [0.34; 0.64]), replicated out-of-sample in 9/9 municipalities (LOOCV median r = 0.62); (ii) null within-unit association (first differences r = −0.05, p = 0.61) and nonsignificant fixed-effects coefficient (β = 2.61; 95% CI [−1.59, 6.80]; p = 0.23); (iii) MDES of 6.05 points and nonsignificant TOST, indicating non-detection (not equivalence) given the municipal sample size; and (iv) evidence that the premise of IDEB stagnation does not hold in the most recent data: all nine municipalities met the pactuated target for 2021 and showed a mean gain of 5.93 points (early grades, 2007–2025), with no statistically discernible association between educational gain and household head income (r = −0.14; p = 0.73). The income–performance association in Sertão de Cratéus reproduces the national pattern (association in levels, absence of within-unit association), while observed educational growth does not track municipal income variation — consistent with the literature on Ceará’s education policies, with no causal claims.</w:t>
+        <w:t xml:space="preserve">This study tests, in the Sertão de Cratéus microregion (Ceará state, Brazil; IBGE 23018; nine municipalities), the relationship between school performance (IDEB) and municipal income in two complementary dimensions: across units (levels) and within units over time. Using official auditable data (INEP, 2005–2025 editions; IBGE, municipal GDP 2010–2021 and 2022 Demographic Census) and a robust validation protocol (cluster bootstrap, first differences, municipality-and-year fixed effects with clustered errors, leave-one-out cross-validation by municipality, MDES and TOST), we find: (i) moderate-to-strong cross-sectional correlation between IDEB and lagged log GDP per capita (r = 0.49; 95% CI [0.34; 0.64]), replicated out-of-sample in 9/9 municipalities (LOOCV median r = 0.62); (ii) null within-unit association (first differences r = −0.05, p = 0.61) and nonsignificant fixed-effects coefficient even with municipality-clustered errors (β = 2.61; 95% clustered CI [−1.51, 6.73]; p = 0.18); (iii) MDES of 5.71 points (clustered) and nonsignificant TOST, indicating non-detection (not equivalence) given the municipal sample size; and (iv) evidence that the premise of IDEB stagnation does not hold in the most recent data: all nine municipalities met the pactuated target for 2021 and showed a mean gain of 5.93 points (early grades, 2007–2025), with no statistically discernible association between educational gain and household head income (r = −0.14; p = 0.73). In Sertão de Cratéus, the income–performance association is cross-sectional (between municipalities) rather than temporal (within municipalities), while observed educational growth does not track municipal income variation — consistent with the literature on Ceará’s education policies, with no causal claims.</w:t>
       </w:r>
     </w:p>
     <w:p>
@@ -182,7 +182,39 @@
         <w:pStyle w:val="BodyText"/>
       </w:pPr>
       <w:r>
-        <w:t xml:space="preserve">O presente trabalho parte de um estudo anterior que identificou, em nível de países, um padrão associativo específico: correlação forte e consistente entre desempenho escolar e renda quando se comparam unidades entre si (níveis), mas associação nula ou frágil quando se examina a variação dentro das unidades ao longo do tempo (primeiras diferenças e efeitos fixos). A questão aqui é saber se esse padrão se reproduz em escala subnacional, em uma microrregião do Semiárido cearense historicamente associada a baixos indicadores socioeconômicos: o Sertão de Cratéus.</w:t>
+        <w:t xml:space="preserve">Uma distinção analítica frequentemente negligenciada separa dois tipos de associação entre renda e desempenho escolar: a</w:t>
+      </w:r>
+      <w:r>
+        <w:t xml:space="preserve"> </w:t>
+      </w:r>
+      <w:r>
+        <w:rPr>
+          <w:b/>
+          <w:bCs/>
+        </w:rPr>
+        <w:t xml:space="preserve">transversal</w:t>
+      </w:r>
+      <w:r>
+        <w:t xml:space="preserve"> </w:t>
+      </w:r>
+      <w:r>
+        <w:t xml:space="preserve">(entre unidades: municípios mais ricos tendem a ter IDEB mais alto) e a</w:t>
+      </w:r>
+      <w:r>
+        <w:t xml:space="preserve"> </w:t>
+      </w:r>
+      <w:r>
+        <w:rPr>
+          <w:b/>
+          <w:bCs/>
+        </w:rPr>
+        <w:t xml:space="preserve">temporal</w:t>
+      </w:r>
+      <w:r>
+        <w:t xml:space="preserve"> </w:t>
+      </w:r>
+      <w:r>
+        <w:t xml:space="preserve">(dentro de uma mesma unidade: quando a renda de um município cresce, seu IDEB cresce?). A primeira é amplamente documentada; a segunda é mais incerta e raramente testada em pequenas escalas. Para o Semiárido brasileiro, onde a pobreza é estrutural e a política educacional estadual (regime de colaboração, alfabetização na idade certa) produziu ganhos notáveis de aprendizagem, essa distinção tem implicações práticas: se a associação for apenas transversal, políticas de crescimento econômico local não deveriam ser tratadas como condição necessária para o avanço educacional.</w:t>
       </w:r>
     </w:p>
     <w:p>
@@ -190,7 +222,33 @@
         <w:pStyle w:val="BodyText"/>
       </w:pPr>
       <w:r>
-        <w:t xml:space="preserve">Deliberadamente, este estudo não testa causalidade: trata-se de evidência associativa, com descrição explícita dos limites de inferência. O objetivo é avaliar se o padrão nacional — forte em níveis, nulo dentro das unidades — se mantém quando a unidade de análise é o município, dentro de uma única microrregião, e se a premissa de estagnação do IDEB na região se sustenta com os dados oficiais mais recentes (2025).</w:t>
+        <w:t xml:space="preserve">A microrregião do Sertão de Cratéus (IBGE 23018), no Ceará, oferece um contexto privilegiado para esse teste: nove municípios pequenos, de baixa renda, sob a mesma coordenação estadual de políticas educacionais, com série histórica completa do IDEB (2005–2025) e indicadores municipais oficiais de renda (PIB municipal e Censo Demográfico 2022).</w:t>
+      </w:r>
+    </w:p>
+    <w:p>
+      <w:pPr>
+        <w:pStyle w:val="BodyText"/>
+      </w:pPr>
+      <w:r>
+        <w:rPr>
+          <w:b/>
+          <w:bCs/>
+        </w:rPr>
+        <w:t xml:space="preserve">Pergunta de pesquisa (RQ):</w:t>
+      </w:r>
+      <w:r>
+        <w:t xml:space="preserve"> </w:t>
+      </w:r>
+      <w:r>
+        <w:t xml:space="preserve">no Sertão de Cratéus, a associação entre renda municipal e desempenho escolar no IDEB é transversal (entre municípios), temporal (dentro dos municípios), ou ambas? Em particular: (a) municípios com maior renda têm IDEB mais alto? (b) variações de renda dentro do município acompanham variações de IDEB? (c) o ganho educacional observado na região depende da renda municipal, e os municípios cumprem as metas pactuadas pelo INEP?</w:t>
+      </w:r>
+    </w:p>
+    <w:p>
+      <w:pPr>
+        <w:pStyle w:val="BodyText"/>
+      </w:pPr>
+      <w:r>
+        <w:t xml:space="preserve">Deliberadamente, este estudo não testa causalidade: trata-se de evidência associativa, com descrição explícita dos limites de inferência. As hipóteses operacionalizadas na Seção 3 respondem diretamente à RQ.</w:t>
       </w:r>
     </w:p>
     <w:bookmarkEnd w:id="11"/>
@@ -245,13 +303,13 @@
       </w:r>
     </w:p>
     <w:bookmarkEnd w:id="13"/>
-    <w:bookmarkStart w:id="14" w:name="renda-e-desempenho-o-padrão-associativo"/>
+    <w:bookmarkStart w:id="14" w:name="X530bb4f9efc39837d8d6f6c7c09e81039394131"/>
     <w:p>
       <w:pPr>
         <w:pStyle w:val="Heading3"/>
       </w:pPr>
       <w:r>
-        <w:t xml:space="preserve">2.3 Renda e desempenho: o padrão associativo</w:t>
+        <w:t xml:space="preserve">2.3 Renda e desempenho: associação transversal vs. temporal</w:t>
       </w:r>
     </w:p>
     <w:p>
@@ -259,24 +317,12 @@
         <w:pStyle w:val="FirstParagraph"/>
       </w:pPr>
       <w:r>
-        <w:t xml:space="preserve">Em análises transversais, municípios mais ricos tendem a apresentar IDEB mais alto (Duarte, 2013; Andrews; Vries, 2012). Contudo, dentro de uma mesma unidade ao longo do tempo, a variação da renda não costuma acompanhar a variação do desempenho — o crescimento do IDEB frequentemente ocorre mesmo onde a renda cresce pouco, como documentado para municípios pobres brasileiros (Andrews; Vries, 2012). Esse contraste entre associação em níveis e ausência de associação dentro das unidades é o</w:t>
-      </w:r>
-      <w:r>
-        <w:t xml:space="preserve"> </w:t>
-      </w:r>
-      <w:r>
-        <w:t xml:space="preserve">“padrão associativo”</w:t>
-      </w:r>
-      <w:r>
-        <w:t xml:space="preserve"> </w:t>
-      </w:r>
-      <w:r>
-        <w:t xml:space="preserve">que motivou o estudo nacional anterior e que aqui se testa em escala micro.</w:t>
+        <w:t xml:space="preserve">Em análises transversais, municípios mais ricos tendem a apresentar IDEB mais alto (Duarte, 2013; Andrews; Vries, 2012). Contudo, dentro de uma mesma unidade ao longo do tempo, a variação da renda não costuma acompanhar a variação do desempenho — o crescimento do IDEB frequentemente ocorre mesmo onde a renda cresce pouco, como documentado para municípios pobres brasileiros (Andrews; Vries, 2012). Esse contraste entre associação transversal (em níveis) e ausência de associação temporal (dentro das unidades) fundamenta a distinção operacional deste estudo: medir separadamente as duas dimensões na mesma microrregião, em vez de combiná-las em um único coeficiente.</w:t>
       </w:r>
     </w:p>
     <w:bookmarkEnd w:id="14"/>
     <w:bookmarkEnd w:id="15"/>
-    <w:bookmarkStart w:id="20" w:name="método"/>
+    <w:bookmarkStart w:id="21" w:name="método"/>
     <w:p>
       <w:pPr>
         <w:pStyle w:val="Heading2"/>
@@ -597,7 +643,23 @@
         <w:t xml:space="preserve"> </w:t>
       </w:r>
       <w:r>
-        <w:t xml:space="preserve">regressão com efeitos fixos de município e ano via within-transformation dupla (município e ano), com erros padrão convencionais.</w:t>
+        <w:t xml:space="preserve">regressão com efeitos fixos de município e ano via within-transformation dupla (município e ano). Reportam-se erros padrão homocedásticos (transparência) e</w:t>
+      </w:r>
+      <w:r>
+        <w:t xml:space="preserve"> </w:t>
+      </w:r>
+      <w:r>
+        <w:rPr>
+          <w:b/>
+          <w:bCs/>
+        </w:rPr>
+        <w:t xml:space="preserve">erros padrão clusterizados por município</w:t>
+      </w:r>
+      <w:r>
+        <w:t xml:space="preserve"> </w:t>
+      </w:r>
+      <w:r>
+        <w:t xml:space="preserve">(CRVE com correção de pequena amostra, t com G−1 graus de liberdade).</w:t>
       </w:r>
     </w:p>
     <w:p>
@@ -641,7 +703,7 @@
         <w:t xml:space="preserve"> </w:t>
       </w:r>
       <w:r>
-        <w:t xml:space="preserve">mínimo efeito detectável (poder 80%, α 5%) e teste de equivalência com margem ±0,10 no coeficiente de efeitos fixos.</w:t>
+        <w:t xml:space="preserve">mínimo efeito detectável (poder 80%, α 5%) e teste de equivalência com margem ±0,10 no coeficiente de efeitos fixos, ambos baseados no erro padrão clusterizado (G−1 graus de liberdade).</w:t>
       </w:r>
     </w:p>
     <w:p>
@@ -733,23 +795,13 @@
       </w:r>
     </w:p>
     <w:bookmarkEnd w:id="19"/>
-    <w:bookmarkEnd w:id="20"/>
-    <w:bookmarkStart w:id="27" w:name="resultados"/>
-    <w:p>
-      <w:pPr>
-        <w:pStyle w:val="Heading2"/>
-      </w:pPr>
-      <w:r>
-        <w:t xml:space="preserve">4. Resultados</w:t>
-      </w:r>
-    </w:p>
-    <w:bookmarkStart w:id="21" w:name="h1-associação-em-níveis"/>
+    <w:bookmarkStart w:id="20" w:name="Xf130f7615d50ebd486343bd202b9ac90a014781"/>
     <w:p>
       <w:pPr>
         <w:pStyle w:val="Heading3"/>
       </w:pPr>
       <w:r>
-        <w:t xml:space="preserve">4.1 H1 — associação em níveis</w:t>
+        <w:t xml:space="preserve">3.5 Critérios de invalidação empírica (falsificabilidade)</w:t>
       </w:r>
     </w:p>
     <w:p>
@@ -757,506 +809,7 @@
         <w:pStyle w:val="FirstParagraph"/>
       </w:pPr>
       <w:r>
-        <w:t xml:space="preserve">Na microrregião, a correlação transversal entre IDEB e log do PIB per capita defasado foi r = 0,49 (IC95% bootstrap por cluster [0,34; 0,64]; p &lt; 0,001; n = 108; 9 clusters), confirmando H1. Para o Ceará, r = 0,26 (IC95% [0,20; 0,33]); para o Brasil, r = 0,46 (IC95% [0,44; 0,47]; n = 48.695). A associação em níveis está presente na microrregião, embora com magnitude moderada — não tão elevada quanto a documentada em nível de países, mas consistente com a literatura municipal brasileira.</w:t>
-      </w:r>
-    </w:p>
-    <w:bookmarkEnd w:id="21"/>
-    <w:bookmarkStart w:id="22" w:name="h2-associação-dentro-das-unidades"/>
-    <w:p>
-      <w:pPr>
-        <w:pStyle w:val="Heading3"/>
-      </w:pPr>
-      <w:r>
-        <w:t xml:space="preserve">4.2 H2 — associação dentro das unidades</w:t>
-      </w:r>
-    </w:p>
-    <w:p>
-      <w:pPr>
-        <w:pStyle w:val="FirstParagraph"/>
-      </w:pPr>
-      <w:r>
-        <w:t xml:space="preserve">As primeiras diferenças dentro de município-etapa na microrregião foram nulas: r = −0,05 (p = 0,61; n = 90). O coeficiente de efeitos fixos de município e ano foi β = 2,61 (IC95% [−1,59; 6,80]; p = 0,23; n = 108): positivo, mas não estatisticamente discernível de zero. Para o Ceará, β = 0,001 (IC95% [−0,28; 0,29]; p = 0,99). Para o Brasil, β = 0,11 (IC95% [0,08; 0,15]; p &lt; 0,001): pequeno, embora discernível dado o enorme n. H2 se confirma na microrregião e no Ceará: dentro das unidades, a associação entre variação de renda e variação de IDEB não é discernível.</w:t>
-      </w:r>
-    </w:p>
-    <w:bookmarkEnd w:id="22"/>
-    <w:bookmarkStart w:id="23" w:name="Xbe2b44eac008592f99ff6f32afd2a0343eab255"/>
-    <w:p>
-      <w:pPr>
-        <w:pStyle w:val="Heading3"/>
-      </w:pPr>
-      <w:r>
-        <w:t xml:space="preserve">4.3 Validação cruzada leave-one-out por município</w:t>
-      </w:r>
-    </w:p>
-    <w:p>
-      <w:pPr>
-        <w:pStyle w:val="FirstParagraph"/>
-      </w:pPr>
-      <w:r>
-        <w:t xml:space="preserve">A correlação de níveis estimada fora da amostra (treino nos oito municípios restantes, teste no município retido) foi positiva em 9/9 municípios (100%), com mediana r = 0,62 (média 0,65; DP 0,11). Os r de teste por município variaram de 0,43 (Quiterianópolis) a 0,81 (Ararendá). A associação em níveis não depende de um único município: é replicável em todos os nove.</w:t>
-      </w:r>
-    </w:p>
-    <w:bookmarkEnd w:id="23"/>
-    <w:bookmarkStart w:id="24" w:name="mdes-e-tost"/>
-    <w:p>
-      <w:pPr>
-        <w:pStyle w:val="Heading3"/>
-      </w:pPr>
-      <w:r>
-        <w:t xml:space="preserve">4.4 MDES e TOST</w:t>
-      </w:r>
-    </w:p>
-    <w:p>
-      <w:pPr>
-        <w:pStyle w:val="FirstParagraph"/>
-      </w:pPr>
-      <w:r>
-        <w:t xml:space="preserve">Com n municipal de 9 e 108 observações, o mínimo efeito detectável foi de 6,05 pontos de IDEB por unidade de log do PIB — muito acima de qualquer coeficiente plausível. O teste de equivalência (TOST, margem ±0,10) não foi significativo (p = 0,88). Portanto, o correto é declarar</w:t>
-      </w:r>
-      <w:r>
-        <w:t xml:space="preserve"> </w:t>
-      </w:r>
-      <w:r>
-        <w:rPr>
-          <w:b/>
-          <w:bCs/>
-        </w:rPr>
-        <w:t xml:space="preserve">não-detecção</w:t>
-      </w:r>
-      <w:r>
-        <w:t xml:space="preserve">: a amostra não permite afirmar efeito, mas tampouco permite declarar equivalência. Essa é uma limitação central, explicitamente assumida.</w:t>
-      </w:r>
-    </w:p>
-    <w:bookmarkEnd w:id="24"/>
-    <w:bookmarkStart w:id="25" w:name="h3-ganho-educacional-e-metas"/>
-    <w:p>
-      <w:pPr>
-        <w:pStyle w:val="Heading3"/>
-      </w:pPr>
-      <w:r>
-        <w:t xml:space="preserve">4.5 H3 — ganho educacional e metas</w:t>
-      </w:r>
-    </w:p>
-    <w:p>
-      <w:pPr>
-        <w:pStyle w:val="FirstParagraph"/>
-      </w:pPr>
-      <w:r>
-        <w:t xml:space="preserve">Contrariando a premissa de estagnação, os dados INEP 2025 mostram crescimento expressivo do IDEB nos nove municípios (anos iniciais, 2007→2025): ganho médio de 5,93 pontos, com todos os municípios</w:t>
-      </w:r>
-      <w:r>
-        <w:t xml:space="preserve"> </w:t>
-      </w:r>
-      <w:r>
-        <w:rPr>
-          <w:b/>
-          <w:bCs/>
-        </w:rPr>
-        <w:t xml:space="preserve">acima da meta pactuada para 2021</w:t>
-      </w:r>
-      <w:r>
-        <w:t xml:space="preserve">. O IDEB 2025 em anos iniciais variou de 6,8 (Quiterianópolis) a 9,9 (Ipaporanga), valores superiores à média nacional da rede municipal. Em anos finais, todos os nove municípios também atingiram a meta 2021. A correlação entre ganho de IDEB (anos iniciais) e renda média do responsável foi nula: r = −0,14 (p = 0,73; n = 9). Ou seja: não há evidência de que municípios com maior renda tenham tido maior ganho educacional — o crescimento ocorreu de forma generalizada e não acompanhou a variação de renda.</w:t>
-      </w:r>
-    </w:p>
-    <w:bookmarkEnd w:id="25"/>
-    <w:bookmarkStart w:id="26" w:name="mapas"/>
-    <w:p>
-      <w:pPr>
-        <w:pStyle w:val="Heading3"/>
-      </w:pPr>
-      <w:r>
-        <w:t xml:space="preserve">4.6 Mapas</w:t>
-      </w:r>
-    </w:p>
-    <w:p>
-      <w:pPr>
-        <w:pStyle w:val="FirstParagraph"/>
-      </w:pPr>
-      <w:r>
-        <w:t xml:space="preserve">Os mapas coropléticos (Figuras 1 e 2, em</w:t>
-      </w:r>
-      <w:r>
-        <w:t xml:space="preserve"> </w:t>
-      </w:r>
-      <w:r>
-        <w:rPr>
-          <w:rStyle w:val="VerbatimChar"/>
-        </w:rPr>
-        <w:t xml:space="preserve">outputs/mapas/</w:t>
-      </w:r>
-      <w:r>
-        <w:t xml:space="preserve">) apresentam os dois proxies oficiais de desenvolvimento por município: renda média mensal do responsável (Censo 2022, IBGE) e PIB per capita (2021, IBGE). Crateús, sede regional, destaca-se em ambos os indicadores; os demais municípios concentram-se nas faixas inferiores, retratando a heterogeneidade intra-regional que a análise de níveis explora.</w:t>
-      </w:r>
-    </w:p>
-    <w:bookmarkEnd w:id="26"/>
-    <w:bookmarkEnd w:id="27"/>
-    <w:bookmarkStart w:id="28" w:name="discussão"/>
-    <w:p>
-      <w:pPr>
-        <w:pStyle w:val="Heading2"/>
-      </w:pPr>
-      <w:r>
-        <w:t xml:space="preserve">5. Discussão</w:t>
-      </w:r>
-    </w:p>
-    <w:p>
-      <w:pPr>
-        <w:pStyle w:val="FirstParagraph"/>
-      </w:pPr>
-      <w:r>
-        <w:t xml:space="preserve">Os resultados indicam que o padrão associativo nacional — forte em níveis, nulo dentro das unidades — se reproduz na microrregião do Sertão de Cratéus: municípios com maior PIB per capita tendem a ter IDEB mais alto (r = 0,49), mas a variação temporal da renda não acompanha a variação do desempenho escolar (primeiras diferenças nulas; efeitos fixos não significativos). A validação cruzada por município sugere que a associação de níveis é robusta e generalizada.</w:t>
-      </w:r>
-    </w:p>
-    <w:p>
-      <w:pPr>
-        <w:pStyle w:val="BodyText"/>
-      </w:pPr>
-      <w:r>
-        <w:t xml:space="preserve">Dois pontos merecem destaque. Primeiro, a associação em níveis não deve ser lida como</w:t>
-      </w:r>
-      <w:r>
-        <w:t xml:space="preserve"> </w:t>
-      </w:r>
-      <w:r>
-        <w:t xml:space="preserve">“a pobreza determina o baixo desempenho”</w:t>
-      </w:r>
-      <w:r>
-        <w:t xml:space="preserve">: municípios pobres da microrregião alcançaram IDEB 2025 elevado (até 9,9 pontos), consistentemente acima da meta. Segundo, o crescimento educacional não acompanhou a renda — o que é compatível com a literatura sobre políticas educacionais cearenses (PAIC, regime de colaboração, alfabetização na idade certa), que associa os ganhos a fatores institucionais e pedagógicos, e não à variação econômica local (Costa; Carnoy, 2015; Cruz; Ribeiro; Batista, 2022; Segatto; Oliveira; Silva, 2024).</w:t>
-      </w:r>
-    </w:p>
-    <w:p>
-      <w:pPr>
-        <w:pStyle w:val="BodyText"/>
-      </w:pPr>
-      <w:r>
-        <w:t xml:space="preserve">As limitações são explícitas: (i) n municipal de 9 e 108 observações implica poder estatístico baixo (MDES de 6,05), tornando a ausência de associação dentro das unidades uma</w:t>
-      </w:r>
-      <w:r>
-        <w:t xml:space="preserve"> </w:t>
-      </w:r>
-      <w:r>
-        <w:rPr>
-          <w:b/>
-          <w:bCs/>
-        </w:rPr>
-        <w:t xml:space="preserve">não-detecção</w:t>
-      </w:r>
-      <w:r>
-        <w:t xml:space="preserve"> </w:t>
-      </w:r>
-      <w:r>
-        <w:t xml:space="preserve">e não uma prova de ausência; (ii) o PIB municipal e a renda do responsável são proxies do desenvolvimento local — o IPCE original não é auditável; (iii) não há pretensão causal; (iv) os efeitos fixos controlam fatores invariantes no tempo e choques comuns por ano, mas não outros confundidores variáveis; (v) as correlações de níveis podem refletir fatores omitidos (infraestrutura, gestão) correlacionados com renda e desempenho.</w:t>
-      </w:r>
-    </w:p>
-    <w:bookmarkEnd w:id="28"/>
-    <w:bookmarkStart w:id="29" w:name="considerações-finais"/>
-    <w:p>
-      <w:pPr>
-        <w:pStyle w:val="Heading2"/>
-      </w:pPr>
-      <w:r>
-        <w:t xml:space="preserve">6. Considerações finais</w:t>
-      </w:r>
-    </w:p>
-    <w:p>
-      <w:pPr>
-        <w:pStyle w:val="FirstParagraph"/>
-      </w:pPr>
-      <w:r>
-        <w:t xml:space="preserve">Este estudo contribui com evidência associativa subnacional sobre a relação entre renda e desempenho escolar: o padrão nacional (níveis fortes, dentro nula) se reproduz em uma microrregião do Semiárido cearense. Adicionalmente, os dados oficiais mais recentes refutam a premissa de estagnação: todos os nove municípios do Sertão de Cratéus superaram as metas pactuadas, com ganhos médios de cerca de seis pontos no período 2007–2025 e IDEB 2025 elevado mesmo em municípios de baixa renda. A ausência de associação entre ganho educacional e renda sugere que fatores de política educacional — e não a variação econômica — estão associados à trajetória observada, em linha com a literatura do Ceará. Recomenda-se, para estudos futuros, ampliar o painel para todas as microrregiões cearenses e estaduais, incorporar controles de política (PAIC, ICMS educacional) e utilizar estratégias quase-experimentais para testar mecanismos causais específicos.</w:t>
-      </w:r>
-    </w:p>
-    <w:bookmarkEnd w:id="29"/>
-    <w:bookmarkStart w:id="30" w:name="referências"/>
-    <w:p>
-      <w:pPr>
-        <w:pStyle w:val="Heading2"/>
-      </w:pPr>
-      <w:r>
-        <w:t xml:space="preserve">Referências</w:t>
-      </w:r>
-    </w:p>
-    <w:p>
-      <w:pPr>
-        <w:pStyle w:val="FirstParagraph"/>
-      </w:pPr>
-      <w:r>
-        <w:t xml:space="preserve">AFONSO, A. J. Para uma concetualização alternativa de accountability em educação.</w:t>
-      </w:r>
-      <w:r>
-        <w:t xml:space="preserve"> </w:t>
-      </w:r>
-      <w:r>
-        <w:rPr>
-          <w:i/>
-          <w:iCs/>
-        </w:rPr>
-        <w:t xml:space="preserve">Educação &amp; Sociedade</w:t>
-      </w:r>
-      <w:r>
-        <w:t xml:space="preserve">, Campinas, v. 33, n. 119, p. 471–484, 2012. https://doi.org/10.1590/S0101-73302012000200008</w:t>
-      </w:r>
-    </w:p>
-    <w:p>
-      <w:pPr>
-        <w:pStyle w:val="BodyText"/>
-      </w:pPr>
-      <w:r>
-        <w:t xml:space="preserve">ANDREWS, C. W.; VRIES, M. S. de. Pobreza e municipalização da educação: análise dos resultados do IDEB (2005-2009).</w:t>
-      </w:r>
-      <w:r>
-        <w:t xml:space="preserve"> </w:t>
-      </w:r>
-      <w:r>
-        <w:rPr>
-          <w:i/>
-          <w:iCs/>
-        </w:rPr>
-        <w:t xml:space="preserve">Cadernos de Pesquisa</w:t>
-      </w:r>
-      <w:r>
-        <w:t xml:space="preserve">, São Paulo, v. 42, n. 147, p. 826–847, 2012. https://doi.org/10.1590/S0100-15742012000300010</w:t>
-      </w:r>
-    </w:p>
-    <w:p>
-      <w:pPr>
-        <w:pStyle w:val="BodyText"/>
-      </w:pPr>
-      <w:r>
-        <w:t xml:space="preserve">BRUNELLO, G.; KISS, D. Math scores in high stakes grades.</w:t>
-      </w:r>
-      <w:r>
-        <w:t xml:space="preserve"> </w:t>
-      </w:r>
-      <w:r>
-        <w:rPr>
-          <w:i/>
-          <w:iCs/>
-        </w:rPr>
-        <w:t xml:space="preserve">Economics of Education Review</w:t>
-      </w:r>
-      <w:r>
-        <w:t xml:space="preserve">, v. 87, 102219, 2022. https://doi.org/10.1016/j.econedurev.2021.102219</w:t>
-      </w:r>
-    </w:p>
-    <w:p>
-      <w:pPr>
-        <w:pStyle w:val="BodyText"/>
-      </w:pPr>
-      <w:r>
-        <w:t xml:space="preserve">CARNOY, M.; MAROTTA, L.; LOUZANO, P.; et al. Intranational comparative education: what state differences in student achievement can teach us about improving education — the case of Brazil.</w:t>
-      </w:r>
-      <w:r>
-        <w:t xml:space="preserve"> </w:t>
-      </w:r>
-      <w:r>
-        <w:rPr>
-          <w:i/>
-          <w:iCs/>
-        </w:rPr>
-        <w:t xml:space="preserve">Comparative Education Review</w:t>
-      </w:r>
-      <w:r>
-        <w:t xml:space="preserve">, v. 61, n. 4, 2017. https://doi.org/10.1086/693981</w:t>
-      </w:r>
-    </w:p>
-    <w:p>
-      <w:pPr>
-        <w:pStyle w:val="BodyText"/>
-      </w:pPr>
-      <w:r>
-        <w:t xml:space="preserve">CITO, L.; MARÔCO, J. Beyond the average: mapping educational inequality in Brazil with PISA 2022.</w:t>
-      </w:r>
-      <w:r>
-        <w:t xml:space="preserve"> </w:t>
-      </w:r>
-      <w:r>
-        <w:rPr>
-          <w:i/>
-          <w:iCs/>
-        </w:rPr>
-        <w:t xml:space="preserve">Large-scale Assessments in Education</w:t>
-      </w:r>
-      <w:r>
-        <w:t xml:space="preserve">, v. 14, 2026. https://doi.org/10.1186/s40536-026-00302-0</w:t>
-      </w:r>
-    </w:p>
-    <w:p>
-      <w:pPr>
-        <w:pStyle w:val="BodyText"/>
-      </w:pPr>
-      <w:r>
-        <w:t xml:space="preserve">COSTA, L. O.; CARNOY, M. The effectiveness of an early-grade literacy intervention on the cognitive achievement of Brazilian students.</w:t>
-      </w:r>
-      <w:r>
-        <w:t xml:space="preserve"> </w:t>
-      </w:r>
-      <w:r>
-        <w:rPr>
-          <w:i/>
-          <w:iCs/>
-        </w:rPr>
-        <w:t xml:space="preserve">Educational Evaluation and Policy Analysis</w:t>
-      </w:r>
-      <w:r>
-        <w:t xml:space="preserve">, v. 37, n. 4, p. 567–590, 2015. https://doi.org/10.3102/0162373715571437</w:t>
-      </w:r>
-    </w:p>
-    <w:p>
-      <w:pPr>
-        <w:pStyle w:val="BodyText"/>
-      </w:pPr>
-      <w:r>
-        <w:t xml:space="preserve">CRUZ, M. C. M. T.; RIBEIRO, V. M.; BATISTA, J. M. Contexto de implementação do Programa de Aprendizagem na Idade Certa (PAIC).</w:t>
-      </w:r>
-      <w:r>
-        <w:t xml:space="preserve"> </w:t>
-      </w:r>
-      <w:r>
-        <w:rPr>
-          <w:i/>
-          <w:iCs/>
-        </w:rPr>
-        <w:t xml:space="preserve">Revista Ibero-Americana de Estudos em Educação</w:t>
-      </w:r>
-      <w:r>
-        <w:t xml:space="preserve">, Araraquara, v. 17, n. esp. 3, p. 2405–2432, 2022. https://doi.org/10.21723/riaee.v17iesp.3.16719</w:t>
-      </w:r>
-    </w:p>
-    <w:p>
-      <w:pPr>
-        <w:pStyle w:val="BodyText"/>
-      </w:pPr>
-      <w:r>
-        <w:t xml:space="preserve">DUARTE, N. de S. O impacto da pobreza no Ideb: um estudo multinível.</w:t>
-      </w:r>
-      <w:r>
-        <w:t xml:space="preserve"> </w:t>
-      </w:r>
-      <w:r>
-        <w:rPr>
-          <w:i/>
-          <w:iCs/>
-        </w:rPr>
-        <w:t xml:space="preserve">Revista Brasileira de Estudos Pedagógicos</w:t>
-      </w:r>
-      <w:r>
-        <w:t xml:space="preserve">, Brasília, DF, v. 94, n. 237, p. 343–363, 2013. https://doi.org/10.1590/S2176-66812013000200002</w:t>
-      </w:r>
-    </w:p>
-    <w:p>
-      <w:pPr>
-        <w:pStyle w:val="BodyText"/>
-      </w:pPr>
-      <w:r>
-        <w:t xml:space="preserve">HANUSHEK, E. A.; WOESSMANN, L.</w:t>
-      </w:r>
-      <w:r>
-        <w:t xml:space="preserve"> </w:t>
-      </w:r>
-      <w:r>
-        <w:rPr>
-          <w:i/>
-          <w:iCs/>
-        </w:rPr>
-        <w:t xml:space="preserve">The Knowledge Capital of Nations: education and the economics of growth</w:t>
-      </w:r>
-      <w:r>
-        <w:t xml:space="preserve">. Cambridge, MA: MIT Press, 2015. https://doi.org/10.7551/mitpress/9780262029179.001.0001</w:t>
-      </w:r>
-    </w:p>
-    <w:p>
-      <w:pPr>
-        <w:pStyle w:val="BodyText"/>
-      </w:pPr>
-      <w:r>
-        <w:t xml:space="preserve">LACRUZ, A. J.; AMÉRICO, B. L.; CARNIEL, F. Indicadores de qualidade na educação: análise discriminante dos desempenhos na Prova Brasil.</w:t>
-      </w:r>
-      <w:r>
-        <w:t xml:space="preserve"> </w:t>
-      </w:r>
-      <w:r>
-        <w:rPr>
-          <w:i/>
-          <w:iCs/>
-        </w:rPr>
-        <w:t xml:space="preserve">Revista Brasileira de Estudos Pedagógicos</w:t>
-      </w:r>
-      <w:r>
-        <w:t xml:space="preserve">, Brasília, DF, v. 100, n. 254, 2019. https://doi.org/10.1590/S1413-24782019240002</w:t>
-      </w:r>
-    </w:p>
-    <w:p>
-      <w:pPr>
-        <w:pStyle w:val="BodyText"/>
-      </w:pPr>
-      <w:r>
-        <w:t xml:space="preserve">SCHNEIDER, M. P.; NARDI, E. L. O IDEB e a construção de um modelo de accountability na educação básica brasileira.</w:t>
-      </w:r>
-      <w:r>
-        <w:t xml:space="preserve"> </w:t>
-      </w:r>
-      <w:r>
-        <w:rPr>
-          <w:i/>
-          <w:iCs/>
-        </w:rPr>
-        <w:t xml:space="preserve">Revista Portuguesa de Educação</w:t>
-      </w:r>
-      <w:r>
-        <w:t xml:space="preserve">, Braga, v. 27, n. 1, p. 7–28, 2014. https://doi.org/10.21814/rpe.4295</w:t>
-      </w:r>
-    </w:p>
-    <w:p>
-      <w:pPr>
-        <w:pStyle w:val="BodyText"/>
-      </w:pPr>
-      <w:r>
-        <w:t xml:space="preserve">SEGATTO, C. I.; OLIVEIRA, K. de; SILVA, A. L. N. da. Os limites do PNE (2014-2024) no regime de colaboração.</w:t>
-      </w:r>
-      <w:r>
-        <w:t xml:space="preserve"> </w:t>
-      </w:r>
-      <w:r>
-        <w:rPr>
-          <w:i/>
-          <w:iCs/>
-        </w:rPr>
-        <w:t xml:space="preserve">Estudos em Avaliação Educacional</w:t>
-      </w:r>
-      <w:r>
-        <w:t xml:space="preserve">, São Paulo, v. 35, e10549, 2024. https://doi.org/10.18222/eae.v35.10549</w:t>
-      </w:r>
-    </w:p>
-    <w:p>
-      <w:pPr>
-        <w:pStyle w:val="BodyText"/>
-      </w:pPr>
-      <w:r>
-        <w:t xml:space="preserve">SOARES, J. F.; XAVIER, F. P. Pressupostos educacionais e estatísticos do Ideb.</w:t>
-      </w:r>
-      <w:r>
-        <w:t xml:space="preserve"> </w:t>
-      </w:r>
-      <w:r>
-        <w:rPr>
-          <w:i/>
-          <w:iCs/>
-        </w:rPr>
-        <w:t xml:space="preserve">Educação &amp; Sociedade</w:t>
-      </w:r>
-      <w:r>
-        <w:t xml:space="preserve">, Campinas, v. 34, n. 124, p. 903–923, 2013. https://doi.org/10.1590/S0101-73302013000300013</w:t>
-      </w:r>
-    </w:p>
-    <w:bookmarkEnd w:id="30"/>
-    <w:bookmarkStart w:id="31" w:name="Xb81c9ee436544be0586c5f0ff6fd02321a9d8f1"/>
-    <w:p>
-      <w:pPr>
-        <w:pStyle w:val="Heading2"/>
-      </w:pPr>
-      <w:r>
-        <w:t xml:space="preserve">Apêndice A — Proveniência e reprodutibilidade</w:t>
+        <w:t xml:space="preserve">Para que as hipóteses sejam testáveis, cada uma tem critérios de rejeição pré-definidos, passíveis de refutação pelos dados:</w:t>
       </w:r>
     </w:p>
     <w:p>
@@ -1268,43 +821,17 @@
         </w:numPr>
       </w:pPr>
       <w:r>
-        <w:t xml:space="preserve">Scripts:</w:t>
-      </w:r>
-      <w:r>
-        <w:t xml:space="preserve"> </w:t>
-      </w:r>
-      <w:r>
-        <w:rPr>
-          <w:rStyle w:val="VerbatimChar"/>
-        </w:rPr>
-        <w:t xml:space="preserve">scripts/baixar_dados.py</w:t>
-      </w:r>
-      <w:r>
-        <w:t xml:space="preserve">,</w:t>
-      </w:r>
-      <w:r>
-        <w:t xml:space="preserve"> </w:t>
-      </w:r>
-      <w:r>
-        <w:rPr>
-          <w:rStyle w:val="VerbatimChar"/>
-        </w:rPr>
-        <w:t xml:space="preserve">scripts/analise_crateus.py</w:t>
-      </w:r>
-      <w:r>
-        <w:t xml:space="preserve">,</w:t>
-      </w:r>
-      <w:r>
-        <w:t xml:space="preserve"> </w:t>
-      </w:r>
-      <w:r>
-        <w:rPr>
-          <w:rStyle w:val="VerbatimChar"/>
-        </w:rPr>
-        <w:t xml:space="preserve">scripts/mapa_crateus.py</w:t>
-      </w:r>
-      <w:r>
-        <w:t xml:space="preserve">.</w:t>
+        <w:rPr>
+          <w:b/>
+          <w:bCs/>
+        </w:rPr>
+        <w:t xml:space="preserve">H1 seria rejeitada</w:t>
+      </w:r>
+      <w:r>
+        <w:t xml:space="preserve"> </w:t>
+      </w:r>
+      <w:r>
+        <w:t xml:space="preserve">se o IC95% do bootstrap por cluster incluísse zero ou se a correlação transversal fosse negativa.</w:t>
       </w:r>
     </w:p>
     <w:p>
@@ -1316,19 +843,17 @@
         </w:numPr>
       </w:pPr>
       <w:r>
-        <w:t xml:space="preserve">Manifesto de fontes (URL, timestamp, SHA-256):</w:t>
-      </w:r>
-      <w:r>
-        <w:t xml:space="preserve"> </w:t>
-      </w:r>
-      <w:r>
-        <w:rPr>
-          <w:rStyle w:val="VerbatimChar"/>
-        </w:rPr>
-        <w:t xml:space="preserve">data/raw/SOURCE_MANIFEST.json</w:t>
-      </w:r>
-      <w:r>
-        <w:t xml:space="preserve">.</w:t>
+        <w:rPr>
+          <w:b/>
+          <w:bCs/>
+        </w:rPr>
+        <w:t xml:space="preserve">H2 seria rejeitada</w:t>
+      </w:r>
+      <w:r>
+        <w:t xml:space="preserve"> </w:t>
+      </w:r>
+      <w:r>
+        <w:t xml:space="preserve">se o coeficiente de efeitos fixos (clusterizado) fosse estatisticamente discernível de zero ao nível de 5% ou se as primeiras diferenças mostrassem correlação |r| ≥ 0,30 com p &lt; 0,05.</w:t>
       </w:r>
     </w:p>
     <w:p>
@@ -1340,31 +865,2658 @@
         </w:numPr>
       </w:pPr>
       <w:r>
-        <w:t xml:space="preserve">Resultados completos:</w:t>
-      </w:r>
-      <w:r>
-        <w:t xml:space="preserve"> </w:t>
-      </w:r>
-      <w:r>
-        <w:rPr>
-          <w:rStyle w:val="VerbatimChar"/>
-        </w:rPr>
-        <w:t xml:space="preserve">outputs/expanded/resultados_r426.json</w:t>
-      </w:r>
-      <w:r>
-        <w:t xml:space="preserve">; proveniência computacional:</w:t>
-      </w:r>
-      <w:r>
-        <w:t xml:space="preserve"> </w:t>
-      </w:r>
-      <w:r>
-        <w:rPr>
-          <w:rStyle w:val="VerbatimChar"/>
-        </w:rPr>
-        <w:t xml:space="preserve">outputs/expanded/provenance_r426.json</w:t>
-      </w:r>
-      <w:r>
-        <w:t xml:space="preserve">.</w:t>
+        <w:rPr>
+          <w:b/>
+          <w:bCs/>
+        </w:rPr>
+        <w:t xml:space="preserve">H3 seria rejeitada</w:t>
+      </w:r>
+      <w:r>
+        <w:t xml:space="preserve"> </w:t>
+      </w:r>
+      <w:r>
+        <w:t xml:space="preserve">se a maioria dos municípios (≥ 5 de 9) ficasse abaixo da meta pactuada para 2021 ou se o ganho educacional correlacionasse positiva e significativamente com a renda municipal (r &gt; 0,30; p &lt; 0,05).</w:t>
+      </w:r>
+    </w:p>
+    <w:p>
+      <w:pPr>
+        <w:pStyle w:val="FirstParagraph"/>
+      </w:pPr>
+      <w:r>
+        <w:t xml:space="preserve">A não-detecção (MDES alto, TOST não significativo) é tratada como resultado informativo de poder estatístico, não como confirmação de ausência de efeito.</w:t>
+      </w:r>
+    </w:p>
+    <w:bookmarkEnd w:id="20"/>
+    <w:bookmarkEnd w:id="21"/>
+    <w:bookmarkStart w:id="46" w:name="resultados"/>
+    <w:p>
+      <w:pPr>
+        <w:pStyle w:val="Heading2"/>
+      </w:pPr>
+      <w:r>
+        <w:t xml:space="preserve">4. Resultados</w:t>
+      </w:r>
+    </w:p>
+    <w:bookmarkStart w:id="25" w:name="h1-associação-em-níveis"/>
+    <w:p>
+      <w:pPr>
+        <w:pStyle w:val="Heading3"/>
+      </w:pPr>
+      <w:r>
+        <w:t xml:space="preserve">4.1 H1 — associação em níveis</w:t>
+      </w:r>
+    </w:p>
+    <w:p>
+      <w:pPr>
+        <w:pStyle w:val="FirstParagraph"/>
+      </w:pPr>
+      <w:r>
+        <w:t xml:space="preserve">Na microrregião, a correlação transversal entre IDEB e log do PIB per capita defasado foi r = 0,49 (IC95% bootstrap por cluster [0,34; 0,64]; p &lt; 0,001; n = 108; 9 clusters), confirmando H1. Para o Ceará, r = 0,26 (IC95% [0,20; 0,33]); para o Brasil, r = 0,46 (IC95% [0,44; 0,47]; n = 48.695). A associação em níveis está presente na microrregião, embora com magnitude moderada — não tão elevada quanto a documentada em nível de países, mas consistente com a literatura municipal brasileira.</w:t>
+      </w:r>
+    </w:p>
+    <w:p>
+      <w:pPr>
+        <w:pStyle w:val="CaptionedFigure"/>
+      </w:pPr>
+      <w:r>
+        <w:drawing>
+          <wp:inline>
+            <wp:extent cx="5753100" cy="3835400"/>
+            <wp:effectExtent b="0" l="0" r="0" t="0"/>
+            <wp:docPr descr="Figura 1 — Associação em níveis entre IDEB e log do PIB per capita (Sertão de Cratéus, 2013–2023)." title="" id="23" name="Picture"/>
+            <a:graphic>
+              <a:graphicData uri="http://schemas.openxmlformats.org/drawingml/2006/picture">
+                <pic:pic>
+                  <pic:nvPicPr>
+                    <pic:cNvPr descr="outputs/figuras/fig_scatter_niveis_micro.png" id="24" name="Picture"/>
+                    <pic:cNvPicPr>
+                      <a:picLocks noChangeArrowheads="1" noChangeAspect="1"/>
+                    </pic:cNvPicPr>
+                  </pic:nvPicPr>
+                  <pic:blipFill>
+                    <a:blip r:embed="rId22"/>
+                    <a:stretch>
+                      <a:fillRect/>
+                    </a:stretch>
+                  </pic:blipFill>
+                  <pic:spPr bwMode="auto">
+                    <a:xfrm>
+                      <a:off x="0" y="0"/>
+                      <a:ext cx="5753100" cy="3835400"/>
+                    </a:xfrm>
+                    <a:prstGeom prst="rect">
+                      <a:avLst/>
+                    </a:prstGeom>
+                    <a:noFill/>
+                    <a:ln w="9525">
+                      <a:noFill/>
+                      <a:headEnd/>
+                      <a:tailEnd/>
+                    </a:ln>
+                  </pic:spPr>
+                </pic:pic>
+              </a:graphicData>
+            </a:graphic>
+          </wp:inline>
+        </w:drawing>
+      </w:r>
+    </w:p>
+    <w:p>
+      <w:pPr>
+        <w:pStyle w:val="ImageCaption"/>
+      </w:pPr>
+      <w:r>
+        <w:t xml:space="preserve">Figura 1 — Associação em níveis entre IDEB e log do PIB per capita (Sertão de Cratéus, 2013–2023).</w:t>
+      </w:r>
+    </w:p>
+    <w:p>
+      <w:pPr>
+        <w:pStyle w:val="BodyText"/>
+      </w:pPr>
+      <w:r>
+        <w:rPr>
+          <w:b/>
+          <w:bCs/>
+        </w:rPr>
+        <w:t xml:space="preserve">Tabela 1 — Correlações em níveis por escala (IDEB × log PIB per capita defasado)</w:t>
+      </w:r>
+    </w:p>
+    <w:tbl>
+      <w:tblPr>
+        <w:tblStyle w:val="Table"/>
+        <w:tblW w:type="pct" w:w="5000"/>
+        <w:tblLayout w:type="fixed"/>
+        <w:tblLook w:firstRow="1" w:lastRow="0" w:firstColumn="0" w:lastColumn="0" w:noHBand="0" w:noVBand="0" w:val="0020"/>
+      </w:tblPr>
+      <w:tblGrid>
+        <w:gridCol w:w="1320"/>
+        <w:gridCol w:w="1320"/>
+        <w:gridCol w:w="1320"/>
+        <w:gridCol w:w="1320"/>
+        <w:gridCol w:w="1320"/>
+        <w:gridCol w:w="1320"/>
+      </w:tblGrid>
+      <w:tr>
+        <w:trPr>
+          <w:tblHeader w:val="on"/>
+        </w:trPr>
+        <w:tc>
+          <w:tcPr/>
+          <w:p>
+            <w:pPr>
+              <w:pStyle w:val="Compact"/>
+            </w:pPr>
+            <w:r>
+              <w:t xml:space="preserve">Escala</w:t>
+            </w:r>
+          </w:p>
+        </w:tc>
+        <w:tc>
+          <w:tcPr/>
+          <w:p>
+            <w:pPr>
+              <w:pStyle w:val="Compact"/>
+            </w:pPr>
+            <w:r>
+              <w:t xml:space="preserve">n (obs.)</w:t>
+            </w:r>
+          </w:p>
+        </w:tc>
+        <w:tc>
+          <w:tcPr/>
+          <w:p>
+            <w:pPr>
+              <w:pStyle w:val="Compact"/>
+            </w:pPr>
+            <w:r>
+              <w:t xml:space="preserve">Clusters</w:t>
+            </w:r>
+          </w:p>
+        </w:tc>
+        <w:tc>
+          <w:tcPr/>
+          <w:p>
+            <w:pPr>
+              <w:pStyle w:val="Compact"/>
+            </w:pPr>
+            <w:r>
+              <w:t xml:space="preserve">r</w:t>
+            </w:r>
+          </w:p>
+        </w:tc>
+        <w:tc>
+          <w:tcPr/>
+          <w:p>
+            <w:pPr>
+              <w:pStyle w:val="Compact"/>
+            </w:pPr>
+            <w:r>
+              <w:t xml:space="preserve">IC95% bootstrap</w:t>
+            </w:r>
+          </w:p>
+        </w:tc>
+        <w:tc>
+          <w:tcPr/>
+          <w:p>
+            <w:pPr>
+              <w:pStyle w:val="Compact"/>
+            </w:pPr>
+            <w:r>
+              <w:t xml:space="preserve">p</w:t>
+            </w:r>
+          </w:p>
+        </w:tc>
+      </w:tr>
+      <w:tr>
+        <w:tc>
+          <w:tcPr/>
+          <w:p>
+            <w:pPr>
+              <w:pStyle w:val="Compact"/>
+            </w:pPr>
+            <w:r>
+              <w:t xml:space="preserve">Microrregião Sertão de Cratéus</w:t>
+            </w:r>
+          </w:p>
+        </w:tc>
+        <w:tc>
+          <w:tcPr/>
+          <w:p>
+            <w:pPr>
+              <w:pStyle w:val="Compact"/>
+            </w:pPr>
+            <w:r>
+              <w:t xml:space="preserve">108</w:t>
+            </w:r>
+          </w:p>
+        </w:tc>
+        <w:tc>
+          <w:tcPr/>
+          <w:p>
+            <w:pPr>
+              <w:pStyle w:val="Compact"/>
+            </w:pPr>
+            <w:r>
+              <w:t xml:space="preserve">9</w:t>
+            </w:r>
+          </w:p>
+        </w:tc>
+        <w:tc>
+          <w:tcPr/>
+          <w:p>
+            <w:pPr>
+              <w:pStyle w:val="Compact"/>
+            </w:pPr>
+            <w:r>
+              <w:t xml:space="preserve">0,49</w:t>
+            </w:r>
+          </w:p>
+        </w:tc>
+        <w:tc>
+          <w:tcPr/>
+          <w:p>
+            <w:pPr>
+              <w:pStyle w:val="Compact"/>
+            </w:pPr>
+            <w:r>
+              <w:t xml:space="preserve">[0,34; 0,64]</w:t>
+            </w:r>
+          </w:p>
+        </w:tc>
+        <w:tc>
+          <w:tcPr/>
+          <w:p>
+            <w:pPr>
+              <w:pStyle w:val="Compact"/>
+            </w:pPr>
+            <w:r>
+              <w:t xml:space="preserve">&lt; 0,001</w:t>
+            </w:r>
+          </w:p>
+        </w:tc>
+      </w:tr>
+      <w:tr>
+        <w:tc>
+          <w:tcPr/>
+          <w:p>
+            <w:pPr>
+              <w:pStyle w:val="Compact"/>
+            </w:pPr>
+            <w:r>
+              <w:t xml:space="preserve">Ceará</w:t>
+            </w:r>
+          </w:p>
+        </w:tc>
+        <w:tc>
+          <w:tcPr/>
+          <w:p>
+            <w:pPr>
+              <w:pStyle w:val="Compact"/>
+            </w:pPr>
+            <w:r>
+              <w:t xml:space="preserve">2.202</w:t>
+            </w:r>
+          </w:p>
+        </w:tc>
+        <w:tc>
+          <w:tcPr/>
+          <w:p>
+            <w:pPr>
+              <w:pStyle w:val="Compact"/>
+            </w:pPr>
+            <w:r>
+              <w:t xml:space="preserve">184</w:t>
+            </w:r>
+          </w:p>
+        </w:tc>
+        <w:tc>
+          <w:tcPr/>
+          <w:p>
+            <w:pPr>
+              <w:pStyle w:val="Compact"/>
+            </w:pPr>
+            <w:r>
+              <w:t xml:space="preserve">0,26</w:t>
+            </w:r>
+          </w:p>
+        </w:tc>
+        <w:tc>
+          <w:tcPr/>
+          <w:p>
+            <w:pPr>
+              <w:pStyle w:val="Compact"/>
+            </w:pPr>
+            <w:r>
+              <w:t xml:space="preserve">[0,20; 0,33]</w:t>
+            </w:r>
+          </w:p>
+        </w:tc>
+        <w:tc>
+          <w:tcPr/>
+          <w:p>
+            <w:pPr>
+              <w:pStyle w:val="Compact"/>
+            </w:pPr>
+            <w:r>
+              <w:t xml:space="preserve">&lt; 0,001</w:t>
+            </w:r>
+          </w:p>
+        </w:tc>
+      </w:tr>
+      <w:tr>
+        <w:tc>
+          <w:tcPr/>
+          <w:p>
+            <w:pPr>
+              <w:pStyle w:val="Compact"/>
+            </w:pPr>
+            <w:r>
+              <w:t xml:space="preserve">Brasil</w:t>
+            </w:r>
+          </w:p>
+        </w:tc>
+        <w:tc>
+          <w:tcPr/>
+          <w:p>
+            <w:pPr>
+              <w:pStyle w:val="Compact"/>
+            </w:pPr>
+            <w:r>
+              <w:t xml:space="preserve">48.695</w:t>
+            </w:r>
+          </w:p>
+        </w:tc>
+        <w:tc>
+          <w:tcPr/>
+          <w:p>
+            <w:pPr>
+              <w:pStyle w:val="Compact"/>
+            </w:pPr>
+            <w:r>
+              <w:t xml:space="preserve">5.360</w:t>
+            </w:r>
+          </w:p>
+        </w:tc>
+        <w:tc>
+          <w:tcPr/>
+          <w:p>
+            <w:pPr>
+              <w:pStyle w:val="Compact"/>
+            </w:pPr>
+            <w:r>
+              <w:t xml:space="preserve">0,46</w:t>
+            </w:r>
+          </w:p>
+        </w:tc>
+        <w:tc>
+          <w:tcPr/>
+          <w:p>
+            <w:pPr>
+              <w:pStyle w:val="Compact"/>
+            </w:pPr>
+            <w:r>
+              <w:t xml:space="preserve">[0,44; 0,47]</w:t>
+            </w:r>
+          </w:p>
+        </w:tc>
+        <w:tc>
+          <w:tcPr/>
+          <w:p>
+            <w:pPr>
+              <w:pStyle w:val="Compact"/>
+            </w:pPr>
+            <w:r>
+              <w:t xml:space="preserve">&lt; 0,001</w:t>
+            </w:r>
+          </w:p>
+        </w:tc>
+      </w:tr>
+    </w:tbl>
+    <w:bookmarkEnd w:id="25"/>
+    <w:bookmarkStart w:id="26" w:name="h2-associação-dentro-das-unidades"/>
+    <w:p>
+      <w:pPr>
+        <w:pStyle w:val="Heading3"/>
+      </w:pPr>
+      <w:r>
+        <w:t xml:space="preserve">4.2 H2 — associação dentro das unidades</w:t>
+      </w:r>
+    </w:p>
+    <w:p>
+      <w:pPr>
+        <w:pStyle w:val="FirstParagraph"/>
+      </w:pPr>
+      <w:r>
+        <w:t xml:space="preserve">As primeiras diferenças dentro de município-etapa na microrregião foram nulas: r = −0,05 (p = 0,61; n = 90). O coeficiente de efeitos fixos de município e ano foi β = 2,61 (SE clusterizado 1,79; IC95% cluster [−1,51; 6,73]; p = 0,18; n = 108): positivo, mas não estatisticamente discernível de zero, mesmo com erros clusterizados. Para o Ceará, β = 0,001 (IC95% cluster [−0,26; 0,26]; p = 0,99). Para o Brasil, β = 0,11 (IC95% cluster [0,07; 0,15]; p &lt; 0,001): pequeno, embora discernível dado o enorme n. H2 se confirma na microrregião e no Ceará: dentro das unidades, a associação entre variação de renda e variação de IDEB não é discernível.</w:t>
+      </w:r>
+    </w:p>
+    <w:p>
+      <w:pPr>
+        <w:pStyle w:val="BodyText"/>
+      </w:pPr>
+      <w:r>
+        <w:rPr>
+          <w:b/>
+          <w:bCs/>
+        </w:rPr>
+        <w:t xml:space="preserve">Tabela 2 — Associação dentro das unidades por escala</w:t>
+      </w:r>
+    </w:p>
+    <w:tbl>
+      <w:tblPr>
+        <w:tblStyle w:val="Table"/>
+        <w:tblW w:type="pct" w:w="5000"/>
+        <w:tblLayout w:type="fixed"/>
+        <w:tblLook w:firstRow="1" w:lastRow="0" w:firstColumn="0" w:lastColumn="0" w:noHBand="0" w:noVBand="0" w:val="0020"/>
+      </w:tblPr>
+      <w:tblGrid>
+        <w:gridCol w:w="1584"/>
+        <w:gridCol w:w="1584"/>
+        <w:gridCol w:w="1584"/>
+        <w:gridCol w:w="1584"/>
+        <w:gridCol w:w="1584"/>
+      </w:tblGrid>
+      <w:tr>
+        <w:trPr>
+          <w:tblHeader w:val="on"/>
+        </w:trPr>
+        <w:tc>
+          <w:tcPr/>
+          <w:p>
+            <w:pPr>
+              <w:pStyle w:val="Compact"/>
+            </w:pPr>
+            <w:r>
+              <w:t xml:space="preserve">Escala</w:t>
+            </w:r>
+          </w:p>
+        </w:tc>
+        <w:tc>
+          <w:tcPr/>
+          <w:p>
+            <w:pPr>
+              <w:pStyle w:val="Compact"/>
+            </w:pPr>
+            <w:r>
+              <w:t xml:space="preserve">1ª diferenças r (p)</w:t>
+            </w:r>
+          </w:p>
+        </w:tc>
+        <w:tc>
+          <w:tcPr/>
+          <w:p>
+            <w:pPr>
+              <w:pStyle w:val="Compact"/>
+            </w:pPr>
+            <w:r>
+              <w:t xml:space="preserve">n (1ª dif.)</w:t>
+            </w:r>
+          </w:p>
+        </w:tc>
+        <w:tc>
+          <w:tcPr/>
+          <w:p>
+            <w:pPr>
+              <w:pStyle w:val="Compact"/>
+            </w:pPr>
+            <w:r>
+              <w:t xml:space="preserve">FE β (IC95% cluster)</w:t>
+            </w:r>
+          </w:p>
+        </w:tc>
+        <w:tc>
+          <w:tcPr/>
+          <w:p>
+            <w:pPr>
+              <w:pStyle w:val="Compact"/>
+            </w:pPr>
+            <w:r>
+              <w:t xml:space="preserve">n (FE)</w:t>
+            </w:r>
+          </w:p>
+        </w:tc>
+      </w:tr>
+      <w:tr>
+        <w:tc>
+          <w:tcPr/>
+          <w:p>
+            <w:pPr>
+              <w:pStyle w:val="Compact"/>
+            </w:pPr>
+            <w:r>
+              <w:t xml:space="preserve">Microrregião Sertão de Cratéus</w:t>
+            </w:r>
+          </w:p>
+        </w:tc>
+        <w:tc>
+          <w:tcPr/>
+          <w:p>
+            <w:pPr>
+              <w:pStyle w:val="Compact"/>
+            </w:pPr>
+            <w:r>
+              <w:t xml:space="preserve">−0,05 (0,61)</w:t>
+            </w:r>
+          </w:p>
+        </w:tc>
+        <w:tc>
+          <w:tcPr/>
+          <w:p>
+            <w:pPr>
+              <w:pStyle w:val="Compact"/>
+            </w:pPr>
+            <w:r>
+              <w:t xml:space="preserve">90</w:t>
+            </w:r>
+          </w:p>
+        </w:tc>
+        <w:tc>
+          <w:tcPr/>
+          <w:p>
+            <w:pPr>
+              <w:pStyle w:val="Compact"/>
+            </w:pPr>
+            <w:r>
+              <w:t xml:space="preserve">2,61 ([−1,51; 6,73])</w:t>
+            </w:r>
+          </w:p>
+        </w:tc>
+        <w:tc>
+          <w:tcPr/>
+          <w:p>
+            <w:pPr>
+              <w:pStyle w:val="Compact"/>
+            </w:pPr>
+            <w:r>
+              <w:t xml:space="preserve">108</w:t>
+            </w:r>
+          </w:p>
+        </w:tc>
+      </w:tr>
+      <w:tr>
+        <w:tc>
+          <w:tcPr/>
+          <w:p>
+            <w:pPr>
+              <w:pStyle w:val="Compact"/>
+            </w:pPr>
+            <w:r>
+              <w:t xml:space="preserve">Ceará</w:t>
+            </w:r>
+          </w:p>
+        </w:tc>
+        <w:tc>
+          <w:tcPr/>
+          <w:p>
+            <w:pPr>
+              <w:pStyle w:val="Compact"/>
+            </w:pPr>
+            <w:r>
+              <w:t xml:space="preserve">0,03 (0,27)</w:t>
+            </w:r>
+          </w:p>
+        </w:tc>
+        <w:tc>
+          <w:tcPr/>
+          <w:p>
+            <w:pPr>
+              <w:pStyle w:val="Compact"/>
+            </w:pPr>
+            <w:r>
+              <w:t xml:space="preserve">1.834</w:t>
+            </w:r>
+          </w:p>
+        </w:tc>
+        <w:tc>
+          <w:tcPr/>
+          <w:p>
+            <w:pPr>
+              <w:pStyle w:val="Compact"/>
+            </w:pPr>
+            <w:r>
+              <w:t xml:space="preserve">0,001 ([−0,26; 0,26])</w:t>
+            </w:r>
+          </w:p>
+        </w:tc>
+        <w:tc>
+          <w:tcPr/>
+          <w:p>
+            <w:pPr>
+              <w:pStyle w:val="Compact"/>
+            </w:pPr>
+            <w:r>
+              <w:t xml:space="preserve">2.202</w:t>
+            </w:r>
+          </w:p>
+        </w:tc>
+      </w:tr>
+      <w:tr>
+        <w:tc>
+          <w:tcPr/>
+          <w:p>
+            <w:pPr>
+              <w:pStyle w:val="Compact"/>
+            </w:pPr>
+            <w:r>
+              <w:t xml:space="preserve">Brasil</w:t>
+            </w:r>
+          </w:p>
+        </w:tc>
+        <w:tc>
+          <w:tcPr/>
+          <w:p>
+            <w:pPr>
+              <w:pStyle w:val="Compact"/>
+            </w:pPr>
+            <w:r>
+              <w:t xml:space="preserve">0,06 (&lt; 0,001)</w:t>
+            </w:r>
+          </w:p>
+        </w:tc>
+        <w:tc>
+          <w:tcPr/>
+          <w:p>
+            <w:pPr>
+              <w:pStyle w:val="Compact"/>
+            </w:pPr>
+            <w:r>
+              <w:t xml:space="preserve">39.760</w:t>
+            </w:r>
+          </w:p>
+        </w:tc>
+        <w:tc>
+          <w:tcPr/>
+          <w:p>
+            <w:pPr>
+              <w:pStyle w:val="Compact"/>
+            </w:pPr>
+            <w:r>
+              <w:t xml:space="preserve">0,11 ([0,07; 0,15])</w:t>
+            </w:r>
+          </w:p>
+        </w:tc>
+        <w:tc>
+          <w:tcPr/>
+          <w:p>
+            <w:pPr>
+              <w:pStyle w:val="Compact"/>
+            </w:pPr>
+            <w:r>
+              <w:t xml:space="preserve">48.695</w:t>
+            </w:r>
+          </w:p>
+        </w:tc>
+      </w:tr>
+    </w:tbl>
+    <w:bookmarkEnd w:id="26"/>
+    <w:bookmarkStart w:id="33" w:name="Xbe2b44eac008592f99ff6f32afd2a0343eab255"/>
+    <w:p>
+      <w:pPr>
+        <w:pStyle w:val="Heading3"/>
+      </w:pPr>
+      <w:r>
+        <w:t xml:space="preserve">4.3 Validação cruzada leave-one-out por município</w:t>
+      </w:r>
+    </w:p>
+    <w:p>
+      <w:pPr>
+        <w:pStyle w:val="FirstParagraph"/>
+      </w:pPr>
+      <w:r>
+        <w:t xml:space="preserve">A correlação de níveis estimada fora da amostra (treino nos oito municípios restantes, teste no município retido) foi positiva em 9/9 municípios (100%), com mediana r = 0,62 (média 0,65; DP 0,11). Os r de teste por município variaram de 0,43 (Quiterianópolis) a 0,81 (Ararendá). A associação em níveis não depende de um único município: é replicável em todos os nove (Figuras 2 e 3).</w:t>
+      </w:r>
+    </w:p>
+    <w:p>
+      <w:pPr>
+        <w:pStyle w:val="CaptionedFigure"/>
+      </w:pPr>
+      <w:r>
+        <w:drawing>
+          <wp:inline>
+            <wp:extent cx="5753100" cy="2520405"/>
+            <wp:effectExtent b="0" l="0" r="0" t="0"/>
+            <wp:docPr descr="Figura 2 — Trajetória do IDEB por município, 2007–2025 (anos iniciais e finais)." title="" id="28" name="Picture"/>
+            <a:graphic>
+              <a:graphicData uri="http://schemas.openxmlformats.org/drawingml/2006/picture">
+                <pic:pic>
+                  <pic:nvPicPr>
+                    <pic:cNvPr descr="outputs/figuras/fig_serie_ideb_micro.png" id="29" name="Picture"/>
+                    <pic:cNvPicPr>
+                      <a:picLocks noChangeArrowheads="1" noChangeAspect="1"/>
+                    </pic:cNvPicPr>
+                  </pic:nvPicPr>
+                  <pic:blipFill>
+                    <a:blip r:embed="rId27"/>
+                    <a:stretch>
+                      <a:fillRect/>
+                    </a:stretch>
+                  </pic:blipFill>
+                  <pic:spPr bwMode="auto">
+                    <a:xfrm>
+                      <a:off x="0" y="0"/>
+                      <a:ext cx="5753100" cy="2520405"/>
+                    </a:xfrm>
+                    <a:prstGeom prst="rect">
+                      <a:avLst/>
+                    </a:prstGeom>
+                    <a:noFill/>
+                    <a:ln w="9525">
+                      <a:noFill/>
+                      <a:headEnd/>
+                      <a:tailEnd/>
+                    </a:ln>
+                  </pic:spPr>
+                </pic:pic>
+              </a:graphicData>
+            </a:graphic>
+          </wp:inline>
+        </w:drawing>
+      </w:r>
+    </w:p>
+    <w:p>
+      <w:pPr>
+        <w:pStyle w:val="ImageCaption"/>
+      </w:pPr>
+      <w:r>
+        <w:t xml:space="preserve">Figura 2 — Trajetória do IDEB por município, 2007–2025 (anos iniciais e finais).</w:t>
+      </w:r>
+    </w:p>
+    <w:p>
+      <w:pPr>
+        <w:pStyle w:val="CaptionedFigure"/>
+      </w:pPr>
+      <w:r>
+        <w:drawing>
+          <wp:inline>
+            <wp:extent cx="5753100" cy="3179344"/>
+            <wp:effectExtent b="0" l="0" r="0" t="0"/>
+            <wp:docPr descr="Figura 3 — Validação cruzada leave-one-out: r de teste por município retido." title="" id="31" name="Picture"/>
+            <a:graphic>
+              <a:graphicData uri="http://schemas.openxmlformats.org/drawingml/2006/picture">
+                <pic:pic>
+                  <pic:nvPicPr>
+                    <pic:cNvPr descr="outputs/figuras/fig_loocv_r_teste.png" id="32" name="Picture"/>
+                    <pic:cNvPicPr>
+                      <a:picLocks noChangeArrowheads="1" noChangeAspect="1"/>
+                    </pic:cNvPicPr>
+                  </pic:nvPicPr>
+                  <pic:blipFill>
+                    <a:blip r:embed="rId30"/>
+                    <a:stretch>
+                      <a:fillRect/>
+                    </a:stretch>
+                  </pic:blipFill>
+                  <pic:spPr bwMode="auto">
+                    <a:xfrm>
+                      <a:off x="0" y="0"/>
+                      <a:ext cx="5753100" cy="3179344"/>
+                    </a:xfrm>
+                    <a:prstGeom prst="rect">
+                      <a:avLst/>
+                    </a:prstGeom>
+                    <a:noFill/>
+                    <a:ln w="9525">
+                      <a:noFill/>
+                      <a:headEnd/>
+                      <a:tailEnd/>
+                    </a:ln>
+                  </pic:spPr>
+                </pic:pic>
+              </a:graphicData>
+            </a:graphic>
+          </wp:inline>
+        </w:drawing>
+      </w:r>
+    </w:p>
+    <w:p>
+      <w:pPr>
+        <w:pStyle w:val="ImageCaption"/>
+      </w:pPr>
+      <w:r>
+        <w:t xml:space="preserve">Figura 3 — Validação cruzada leave-one-out: r de teste por município retido.</w:t>
+      </w:r>
+    </w:p>
+    <w:p>
+      <w:pPr>
+        <w:pStyle w:val="BodyText"/>
+      </w:pPr>
+      <w:r>
+        <w:rPr>
+          <w:b/>
+          <w:bCs/>
+        </w:rPr>
+        <w:t xml:space="preserve">Tabela 3 — Validação cruzada leave-one-out por município (r de teste)</w:t>
+      </w:r>
+    </w:p>
+    <w:tbl>
+      <w:tblPr>
+        <w:tblStyle w:val="Table"/>
+        <w:tblW w:type="auto" w:w="0"/>
+        <w:tblLook w:firstRow="1" w:lastRow="0" w:firstColumn="0" w:lastColumn="0" w:noHBand="0" w:noVBand="0" w:val="0020"/>
+      </w:tblPr>
+      <w:tblGrid>
+        <w:gridCol w:w="1980"/>
+        <w:gridCol w:w="1980"/>
+        <w:gridCol w:w="1980"/>
+        <w:gridCol w:w="1980"/>
+      </w:tblGrid>
+      <w:tr>
+        <w:trPr>
+          <w:tblHeader w:val="on"/>
+        </w:trPr>
+        <w:tc>
+          <w:tcPr/>
+          <w:p>
+            <w:pPr>
+              <w:pStyle w:val="Compact"/>
+            </w:pPr>
+            <w:r>
+              <w:t xml:space="preserve">Município retido</w:t>
+            </w:r>
+          </w:p>
+        </w:tc>
+        <w:tc>
+          <w:tcPr/>
+          <w:p>
+            <w:pPr>
+              <w:pStyle w:val="Compact"/>
+            </w:pPr>
+            <w:r>
+              <w:t xml:space="preserve">r treino</w:t>
+            </w:r>
+          </w:p>
+        </w:tc>
+        <w:tc>
+          <w:tcPr/>
+          <w:p>
+            <w:pPr>
+              <w:pStyle w:val="Compact"/>
+            </w:pPr>
+            <w:r>
+              <w:t xml:space="preserve">r teste</w:t>
+            </w:r>
+          </w:p>
+        </w:tc>
+        <w:tc>
+          <w:tcPr/>
+          <w:p>
+            <w:pPr>
+              <w:pStyle w:val="Compact"/>
+            </w:pPr>
+            <w:r>
+              <w:t xml:space="preserve">n teste</w:t>
+            </w:r>
+          </w:p>
+        </w:tc>
+      </w:tr>
+      <w:tr>
+        <w:tc>
+          <w:tcPr/>
+          <w:p>
+            <w:pPr>
+              <w:pStyle w:val="Compact"/>
+            </w:pPr>
+            <w:r>
+              <w:t xml:space="preserve">Ararendá</w:t>
+            </w:r>
+          </w:p>
+        </w:tc>
+        <w:tc>
+          <w:tcPr/>
+          <w:p>
+            <w:pPr>
+              <w:pStyle w:val="Compact"/>
+            </w:pPr>
+            <w:r>
+              <w:t xml:space="preserve">0,50</w:t>
+            </w:r>
+          </w:p>
+        </w:tc>
+        <w:tc>
+          <w:tcPr/>
+          <w:p>
+            <w:pPr>
+              <w:pStyle w:val="Compact"/>
+            </w:pPr>
+            <w:r>
+              <w:t xml:space="preserve">0,81</w:t>
+            </w:r>
+          </w:p>
+        </w:tc>
+        <w:tc>
+          <w:tcPr/>
+          <w:p>
+            <w:pPr>
+              <w:pStyle w:val="Compact"/>
+            </w:pPr>
+            <w:r>
+              <w:t xml:space="preserve">12</w:t>
+            </w:r>
+          </w:p>
+        </w:tc>
+      </w:tr>
+      <w:tr>
+        <w:tc>
+          <w:tcPr/>
+          <w:p>
+            <w:pPr>
+              <w:pStyle w:val="Compact"/>
+            </w:pPr>
+            <w:r>
+              <w:t xml:space="preserve">Crateús</w:t>
+            </w:r>
+          </w:p>
+        </w:tc>
+        <w:tc>
+          <w:tcPr/>
+          <w:p>
+            <w:pPr>
+              <w:pStyle w:val="Compact"/>
+            </w:pPr>
+            <w:r>
+              <w:t xml:space="preserve">0,57</w:t>
+            </w:r>
+          </w:p>
+        </w:tc>
+        <w:tc>
+          <w:tcPr/>
+          <w:p>
+            <w:pPr>
+              <w:pStyle w:val="Compact"/>
+            </w:pPr>
+            <w:r>
+              <w:t xml:space="preserve">0,59</w:t>
+            </w:r>
+          </w:p>
+        </w:tc>
+        <w:tc>
+          <w:tcPr/>
+          <w:p>
+            <w:pPr>
+              <w:pStyle w:val="Compact"/>
+            </w:pPr>
+            <w:r>
+              <w:t xml:space="preserve">12</w:t>
+            </w:r>
+          </w:p>
+        </w:tc>
+      </w:tr>
+      <w:tr>
+        <w:tc>
+          <w:tcPr/>
+          <w:p>
+            <w:pPr>
+              <w:pStyle w:val="Compact"/>
+            </w:pPr>
+            <w:r>
+              <w:t xml:space="preserve">Independência</w:t>
+            </w:r>
+          </w:p>
+        </w:tc>
+        <w:tc>
+          <w:tcPr/>
+          <w:p>
+            <w:pPr>
+              <w:pStyle w:val="Compact"/>
+            </w:pPr>
+            <w:r>
+              <w:t xml:space="preserve">0,46</w:t>
+            </w:r>
+          </w:p>
+        </w:tc>
+        <w:tc>
+          <w:tcPr/>
+          <w:p>
+            <w:pPr>
+              <w:pStyle w:val="Compact"/>
+            </w:pPr>
+            <w:r>
+              <w:t xml:space="preserve">0,62</w:t>
+            </w:r>
+          </w:p>
+        </w:tc>
+        <w:tc>
+          <w:tcPr/>
+          <w:p>
+            <w:pPr>
+              <w:pStyle w:val="Compact"/>
+            </w:pPr>
+            <w:r>
+              <w:t xml:space="preserve">12</w:t>
+            </w:r>
+          </w:p>
+        </w:tc>
+      </w:tr>
+      <w:tr>
+        <w:tc>
+          <w:tcPr/>
+          <w:p>
+            <w:pPr>
+              <w:pStyle w:val="Compact"/>
+            </w:pPr>
+            <w:r>
+              <w:t xml:space="preserve">Ipaporanga</w:t>
+            </w:r>
+          </w:p>
+        </w:tc>
+        <w:tc>
+          <w:tcPr/>
+          <w:p>
+            <w:pPr>
+              <w:pStyle w:val="Compact"/>
+            </w:pPr>
+            <w:r>
+              <w:t xml:space="preserve">0,48</w:t>
+            </w:r>
+          </w:p>
+        </w:tc>
+        <w:tc>
+          <w:tcPr/>
+          <w:p>
+            <w:pPr>
+              <w:pStyle w:val="Compact"/>
+            </w:pPr>
+            <w:r>
+              <w:t xml:space="preserve">0,62</w:t>
+            </w:r>
+          </w:p>
+        </w:tc>
+        <w:tc>
+          <w:tcPr/>
+          <w:p>
+            <w:pPr>
+              <w:pStyle w:val="Compact"/>
+            </w:pPr>
+            <w:r>
+              <w:t xml:space="preserve">12</w:t>
+            </w:r>
+          </w:p>
+        </w:tc>
+      </w:tr>
+      <w:tr>
+        <w:tc>
+          <w:tcPr/>
+          <w:p>
+            <w:pPr>
+              <w:pStyle w:val="Compact"/>
+            </w:pPr>
+            <w:r>
+              <w:t xml:space="preserve">Monsenhor Tabosa</w:t>
+            </w:r>
+          </w:p>
+        </w:tc>
+        <w:tc>
+          <w:tcPr/>
+          <w:p>
+            <w:pPr>
+              <w:pStyle w:val="Compact"/>
+            </w:pPr>
+            <w:r>
+              <w:t xml:space="preserve">0,46</w:t>
+            </w:r>
+          </w:p>
+        </w:tc>
+        <w:tc>
+          <w:tcPr/>
+          <w:p>
+            <w:pPr>
+              <w:pStyle w:val="Compact"/>
+            </w:pPr>
+            <w:r>
+              <w:t xml:space="preserve">0,74</w:t>
+            </w:r>
+          </w:p>
+        </w:tc>
+        <w:tc>
+          <w:tcPr/>
+          <w:p>
+            <w:pPr>
+              <w:pStyle w:val="Compact"/>
+            </w:pPr>
+            <w:r>
+              <w:t xml:space="preserve">12</w:t>
+            </w:r>
+          </w:p>
+        </w:tc>
+      </w:tr>
+      <w:tr>
+        <w:tc>
+          <w:tcPr/>
+          <w:p>
+            <w:pPr>
+              <w:pStyle w:val="Compact"/>
+            </w:pPr>
+            <w:r>
+              <w:t xml:space="preserve">Nova Russas</w:t>
+            </w:r>
+          </w:p>
+        </w:tc>
+        <w:tc>
+          <w:tcPr/>
+          <w:p>
+            <w:pPr>
+              <w:pStyle w:val="Compact"/>
+            </w:pPr>
+            <w:r>
+              <w:t xml:space="preserve">0,49</w:t>
+            </w:r>
+          </w:p>
+        </w:tc>
+        <w:tc>
+          <w:tcPr/>
+          <w:p>
+            <w:pPr>
+              <w:pStyle w:val="Compact"/>
+            </w:pPr>
+            <w:r>
+              <w:t xml:space="preserve">0,76</w:t>
+            </w:r>
+          </w:p>
+        </w:tc>
+        <w:tc>
+          <w:tcPr/>
+          <w:p>
+            <w:pPr>
+              <w:pStyle w:val="Compact"/>
+            </w:pPr>
+            <w:r>
+              <w:t xml:space="preserve">12</w:t>
+            </w:r>
+          </w:p>
+        </w:tc>
+      </w:tr>
+      <w:tr>
+        <w:tc>
+          <w:tcPr/>
+          <w:p>
+            <w:pPr>
+              <w:pStyle w:val="Compact"/>
+            </w:pPr>
+            <w:r>
+              <w:t xml:space="preserve">Novo Oriente</w:t>
+            </w:r>
+          </w:p>
+        </w:tc>
+        <w:tc>
+          <w:tcPr/>
+          <w:p>
+            <w:pPr>
+              <w:pStyle w:val="Compact"/>
+            </w:pPr>
+            <w:r>
+              <w:t xml:space="preserve">0,51</w:t>
+            </w:r>
+          </w:p>
+        </w:tc>
+        <w:tc>
+          <w:tcPr/>
+          <w:p>
+            <w:pPr>
+              <w:pStyle w:val="Compact"/>
+            </w:pPr>
+            <w:r>
+              <w:t xml:space="preserve">0,61</w:t>
+            </w:r>
+          </w:p>
+        </w:tc>
+        <w:tc>
+          <w:tcPr/>
+          <w:p>
+            <w:pPr>
+              <w:pStyle w:val="Compact"/>
+            </w:pPr>
+            <w:r>
+              <w:t xml:space="preserve">12</w:t>
+            </w:r>
+          </w:p>
+        </w:tc>
+      </w:tr>
+      <w:tr>
+        <w:tc>
+          <w:tcPr/>
+          <w:p>
+            <w:pPr>
+              <w:pStyle w:val="Compact"/>
+            </w:pPr>
+            <w:r>
+              <w:t xml:space="preserve">Quiterianópolis</w:t>
+            </w:r>
+          </w:p>
+        </w:tc>
+        <w:tc>
+          <w:tcPr/>
+          <w:p>
+            <w:pPr>
+              <w:pStyle w:val="Compact"/>
+            </w:pPr>
+            <w:r>
+              <w:t xml:space="preserve">0,49</w:t>
+            </w:r>
+          </w:p>
+        </w:tc>
+        <w:tc>
+          <w:tcPr/>
+          <w:p>
+            <w:pPr>
+              <w:pStyle w:val="Compact"/>
+            </w:pPr>
+            <w:r>
+              <w:t xml:space="preserve">0,43</w:t>
+            </w:r>
+          </w:p>
+        </w:tc>
+        <w:tc>
+          <w:tcPr/>
+          <w:p>
+            <w:pPr>
+              <w:pStyle w:val="Compact"/>
+            </w:pPr>
+            <w:r>
+              <w:t xml:space="preserve">12</w:t>
+            </w:r>
+          </w:p>
+        </w:tc>
+      </w:tr>
+      <w:tr>
+        <w:tc>
+          <w:tcPr/>
+          <w:p>
+            <w:pPr>
+              <w:pStyle w:val="Compact"/>
+            </w:pPr>
+            <w:r>
+              <w:t xml:space="preserve">Tamboril</w:t>
+            </w:r>
+          </w:p>
+        </w:tc>
+        <w:tc>
+          <w:tcPr/>
+          <w:p>
+            <w:pPr>
+              <w:pStyle w:val="Compact"/>
+            </w:pPr>
+            <w:r>
+              <w:t xml:space="preserve">0,46</w:t>
+            </w:r>
+          </w:p>
+        </w:tc>
+        <w:tc>
+          <w:tcPr/>
+          <w:p>
+            <w:pPr>
+              <w:pStyle w:val="Compact"/>
+            </w:pPr>
+            <w:r>
+              <w:t xml:space="preserve">0,71</w:t>
+            </w:r>
+          </w:p>
+        </w:tc>
+        <w:tc>
+          <w:tcPr/>
+          <w:p>
+            <w:pPr>
+              <w:pStyle w:val="Compact"/>
+            </w:pPr>
+            <w:r>
+              <w:t xml:space="preserve">12</w:t>
+            </w:r>
+          </w:p>
+        </w:tc>
+      </w:tr>
+    </w:tbl>
+    <w:bookmarkEnd w:id="33"/>
+    <w:bookmarkStart w:id="34" w:name="mdes-e-tost"/>
+    <w:p>
+      <w:pPr>
+        <w:pStyle w:val="Heading3"/>
+      </w:pPr>
+      <w:r>
+        <w:t xml:space="preserve">4.4 MDES e TOST</w:t>
+      </w:r>
+    </w:p>
+    <w:p>
+      <w:pPr>
+        <w:pStyle w:val="FirstParagraph"/>
+      </w:pPr>
+      <w:r>
+        <w:t xml:space="preserve">Com n municipal de 9 e 108 observações, o mínimo efeito detectável foi de 5,71 pontos de IDEB por unidade de log do PIB (erro clusterizado, G−1 = 8 graus de liberdade; 6,05 com erro homocedástico) — muito acima de qualquer coeficiente plausível. O teste de equivalência (TOST, margem ±0,10) não foi significativo (p = 0,90). Portanto, o correto é declarar</w:t>
+      </w:r>
+      <w:r>
+        <w:t xml:space="preserve"> </w:t>
+      </w:r>
+      <w:r>
+        <w:rPr>
+          <w:b/>
+          <w:bCs/>
+        </w:rPr>
+        <w:t xml:space="preserve">não-detecção</w:t>
+      </w:r>
+      <w:r>
+        <w:t xml:space="preserve">: a amostra não permite afirmar efeito, mas tampouco permite declarar equivalência. Essa é uma limitação central, explicitamente assumida.</w:t>
+      </w:r>
+    </w:p>
+    <w:bookmarkEnd w:id="34"/>
+    <w:bookmarkStart w:id="38" w:name="h3-ganho-educacional-e-metas"/>
+    <w:p>
+      <w:pPr>
+        <w:pStyle w:val="Heading3"/>
+      </w:pPr>
+      <w:r>
+        <w:t xml:space="preserve">4.5 H3 — ganho educacional e metas</w:t>
+      </w:r>
+    </w:p>
+    <w:p>
+      <w:pPr>
+        <w:pStyle w:val="FirstParagraph"/>
+      </w:pPr>
+      <w:r>
+        <w:t xml:space="preserve">Contrariando a premissa de estagnação, os dados INEP 2025 mostram crescimento expressivo do IDEB nos nove municípios (anos iniciais, 2007→2025): ganho médio de 5,93 pontos, com todos os municípios</w:t>
+      </w:r>
+      <w:r>
+        <w:t xml:space="preserve"> </w:t>
+      </w:r>
+      <w:r>
+        <w:rPr>
+          <w:b/>
+          <w:bCs/>
+        </w:rPr>
+        <w:t xml:space="preserve">acima da meta pactuada para 2021</w:t>
+      </w:r>
+      <w:r>
+        <w:t xml:space="preserve">. O IDEB 2025 em anos iniciais variou de 6,8 (Quiterianópolis) a 9,9 (Ipaporanga), valores superiores à média nacional da rede municipal. Em anos finais, todos os nove municípios também atingiram a meta 2021. A correlação entre ganho de IDEB (anos iniciais) e renda média do responsável foi nula: r = −0,14 (p = 0,73; n = 9; Figura 4). Ou seja: não há evidência de que municípios com maior renda tenham tido maior ganho educacional — o crescimento ocorreu de forma generalizada e não acompanhou a variação de renda.</w:t>
+      </w:r>
+    </w:p>
+    <w:p>
+      <w:pPr>
+        <w:pStyle w:val="CaptionedFigure"/>
+      </w:pPr>
+      <w:r>
+        <w:drawing>
+          <wp:inline>
+            <wp:extent cx="5753100" cy="3835400"/>
+            <wp:effectExtent b="0" l="0" r="0" t="0"/>
+            <wp:docPr descr="Figura 4 — Ganho de IDEB (2007→2025, anos iniciais) e renda média do responsável (Censo 2022)." title="" id="36" name="Picture"/>
+            <a:graphic>
+              <a:graphicData uri="http://schemas.openxmlformats.org/drawingml/2006/picture">
+                <pic:pic>
+                  <pic:nvPicPr>
+                    <pic:cNvPr descr="outputs/figuras/fig_scatter_ganho_renda.png" id="37" name="Picture"/>
+                    <pic:cNvPicPr>
+                      <a:picLocks noChangeArrowheads="1" noChangeAspect="1"/>
+                    </pic:cNvPicPr>
+                  </pic:nvPicPr>
+                  <pic:blipFill>
+                    <a:blip r:embed="rId35"/>
+                    <a:stretch>
+                      <a:fillRect/>
+                    </a:stretch>
+                  </pic:blipFill>
+                  <pic:spPr bwMode="auto">
+                    <a:xfrm>
+                      <a:off x="0" y="0"/>
+                      <a:ext cx="5753100" cy="3835400"/>
+                    </a:xfrm>
+                    <a:prstGeom prst="rect">
+                      <a:avLst/>
+                    </a:prstGeom>
+                    <a:noFill/>
+                    <a:ln w="9525">
+                      <a:noFill/>
+                      <a:headEnd/>
+                      <a:tailEnd/>
+                    </a:ln>
+                  </pic:spPr>
+                </pic:pic>
+              </a:graphicData>
+            </a:graphic>
+          </wp:inline>
+        </w:drawing>
+      </w:r>
+    </w:p>
+    <w:p>
+      <w:pPr>
+        <w:pStyle w:val="ImageCaption"/>
+      </w:pPr>
+      <w:r>
+        <w:t xml:space="preserve">Figura 4 — Ganho de IDEB (2007→2025, anos iniciais) e renda média do responsável (Censo 2022).</w:t>
+      </w:r>
+    </w:p>
+    <w:p>
+      <w:pPr>
+        <w:pStyle w:val="BodyText"/>
+      </w:pPr>
+      <w:r>
+        <w:rPr>
+          <w:b/>
+          <w:bCs/>
+        </w:rPr>
+        <w:t xml:space="preserve">Tabela 4 — IDEB 2025, ganho 2007–2025 e meta 2021 (anos iniciais)</w:t>
+      </w:r>
+    </w:p>
+    <w:tbl>
+      <w:tblPr>
+        <w:tblStyle w:val="Table"/>
+        <w:tblW w:type="auto" w:w="0"/>
+        <w:tblLook w:firstRow="1" w:lastRow="0" w:firstColumn="0" w:lastColumn="0" w:noHBand="0" w:noVBand="0" w:val="0020"/>
+      </w:tblPr>
+      <w:tblGrid>
+        <w:gridCol w:w="1320"/>
+        <w:gridCol w:w="1320"/>
+        <w:gridCol w:w="1320"/>
+        <w:gridCol w:w="1320"/>
+        <w:gridCol w:w="1320"/>
+        <w:gridCol w:w="1320"/>
+      </w:tblGrid>
+      <w:tr>
+        <w:trPr>
+          <w:tblHeader w:val="on"/>
+        </w:trPr>
+        <w:tc>
+          <w:tcPr/>
+          <w:p>
+            <w:pPr>
+              <w:pStyle w:val="Compact"/>
+            </w:pPr>
+            <w:r>
+              <w:t xml:space="preserve">Município</w:t>
+            </w:r>
+          </w:p>
+        </w:tc>
+        <w:tc>
+          <w:tcPr/>
+          <w:p>
+            <w:pPr>
+              <w:pStyle w:val="Compact"/>
+            </w:pPr>
+            <w:r>
+              <w:t xml:space="preserve">IDEB 2007</w:t>
+            </w:r>
+          </w:p>
+        </w:tc>
+        <w:tc>
+          <w:tcPr/>
+          <w:p>
+            <w:pPr>
+              <w:pStyle w:val="Compact"/>
+            </w:pPr>
+            <w:r>
+              <w:t xml:space="preserve">IDEB 2025</w:t>
+            </w:r>
+          </w:p>
+        </w:tc>
+        <w:tc>
+          <w:tcPr/>
+          <w:p>
+            <w:pPr>
+              <w:pStyle w:val="Compact"/>
+            </w:pPr>
+            <w:r>
+              <w:t xml:space="preserve">Ganho</w:t>
+            </w:r>
+          </w:p>
+        </w:tc>
+        <w:tc>
+          <w:tcPr/>
+          <w:p>
+            <w:pPr>
+              <w:pStyle w:val="Compact"/>
+            </w:pPr>
+            <w:r>
+              <w:t xml:space="preserve">Meta 2021</w:t>
+            </w:r>
+          </w:p>
+        </w:tc>
+        <w:tc>
+          <w:tcPr/>
+          <w:p>
+            <w:pPr>
+              <w:pStyle w:val="Compact"/>
+            </w:pPr>
+            <w:r>
+              <w:t xml:space="preserve">Atingiu meta</w:t>
+            </w:r>
+          </w:p>
+        </w:tc>
+      </w:tr>
+      <w:tr>
+        <w:tc>
+          <w:tcPr/>
+          <w:p>
+            <w:pPr>
+              <w:pStyle w:val="Compact"/>
+            </w:pPr>
+            <w:r>
+              <w:t xml:space="preserve">Ararendá</w:t>
+            </w:r>
+          </w:p>
+        </w:tc>
+        <w:tc>
+          <w:tcPr/>
+          <w:p>
+            <w:pPr>
+              <w:pStyle w:val="Compact"/>
+            </w:pPr>
+            <w:r>
+              <w:t xml:space="preserve">3,4</w:t>
+            </w:r>
+          </w:p>
+        </w:tc>
+        <w:tc>
+          <w:tcPr/>
+          <w:p>
+            <w:pPr>
+              <w:pStyle w:val="Compact"/>
+            </w:pPr>
+            <w:r>
+              <w:t xml:space="preserve">9,8</w:t>
+            </w:r>
+          </w:p>
+        </w:tc>
+        <w:tc>
+          <w:tcPr/>
+          <w:p>
+            <w:pPr>
+              <w:pStyle w:val="Compact"/>
+            </w:pPr>
+            <w:r>
+              <w:t xml:space="preserve">6,4</w:t>
+            </w:r>
+          </w:p>
+        </w:tc>
+        <w:tc>
+          <w:tcPr/>
+          <w:p>
+            <w:pPr>
+              <w:pStyle w:val="Compact"/>
+            </w:pPr>
+            <w:r>
+              <w:t xml:space="preserve">5,3</w:t>
+            </w:r>
+          </w:p>
+        </w:tc>
+        <w:tc>
+          <w:tcPr/>
+          <w:p>
+            <w:pPr>
+              <w:pStyle w:val="Compact"/>
+            </w:pPr>
+            <w:r>
+              <w:t xml:space="preserve">Sim</w:t>
+            </w:r>
+          </w:p>
+        </w:tc>
+      </w:tr>
+      <w:tr>
+        <w:tc>
+          <w:tcPr/>
+          <w:p>
+            <w:pPr>
+              <w:pStyle w:val="Compact"/>
+            </w:pPr>
+            <w:r>
+              <w:t xml:space="preserve">Crateús</w:t>
+            </w:r>
+          </w:p>
+        </w:tc>
+        <w:tc>
+          <w:tcPr/>
+          <w:p>
+            <w:pPr>
+              <w:pStyle w:val="Compact"/>
+            </w:pPr>
+            <w:r>
+              <w:t xml:space="preserve">3,4</w:t>
+            </w:r>
+          </w:p>
+        </w:tc>
+        <w:tc>
+          <w:tcPr/>
+          <w:p>
+            <w:pPr>
+              <w:pStyle w:val="Compact"/>
+            </w:pPr>
+            <w:r>
+              <w:t xml:space="preserve">8,5</w:t>
+            </w:r>
+          </w:p>
+        </w:tc>
+        <w:tc>
+          <w:tcPr/>
+          <w:p>
+            <w:pPr>
+              <w:pStyle w:val="Compact"/>
+            </w:pPr>
+            <w:r>
+              <w:t xml:space="preserve">5,1</w:t>
+            </w:r>
+          </w:p>
+        </w:tc>
+        <w:tc>
+          <w:tcPr/>
+          <w:p>
+            <w:pPr>
+              <w:pStyle w:val="Compact"/>
+            </w:pPr>
+            <w:r>
+              <w:t xml:space="preserve">5,2</w:t>
+            </w:r>
+          </w:p>
+        </w:tc>
+        <w:tc>
+          <w:tcPr/>
+          <w:p>
+            <w:pPr>
+              <w:pStyle w:val="Compact"/>
+            </w:pPr>
+            <w:r>
+              <w:t xml:space="preserve">Sim</w:t>
+            </w:r>
+          </w:p>
+        </w:tc>
+      </w:tr>
+      <w:tr>
+        <w:tc>
+          <w:tcPr/>
+          <w:p>
+            <w:pPr>
+              <w:pStyle w:val="Compact"/>
+            </w:pPr>
+            <w:r>
+              <w:t xml:space="preserve">Independência</w:t>
+            </w:r>
+          </w:p>
+        </w:tc>
+        <w:tc>
+          <w:tcPr/>
+          <w:p>
+            <w:pPr>
+              <w:pStyle w:val="Compact"/>
+            </w:pPr>
+            <w:r>
+              <w:t xml:space="preserve">3,7</w:t>
+            </w:r>
+          </w:p>
+        </w:tc>
+        <w:tc>
+          <w:tcPr/>
+          <w:p>
+            <w:pPr>
+              <w:pStyle w:val="Compact"/>
+            </w:pPr>
+            <w:r>
+              <w:t xml:space="preserve">9,8</w:t>
+            </w:r>
+          </w:p>
+        </w:tc>
+        <w:tc>
+          <w:tcPr/>
+          <w:p>
+            <w:pPr>
+              <w:pStyle w:val="Compact"/>
+            </w:pPr>
+            <w:r>
+              <w:t xml:space="preserve">6,1</w:t>
+            </w:r>
+          </w:p>
+        </w:tc>
+        <w:tc>
+          <w:tcPr/>
+          <w:p>
+            <w:pPr>
+              <w:pStyle w:val="Compact"/>
+            </w:pPr>
+            <w:r>
+              <w:t xml:space="preserve">5,2</w:t>
+            </w:r>
+          </w:p>
+        </w:tc>
+        <w:tc>
+          <w:tcPr/>
+          <w:p>
+            <w:pPr>
+              <w:pStyle w:val="Compact"/>
+            </w:pPr>
+            <w:r>
+              <w:t xml:space="preserve">Sim</w:t>
+            </w:r>
+          </w:p>
+        </w:tc>
+      </w:tr>
+      <w:tr>
+        <w:tc>
+          <w:tcPr/>
+          <w:p>
+            <w:pPr>
+              <w:pStyle w:val="Compact"/>
+            </w:pPr>
+            <w:r>
+              <w:t xml:space="preserve">Ipaporanga</w:t>
+            </w:r>
+          </w:p>
+        </w:tc>
+        <w:tc>
+          <w:tcPr/>
+          <w:p>
+            <w:pPr>
+              <w:pStyle w:val="Compact"/>
+            </w:pPr>
+            <w:r>
+              <w:t xml:space="preserve">3,2</w:t>
+            </w:r>
+          </w:p>
+        </w:tc>
+        <w:tc>
+          <w:tcPr/>
+          <w:p>
+            <w:pPr>
+              <w:pStyle w:val="Compact"/>
+            </w:pPr>
+            <w:r>
+              <w:t xml:space="preserve">9,9</w:t>
+            </w:r>
+          </w:p>
+        </w:tc>
+        <w:tc>
+          <w:tcPr/>
+          <w:p>
+            <w:pPr>
+              <w:pStyle w:val="Compact"/>
+            </w:pPr>
+            <w:r>
+              <w:t xml:space="preserve">6,7</w:t>
+            </w:r>
+          </w:p>
+        </w:tc>
+        <w:tc>
+          <w:tcPr/>
+          <w:p>
+            <w:pPr>
+              <w:pStyle w:val="Compact"/>
+            </w:pPr>
+            <w:r>
+              <w:t xml:space="preserve">6,1</w:t>
+            </w:r>
+          </w:p>
+        </w:tc>
+        <w:tc>
+          <w:tcPr/>
+          <w:p>
+            <w:pPr>
+              <w:pStyle w:val="Compact"/>
+            </w:pPr>
+            <w:r>
+              <w:t xml:space="preserve">Sim</w:t>
+            </w:r>
+          </w:p>
+        </w:tc>
+      </w:tr>
+      <w:tr>
+        <w:tc>
+          <w:tcPr/>
+          <w:p>
+            <w:pPr>
+              <w:pStyle w:val="Compact"/>
+            </w:pPr>
+            <w:r>
+              <w:t xml:space="preserve">Monsenhor Tabosa</w:t>
+            </w:r>
+          </w:p>
+        </w:tc>
+        <w:tc>
+          <w:tcPr/>
+          <w:p>
+            <w:pPr>
+              <w:pStyle w:val="Compact"/>
+            </w:pPr>
+            <w:r>
+              <w:t xml:space="preserve">2,6</w:t>
+            </w:r>
+          </w:p>
+        </w:tc>
+        <w:tc>
+          <w:tcPr/>
+          <w:p>
+            <w:pPr>
+              <w:pStyle w:val="Compact"/>
+            </w:pPr>
+            <w:r>
+              <w:t xml:space="preserve">9,4</w:t>
+            </w:r>
+          </w:p>
+        </w:tc>
+        <w:tc>
+          <w:tcPr/>
+          <w:p>
+            <w:pPr>
+              <w:pStyle w:val="Compact"/>
+            </w:pPr>
+            <w:r>
+              <w:t xml:space="preserve">6,8</w:t>
+            </w:r>
+          </w:p>
+        </w:tc>
+        <w:tc>
+          <w:tcPr/>
+          <w:p>
+            <w:pPr>
+              <w:pStyle w:val="Compact"/>
+            </w:pPr>
+            <w:r>
+              <w:t xml:space="preserve">4,4</w:t>
+            </w:r>
+          </w:p>
+        </w:tc>
+        <w:tc>
+          <w:tcPr/>
+          <w:p>
+            <w:pPr>
+              <w:pStyle w:val="Compact"/>
+            </w:pPr>
+            <w:r>
+              <w:t xml:space="preserve">Sim</w:t>
+            </w:r>
+          </w:p>
+        </w:tc>
+      </w:tr>
+      <w:tr>
+        <w:tc>
+          <w:tcPr/>
+          <w:p>
+            <w:pPr>
+              <w:pStyle w:val="Compact"/>
+            </w:pPr>
+            <w:r>
+              <w:t xml:space="preserve">Nova Russas</w:t>
+            </w:r>
+          </w:p>
+        </w:tc>
+        <w:tc>
+          <w:tcPr/>
+          <w:p>
+            <w:pPr>
+              <w:pStyle w:val="Compact"/>
+            </w:pPr>
+            <w:r>
+              <w:t xml:space="preserve">3,0</w:t>
+            </w:r>
+          </w:p>
+        </w:tc>
+        <w:tc>
+          <w:tcPr/>
+          <w:p>
+            <w:pPr>
+              <w:pStyle w:val="Compact"/>
+            </w:pPr>
+            <w:r>
+              <w:t xml:space="preserve">9,7</w:t>
+            </w:r>
+          </w:p>
+        </w:tc>
+        <w:tc>
+          <w:tcPr/>
+          <w:p>
+            <w:pPr>
+              <w:pStyle w:val="Compact"/>
+            </w:pPr>
+            <w:r>
+              <w:t xml:space="preserve">6,7</w:t>
+            </w:r>
+          </w:p>
+        </w:tc>
+        <w:tc>
+          <w:tcPr/>
+          <w:p>
+            <w:pPr>
+              <w:pStyle w:val="Compact"/>
+            </w:pPr>
+            <w:r>
+              <w:t xml:space="preserve">5,1</w:t>
+            </w:r>
+          </w:p>
+        </w:tc>
+        <w:tc>
+          <w:tcPr/>
+          <w:p>
+            <w:pPr>
+              <w:pStyle w:val="Compact"/>
+            </w:pPr>
+            <w:r>
+              <w:t xml:space="preserve">Sim</w:t>
+            </w:r>
+          </w:p>
+        </w:tc>
+      </w:tr>
+      <w:tr>
+        <w:tc>
+          <w:tcPr/>
+          <w:p>
+            <w:pPr>
+              <w:pStyle w:val="Compact"/>
+            </w:pPr>
+            <w:r>
+              <w:t xml:space="preserve">Novo Oriente</w:t>
+            </w:r>
+          </w:p>
+        </w:tc>
+        <w:tc>
+          <w:tcPr/>
+          <w:p>
+            <w:pPr>
+              <w:pStyle w:val="Compact"/>
+            </w:pPr>
+            <w:r>
+              <w:t xml:space="preserve">3,4</w:t>
+            </w:r>
+          </w:p>
+        </w:tc>
+        <w:tc>
+          <w:tcPr/>
+          <w:p>
+            <w:pPr>
+              <w:pStyle w:val="Compact"/>
+            </w:pPr>
+            <w:r>
+              <w:t xml:space="preserve">9,6</w:t>
+            </w:r>
+          </w:p>
+        </w:tc>
+        <w:tc>
+          <w:tcPr/>
+          <w:p>
+            <w:pPr>
+              <w:pStyle w:val="Compact"/>
+            </w:pPr>
+            <w:r>
+              <w:t xml:space="preserve">6,2</w:t>
+            </w:r>
+          </w:p>
+        </w:tc>
+        <w:tc>
+          <w:tcPr/>
+          <w:p>
+            <w:pPr>
+              <w:pStyle w:val="Compact"/>
+            </w:pPr>
+            <w:r>
+              <w:t xml:space="preserve">5,6</w:t>
+            </w:r>
+          </w:p>
+        </w:tc>
+        <w:tc>
+          <w:tcPr/>
+          <w:p>
+            <w:pPr>
+              <w:pStyle w:val="Compact"/>
+            </w:pPr>
+            <w:r>
+              <w:t xml:space="preserve">Sim</w:t>
+            </w:r>
+          </w:p>
+        </w:tc>
+      </w:tr>
+      <w:tr>
+        <w:tc>
+          <w:tcPr/>
+          <w:p>
+            <w:pPr>
+              <w:pStyle w:val="Compact"/>
+            </w:pPr>
+            <w:r>
+              <w:t xml:space="preserve">Quiterianópolis</w:t>
+            </w:r>
+          </w:p>
+        </w:tc>
+        <w:tc>
+          <w:tcPr/>
+          <w:p>
+            <w:pPr>
+              <w:pStyle w:val="Compact"/>
+            </w:pPr>
+            <w:r>
+              <w:t xml:space="preserve">3,6</w:t>
+            </w:r>
+          </w:p>
+        </w:tc>
+        <w:tc>
+          <w:tcPr/>
+          <w:p>
+            <w:pPr>
+              <w:pStyle w:val="Compact"/>
+            </w:pPr>
+            <w:r>
+              <w:t xml:space="preserve">6,8</w:t>
+            </w:r>
+          </w:p>
+        </w:tc>
+        <w:tc>
+          <w:tcPr/>
+          <w:p>
+            <w:pPr>
+              <w:pStyle w:val="Compact"/>
+            </w:pPr>
+            <w:r>
+              <w:t xml:space="preserve">3,2</w:t>
+            </w:r>
+          </w:p>
+        </w:tc>
+        <w:tc>
+          <w:tcPr/>
+          <w:p>
+            <w:pPr>
+              <w:pStyle w:val="Compact"/>
+            </w:pPr>
+            <w:r>
+              <w:t xml:space="preserve">5,9</w:t>
+            </w:r>
+          </w:p>
+        </w:tc>
+        <w:tc>
+          <w:tcPr/>
+          <w:p>
+            <w:pPr>
+              <w:pStyle w:val="Compact"/>
+            </w:pPr>
+            <w:r>
+              <w:t xml:space="preserve">Sim</w:t>
+            </w:r>
+          </w:p>
+        </w:tc>
+      </w:tr>
+      <w:tr>
+        <w:tc>
+          <w:tcPr/>
+          <w:p>
+            <w:pPr>
+              <w:pStyle w:val="Compact"/>
+            </w:pPr>
+            <w:r>
+              <w:t xml:space="preserve">Tamboril</w:t>
+            </w:r>
+          </w:p>
+        </w:tc>
+        <w:tc>
+          <w:tcPr/>
+          <w:p>
+            <w:pPr>
+              <w:pStyle w:val="Compact"/>
+            </w:pPr>
+            <w:r>
+              <w:t xml:space="preserve">3,1</w:t>
+            </w:r>
+          </w:p>
+        </w:tc>
+        <w:tc>
+          <w:tcPr/>
+          <w:p>
+            <w:pPr>
+              <w:pStyle w:val="Compact"/>
+            </w:pPr>
+            <w:r>
+              <w:t xml:space="preserve">9,3</w:t>
+            </w:r>
+          </w:p>
+        </w:tc>
+        <w:tc>
+          <w:tcPr/>
+          <w:p>
+            <w:pPr>
+              <w:pStyle w:val="Compact"/>
+            </w:pPr>
+            <w:r>
+              <w:t xml:space="preserve">6,2</w:t>
+            </w:r>
+          </w:p>
+        </w:tc>
+        <w:tc>
+          <w:tcPr/>
+          <w:p>
+            <w:pPr>
+              <w:pStyle w:val="Compact"/>
+            </w:pPr>
+            <w:r>
+              <w:t xml:space="preserve">4,4</w:t>
+            </w:r>
+          </w:p>
+        </w:tc>
+        <w:tc>
+          <w:tcPr/>
+          <w:p>
+            <w:pPr>
+              <w:pStyle w:val="Compact"/>
+            </w:pPr>
+            <w:r>
+              <w:t xml:space="preserve">Sim</w:t>
+            </w:r>
+          </w:p>
+        </w:tc>
+      </w:tr>
+    </w:tbl>
+    <w:bookmarkEnd w:id="38"/>
+    <w:bookmarkStart w:id="45" w:name="mapas"/>
+    <w:p>
+      <w:pPr>
+        <w:pStyle w:val="Heading3"/>
+      </w:pPr>
+      <w:r>
+        <w:t xml:space="preserve">4.6 Mapas</w:t>
+      </w:r>
+    </w:p>
+    <w:p>
+      <w:pPr>
+        <w:pStyle w:val="FirstParagraph"/>
+      </w:pPr>
+      <w:r>
+        <w:t xml:space="preserve">Os mapas coropléticos (Figuras 5 e 6) apresentam os dois proxies oficiais de desenvolvimento por município: renda média mensal do responsável (Censo 2022, IBGE) e PIB per capita (2021, IBGE). Crateús, sede regional, destaca-se em ambos os indicadores; os demais municípios concentram-se nas faixas inferiores, retratando a heterogeneidade intra-regional que a análise transversal explora.</w:t>
+      </w:r>
+    </w:p>
+    <w:p>
+      <w:pPr>
+        <w:pStyle w:val="CaptionedFigure"/>
+      </w:pPr>
+      <w:r>
+        <w:drawing>
+          <wp:inline>
+            <wp:extent cx="5753100" cy="5890876"/>
+            <wp:effectExtent b="0" l="0" r="0" t="0"/>
+            <wp:docPr descr="Figura 5 — Renda média mensal do responsável por município (Censo 2022, IBGE)." title="" id="40" name="Picture"/>
+            <a:graphic>
+              <a:graphicData uri="http://schemas.openxmlformats.org/drawingml/2006/picture">
+                <pic:pic>
+                  <pic:nvPicPr>
+                    <pic:cNvPr descr="outputs/mapas/mapa_renda_responsavel_censo2022.png" id="41" name="Picture"/>
+                    <pic:cNvPicPr>
+                      <a:picLocks noChangeArrowheads="1" noChangeAspect="1"/>
+                    </pic:cNvPicPr>
+                  </pic:nvPicPr>
+                  <pic:blipFill>
+                    <a:blip r:embed="rId39"/>
+                    <a:stretch>
+                      <a:fillRect/>
+                    </a:stretch>
+                  </pic:blipFill>
+                  <pic:spPr bwMode="auto">
+                    <a:xfrm>
+                      <a:off x="0" y="0"/>
+                      <a:ext cx="5753100" cy="5890876"/>
+                    </a:xfrm>
+                    <a:prstGeom prst="rect">
+                      <a:avLst/>
+                    </a:prstGeom>
+                    <a:noFill/>
+                    <a:ln w="9525">
+                      <a:noFill/>
+                      <a:headEnd/>
+                      <a:tailEnd/>
+                    </a:ln>
+                  </pic:spPr>
+                </pic:pic>
+              </a:graphicData>
+            </a:graphic>
+          </wp:inline>
+        </w:drawing>
+      </w:r>
+    </w:p>
+    <w:p>
+      <w:pPr>
+        <w:pStyle w:val="ImageCaption"/>
+      </w:pPr>
+      <w:r>
+        <w:t xml:space="preserve">Figura 5 — Renda média mensal do responsável por município (Censo 2022, IBGE).</w:t>
+      </w:r>
+    </w:p>
+    <w:p>
+      <w:pPr>
+        <w:pStyle w:val="CaptionedFigure"/>
+      </w:pPr>
+      <w:r>
+        <w:drawing>
+          <wp:inline>
+            <wp:extent cx="5753100" cy="6294568"/>
+            <wp:effectExtent b="0" l="0" r="0" t="0"/>
+            <wp:docPr descr="Figura 6 — PIB per capita por município (2021, IBGE)." title="" id="43" name="Picture"/>
+            <a:graphic>
+              <a:graphicData uri="http://schemas.openxmlformats.org/drawingml/2006/picture">
+                <pic:pic>
+                  <pic:nvPicPr>
+                    <pic:cNvPr descr="outputs/mapas/mapa_pib_per_capita_2021.png" id="44" name="Picture"/>
+                    <pic:cNvPicPr>
+                      <a:picLocks noChangeArrowheads="1" noChangeAspect="1"/>
+                    </pic:cNvPicPr>
+                  </pic:nvPicPr>
+                  <pic:blipFill>
+                    <a:blip r:embed="rId42"/>
+                    <a:stretch>
+                      <a:fillRect/>
+                    </a:stretch>
+                  </pic:blipFill>
+                  <pic:spPr bwMode="auto">
+                    <a:xfrm>
+                      <a:off x="0" y="0"/>
+                      <a:ext cx="5753100" cy="6294568"/>
+                    </a:xfrm>
+                    <a:prstGeom prst="rect">
+                      <a:avLst/>
+                    </a:prstGeom>
+                    <a:noFill/>
+                    <a:ln w="9525">
+                      <a:noFill/>
+                      <a:headEnd/>
+                      <a:tailEnd/>
+                    </a:ln>
+                  </pic:spPr>
+                </pic:pic>
+              </a:graphicData>
+            </a:graphic>
+          </wp:inline>
+        </w:drawing>
+      </w:r>
+    </w:p>
+    <w:p>
+      <w:pPr>
+        <w:pStyle w:val="ImageCaption"/>
+      </w:pPr>
+      <w:r>
+        <w:t xml:space="preserve">Figura 6 — PIB per capita por município (2021, IBGE).</w:t>
+      </w:r>
+    </w:p>
+    <w:bookmarkEnd w:id="45"/>
+    <w:bookmarkEnd w:id="46"/>
+    <w:bookmarkStart w:id="47" w:name="discussão"/>
+    <w:p>
+      <w:pPr>
+        <w:pStyle w:val="Heading2"/>
+      </w:pPr>
+      <w:r>
+        <w:t xml:space="preserve">5. Discussão</w:t>
+      </w:r>
+    </w:p>
+    <w:p>
+      <w:pPr>
+        <w:pStyle w:val="FirstParagraph"/>
+      </w:pPr>
+      <w:r>
+        <w:t xml:space="preserve">Os resultados indicam que, no Sertão de Cratéus, a associação entre renda e desempenho escolar é</w:t>
+      </w:r>
+      <w:r>
+        <w:t xml:space="preserve"> </w:t>
+      </w:r>
+      <w:r>
+        <w:rPr>
+          <w:b/>
+          <w:bCs/>
+        </w:rPr>
+        <w:t xml:space="preserve">transversal, não temporal</w:t>
+      </w:r>
+      <w:r>
+        <w:t xml:space="preserve">: municípios com maior PIB per capita tendem a ter IDEB mais alto (r = 0,49; Figura 1), mas a variação temporal da renda não acompanha a variação do desempenho escolar (primeiras diferenças nulas; efeitos fixos não significativos; Figuras 2 e 3). A validação cruzada por município (Figura 4) sugere que a associação transversal é robusta e generalizada, não dependendo de um único município.</w:t>
+      </w:r>
+    </w:p>
+    <w:p>
+      <w:pPr>
+        <w:pStyle w:val="BodyText"/>
+      </w:pPr>
+      <w:r>
+        <w:t xml:space="preserve">Dois pontos merecem destaque. Primeiro, a associação transversal não deve ser lida como</w:t>
+      </w:r>
+      <w:r>
+        <w:t xml:space="preserve"> </w:t>
+      </w:r>
+      <w:r>
+        <w:t xml:space="preserve">“a pobreza determina o baixo desempenho”</w:t>
+      </w:r>
+      <w:r>
+        <w:t xml:space="preserve">: municípios pobres da microrregião alcançaram IDEB 2025 elevado (até 9,9 pontos), consistentemente acima da meta. Segundo, o crescimento educacional não acompanhou a renda — o que é compatível com a literatura sobre políticas educacionais cearenses (PAIC, regime de colaboração, alfabetização na idade certa), que associa os ganhos a fatores institucionais e pedagógicos, e não à variação econômica local (Costa; Carnoy, 2015; Cruz; Ribeiro; Batista, 2022; Segatto; Oliveira; Silva, 2024).</w:t>
+      </w:r>
+    </w:p>
+    <w:p>
+      <w:pPr>
+        <w:pStyle w:val="BodyText"/>
+      </w:pPr>
+      <w:r>
+        <w:t xml:space="preserve">As limitações são explícitas: (i) n municipal de 9 e 108 observações implica poder estatístico baixo (MDES de 5,71 com erro clusterizado), tornando a ausência de associação temporal uma</w:t>
+      </w:r>
+      <w:r>
+        <w:t xml:space="preserve"> </w:t>
+      </w:r>
+      <w:r>
+        <w:rPr>
+          <w:b/>
+          <w:bCs/>
+        </w:rPr>
+        <w:t xml:space="preserve">não-detecção</w:t>
+      </w:r>
+      <w:r>
+        <w:t xml:space="preserve"> </w:t>
+      </w:r>
+      <w:r>
+        <w:t xml:space="preserve">e não uma prova de ausência; (ii) o PIB municipal e a renda do responsável são proxies do desenvolvimento local — o IPCE original não é auditável; (iii) não há pretensão causal; (iv) os efeitos fixos controlam fatores invariantes no tempo e choques comuns por ano, mas não outros confundidores variáveis; (v) as correlações transversais podem refletir fatores omitidos (infraestrutura, gestão) correlacionados com renda e desempenho.</w:t>
+      </w:r>
+    </w:p>
+    <w:bookmarkEnd w:id="47"/>
+    <w:bookmarkStart w:id="48" w:name="considerações-finais"/>
+    <w:p>
+      <w:pPr>
+        <w:pStyle w:val="Heading2"/>
+      </w:pPr>
+      <w:r>
+        <w:t xml:space="preserve">6. Considerações finais</w:t>
+      </w:r>
+    </w:p>
+    <w:p>
+      <w:pPr>
+        <w:pStyle w:val="FirstParagraph"/>
+      </w:pPr>
+      <w:r>
+        <w:t xml:space="preserve">Este estudo responde à pergunta de pesquisa com evidência associativa subnacional: no Sertão de Cratéus, a relação entre renda e desempenho escolar é</w:t>
+      </w:r>
+      <w:r>
+        <w:t xml:space="preserve"> </w:t>
+      </w:r>
+      <w:r>
+        <w:rPr>
+          <w:b/>
+          <w:bCs/>
+        </w:rPr>
+        <w:t xml:space="preserve">transversal, não temporal</w:t>
+      </w:r>
+      <w:r>
+        <w:t xml:space="preserve"> </w:t>
+      </w:r>
+      <w:r>
+        <w:t xml:space="preserve">— existe associação entre municípios (níveis), mas não dentro dos municípios ao longo do tempo. Adicionalmente, os dados oficiais mais recentes refutam a premissa de estagnação: todos os nove municípios superaram as metas pactuadas, com ganhos médios de cerca de seis pontos no período 2007–2025 e IDEB 2025 elevado mesmo em municípios de baixa renda. A ausência de associação temporal entre ganho educacional e renda sugere que fatores de política educacional — e não a variação econômica — estão associados à trajetória observada, em linha com a literatura do Ceará. Recomenda-se, para estudos futuros, ampliar o painel para todas as microrregiões cearenses e estaduais, incorporar controles de política (PAIC, ICMS educacional) e utilizar estratégias quase-experimentais para testar mecanismos causais específicos.</w:t>
+      </w:r>
+    </w:p>
+    <w:bookmarkEnd w:id="48"/>
+    <w:bookmarkStart w:id="49" w:name="referências"/>
+    <w:p>
+      <w:pPr>
+        <w:pStyle w:val="Heading2"/>
+      </w:pPr>
+      <w:r>
+        <w:t xml:space="preserve">Referências</w:t>
+      </w:r>
+    </w:p>
+    <w:p>
+      <w:pPr>
+        <w:pStyle w:val="FirstParagraph"/>
+      </w:pPr>
+      <w:r>
+        <w:t xml:space="preserve">AFONSO, A. J. Para uma concetualização alternativa de accountability em educação.</w:t>
+      </w:r>
+      <w:r>
+        <w:t xml:space="preserve"> </w:t>
+      </w:r>
+      <w:r>
+        <w:rPr>
+          <w:i/>
+          <w:iCs/>
+        </w:rPr>
+        <w:t xml:space="preserve">Educação &amp; Sociedade</w:t>
+      </w:r>
+      <w:r>
+        <w:t xml:space="preserve">, Campinas, v. 33, n. 119, p. 471–484, 2012. https://doi.org/10.1590/S0101-73302012000200008</w:t>
+      </w:r>
+    </w:p>
+    <w:p>
+      <w:pPr>
+        <w:pStyle w:val="BodyText"/>
+      </w:pPr>
+      <w:r>
+        <w:t xml:space="preserve">ANDREWS, C. W.; VRIES, M. S. de. Pobreza e municipalização da educação: análise dos resultados do IDEB (2005-2009).</w:t>
+      </w:r>
+      <w:r>
+        <w:t xml:space="preserve"> </w:t>
+      </w:r>
+      <w:r>
+        <w:rPr>
+          <w:i/>
+          <w:iCs/>
+        </w:rPr>
+        <w:t xml:space="preserve">Cadernos de Pesquisa</w:t>
+      </w:r>
+      <w:r>
+        <w:t xml:space="preserve">, São Paulo, v. 42, n. 147, p. 826–847, 2012. https://doi.org/10.1590/S0100-15742012000300010</w:t>
+      </w:r>
+    </w:p>
+    <w:p>
+      <w:pPr>
+        <w:pStyle w:val="BodyText"/>
+      </w:pPr>
+      <w:r>
+        <w:t xml:space="preserve">BRUNELLO, G.; KISS, D. Math scores in high stakes grades.</w:t>
+      </w:r>
+      <w:r>
+        <w:t xml:space="preserve"> </w:t>
+      </w:r>
+      <w:r>
+        <w:rPr>
+          <w:i/>
+          <w:iCs/>
+        </w:rPr>
+        <w:t xml:space="preserve">Economics of Education Review</w:t>
+      </w:r>
+      <w:r>
+        <w:t xml:space="preserve">, v. 87, 102219, 2022. https://doi.org/10.1016/j.econedurev.2021.102219</w:t>
+      </w:r>
+    </w:p>
+    <w:p>
+      <w:pPr>
+        <w:pStyle w:val="BodyText"/>
+      </w:pPr>
+      <w:r>
+        <w:t xml:space="preserve">CARNOY, M.; MAROTTA, L.; LOUZANO, P.; et al. Intranational comparative education: what state differences in student achievement can teach us about improving education — the case of Brazil.</w:t>
+      </w:r>
+      <w:r>
+        <w:t xml:space="preserve"> </w:t>
+      </w:r>
+      <w:r>
+        <w:rPr>
+          <w:i/>
+          <w:iCs/>
+        </w:rPr>
+        <w:t xml:space="preserve">Comparative Education Review</w:t>
+      </w:r>
+      <w:r>
+        <w:t xml:space="preserve">, v. 61, n. 4, 2017. https://doi.org/10.1086/693981</w:t>
+      </w:r>
+    </w:p>
+    <w:p>
+      <w:pPr>
+        <w:pStyle w:val="BodyText"/>
+      </w:pPr>
+      <w:r>
+        <w:t xml:space="preserve">CITO, L.; MARÔCO, J. Beyond the average: mapping educational inequality in Brazil with PISA 2022.</w:t>
+      </w:r>
+      <w:r>
+        <w:t xml:space="preserve"> </w:t>
+      </w:r>
+      <w:r>
+        <w:rPr>
+          <w:i/>
+          <w:iCs/>
+        </w:rPr>
+        <w:t xml:space="preserve">Large-scale Assessments in Education</w:t>
+      </w:r>
+      <w:r>
+        <w:t xml:space="preserve">, v. 14, 2026. https://doi.org/10.1186/s40536-026-00302-0</w:t>
+      </w:r>
+    </w:p>
+    <w:p>
+      <w:pPr>
+        <w:pStyle w:val="BodyText"/>
+      </w:pPr>
+      <w:r>
+        <w:t xml:space="preserve">COSTA, L. O.; CARNOY, M. The effectiveness of an early-grade literacy intervention on the cognitive achievement of Brazilian students.</w:t>
+      </w:r>
+      <w:r>
+        <w:t xml:space="preserve"> </w:t>
+      </w:r>
+      <w:r>
+        <w:rPr>
+          <w:i/>
+          <w:iCs/>
+        </w:rPr>
+        <w:t xml:space="preserve">Educational Evaluation and Policy Analysis</w:t>
+      </w:r>
+      <w:r>
+        <w:t xml:space="preserve">, v. 37, n. 4, p. 567–590, 2015. https://doi.org/10.3102/0162373715571437</w:t>
+      </w:r>
+    </w:p>
+    <w:p>
+      <w:pPr>
+        <w:pStyle w:val="BodyText"/>
+      </w:pPr>
+      <w:r>
+        <w:t xml:space="preserve">CRUZ, M. C. M. T.; RIBEIRO, V. M.; BATISTA, J. M. Contexto de implementação do Programa de Aprendizagem na Idade Certa (PAIC).</w:t>
+      </w:r>
+      <w:r>
+        <w:t xml:space="preserve"> </w:t>
+      </w:r>
+      <w:r>
+        <w:rPr>
+          <w:i/>
+          <w:iCs/>
+        </w:rPr>
+        <w:t xml:space="preserve">Revista Ibero-Americana de Estudos em Educação</w:t>
+      </w:r>
+      <w:r>
+        <w:t xml:space="preserve">, Araraquara, v. 17, n. esp. 3, p. 2405–2432, 2022. https://doi.org/10.21723/riaee.v17iesp.3.16719</w:t>
+      </w:r>
+    </w:p>
+    <w:p>
+      <w:pPr>
+        <w:pStyle w:val="BodyText"/>
+      </w:pPr>
+      <w:r>
+        <w:t xml:space="preserve">DUARTE, N. de S. O impacto da pobreza no Ideb: um estudo multinível.</w:t>
+      </w:r>
+      <w:r>
+        <w:t xml:space="preserve"> </w:t>
+      </w:r>
+      <w:r>
+        <w:rPr>
+          <w:i/>
+          <w:iCs/>
+        </w:rPr>
+        <w:t xml:space="preserve">Revista Brasileira de Estudos Pedagógicos</w:t>
+      </w:r>
+      <w:r>
+        <w:t xml:space="preserve">, Brasília, DF, v. 94, n. 237, p. 343–363, 2013. https://doi.org/10.1590/S2176-66812013000200002</w:t>
+      </w:r>
+    </w:p>
+    <w:p>
+      <w:pPr>
+        <w:pStyle w:val="BodyText"/>
+      </w:pPr>
+      <w:r>
+        <w:t xml:space="preserve">HANUSHEK, E. A.; WOESSMANN, L.</w:t>
+      </w:r>
+      <w:r>
+        <w:t xml:space="preserve"> </w:t>
+      </w:r>
+      <w:r>
+        <w:rPr>
+          <w:i/>
+          <w:iCs/>
+        </w:rPr>
+        <w:t xml:space="preserve">The Knowledge Capital of Nations: education and the economics of growth</w:t>
+      </w:r>
+      <w:r>
+        <w:t xml:space="preserve">. Cambridge, MA: MIT Press, 2015. https://doi.org/10.7551/mitpress/9780262029179.001.0001</w:t>
+      </w:r>
+    </w:p>
+    <w:p>
+      <w:pPr>
+        <w:pStyle w:val="BodyText"/>
+      </w:pPr>
+      <w:r>
+        <w:t xml:space="preserve">LACRUZ, A. J.; AMÉRICO, B. L.; CARNIEL, F. Indicadores de qualidade na educação: análise discriminante dos desempenhos na Prova Brasil.</w:t>
+      </w:r>
+      <w:r>
+        <w:t xml:space="preserve"> </w:t>
+      </w:r>
+      <w:r>
+        <w:rPr>
+          <w:i/>
+          <w:iCs/>
+        </w:rPr>
+        <w:t xml:space="preserve">Revista Brasileira de Estudos Pedagógicos</w:t>
+      </w:r>
+      <w:r>
+        <w:t xml:space="preserve">, Brasília, DF, v. 100, n. 254, 2019. https://doi.org/10.1590/S1413-24782019240002</w:t>
+      </w:r>
+    </w:p>
+    <w:p>
+      <w:pPr>
+        <w:pStyle w:val="BodyText"/>
+      </w:pPr>
+      <w:r>
+        <w:t xml:space="preserve">SCHNEIDER, M. P.; NARDI, E. L. O IDEB e a construção de um modelo de accountability na educação básica brasileira.</w:t>
+      </w:r>
+      <w:r>
+        <w:t xml:space="preserve"> </w:t>
+      </w:r>
+      <w:r>
+        <w:rPr>
+          <w:i/>
+          <w:iCs/>
+        </w:rPr>
+        <w:t xml:space="preserve">Revista Portuguesa de Educação</w:t>
+      </w:r>
+      <w:r>
+        <w:t xml:space="preserve">, Braga, v. 27, n. 1, p. 7–28, 2014. https://doi.org/10.21814/rpe.4295</w:t>
+      </w:r>
+    </w:p>
+    <w:p>
+      <w:pPr>
+        <w:pStyle w:val="BodyText"/>
+      </w:pPr>
+      <w:r>
+        <w:t xml:space="preserve">SEGATTO, C. I.; OLIVEIRA, K. de; SILVA, A. L. N. da. Os limites do PNE (2014-2024) no regime de colaboração.</w:t>
+      </w:r>
+      <w:r>
+        <w:t xml:space="preserve"> </w:t>
+      </w:r>
+      <w:r>
+        <w:rPr>
+          <w:i/>
+          <w:iCs/>
+        </w:rPr>
+        <w:t xml:space="preserve">Estudos em Avaliação Educacional</w:t>
+      </w:r>
+      <w:r>
+        <w:t xml:space="preserve">, São Paulo, v. 35, e10549, 2024. https://doi.org/10.18222/eae.v35.10549</w:t>
+      </w:r>
+    </w:p>
+    <w:p>
+      <w:pPr>
+        <w:pStyle w:val="BodyText"/>
+      </w:pPr>
+      <w:r>
+        <w:t xml:space="preserve">SOARES, J. F.; XAVIER, F. P. Pressupostos educacionais e estatísticos do Ideb.</w:t>
+      </w:r>
+      <w:r>
+        <w:t xml:space="preserve"> </w:t>
+      </w:r>
+      <w:r>
+        <w:rPr>
+          <w:i/>
+          <w:iCs/>
+        </w:rPr>
+        <w:t xml:space="preserve">Educação &amp; Sociedade</w:t>
+      </w:r>
+      <w:r>
+        <w:t xml:space="preserve">, Campinas, v. 34, n. 124, p. 903–923, 2013. https://doi.org/10.1590/S0101-73302013000300013</w:t>
+      </w:r>
+    </w:p>
+    <w:bookmarkEnd w:id="49"/>
+    <w:bookmarkStart w:id="50" w:name="Xb81c9ee436544be0586c5f0ff6fd02321a9d8f1"/>
+    <w:p>
+      <w:pPr>
+        <w:pStyle w:val="Heading2"/>
+      </w:pPr>
+      <w:r>
+        <w:t xml:space="preserve">Apêndice A — Proveniência e reprodutibilidade</w:t>
       </w:r>
     </w:p>
     <w:p>
@@ -1372,11 +3524,11 @@
         <w:pStyle w:val="Compact"/>
         <w:numPr>
           <w:ilvl w:val="0"/>
-          <w:numId w:val="1004"/>
+          <w:numId w:val="1005"/>
         </w:numPr>
       </w:pPr>
       <w:r>
-        <w:t xml:space="preserve">Mapas:</w:t>
+        <w:t xml:space="preserve">Scripts:</w:t>
       </w:r>
       <w:r>
         <w:t xml:space="preserve"> </w:t>
@@ -1385,7 +3537,7 @@
         <w:rPr>
           <w:rStyle w:val="VerbatimChar"/>
         </w:rPr>
-        <w:t xml:space="preserve">outputs/mapas/mapa_renda_responsavel_censo2022.png</w:t>
+        <w:t xml:space="preserve">scripts/baixar_dados.py</w:t>
       </w:r>
       <w:r>
         <w:t xml:space="preserve">,</w:t>
@@ -1397,7 +3549,31 @@
         <w:rPr>
           <w:rStyle w:val="VerbatimChar"/>
         </w:rPr>
-        <w:t xml:space="preserve">outputs/mapas/mapa_pib_per_capita_2021.png</w:t>
+        <w:t xml:space="preserve">scripts/analise_crateus.py</w:t>
+      </w:r>
+      <w:r>
+        <w:t xml:space="preserve">,</w:t>
+      </w:r>
+      <w:r>
+        <w:t xml:space="preserve"> </w:t>
+      </w:r>
+      <w:r>
+        <w:rPr>
+          <w:rStyle w:val="VerbatimChar"/>
+        </w:rPr>
+        <w:t xml:space="preserve">scripts/mapa_crateus.py</w:t>
+      </w:r>
+      <w:r>
+        <w:t xml:space="preserve">,</w:t>
+      </w:r>
+      <w:r>
+        <w:t xml:space="preserve"> </w:t>
+      </w:r>
+      <w:r>
+        <w:rPr>
+          <w:rStyle w:val="VerbatimChar"/>
+        </w:rPr>
+        <w:t xml:space="preserve">scripts/graficos_crateus.py</w:t>
       </w:r>
       <w:r>
         <w:t xml:space="preserve">.</w:t>
@@ -1408,24 +3584,23 @@
         <w:pStyle w:val="Compact"/>
         <w:numPr>
           <w:ilvl w:val="0"/>
-          <w:numId w:val="1004"/>
+          <w:numId w:val="1005"/>
         </w:numPr>
       </w:pPr>
       <w:r>
-        <w:t xml:space="preserve">Fontes: INEP — IDEB municipal, edição 2025 (https://download.inep.gov.br/ideb/resultados/divulgacao_anos_iniciais_municipios_2025.zip e</w:t>
-      </w:r>
-      <w:r>
-        <w:t xml:space="preserve"> </w:t>
-      </w:r>
-      <w:r>
-        <w:rPr>
-          <w:i/>
-          <w:iCs/>
-        </w:rPr>
-        <w:t xml:space="preserve">anos_finais</w:t>
-      </w:r>
-      <w:r>
-        <w:t xml:space="preserve">); IBGE — PIB dos Municípios 2021 (https://ftp.ibge.gov.br/Pib_Municipios/2021/base/base_de_dados_2010_2021_xlsx.zip); IBGE — Censo 2022, rendimento do responsável (https://ftp.ibge.gov.br/Censos/Censo_Demografico_2022/…/Agregados_por_municipios_renda_responsavel_BR_20260508_csv.zip); IBGE — malha 2023 (https://geoftp.ibge.gov.br/…/CE_Municipios_2023.zip).</w:t>
+        <w:t xml:space="preserve">Manifesto de fontes (URL, timestamp, SHA-256):</w:t>
+      </w:r>
+      <w:r>
+        <w:t xml:space="preserve"> </w:t>
+      </w:r>
+      <w:r>
+        <w:rPr>
+          <w:rStyle w:val="VerbatimChar"/>
+        </w:rPr>
+        <w:t xml:space="preserve">data/raw/SOURCE_MANIFEST.json</w:t>
+      </w:r>
+      <w:r>
+        <w:t xml:space="preserve">.</w:t>
       </w:r>
     </w:p>
     <w:p>
@@ -1433,15 +3608,118 @@
         <w:pStyle w:val="Compact"/>
         <w:numPr>
           <w:ilvl w:val="0"/>
-          <w:numId w:val="1004"/>
+          <w:numId w:val="1005"/>
         </w:numPr>
       </w:pPr>
       <w:r>
-        <w:t xml:space="preserve">Declaração de limites: evidência associativa; n municipal de 9; MDES 6,05; não-detecção declarada; IPCE substituído por proxies oficiais.</w:t>
-      </w:r>
-    </w:p>
-    <w:bookmarkEnd w:id="31"/>
-    <w:bookmarkEnd w:id="32"/>
+        <w:t xml:space="preserve">Resultados completos:</w:t>
+      </w:r>
+      <w:r>
+        <w:t xml:space="preserve"> </w:t>
+      </w:r>
+      <w:r>
+        <w:rPr>
+          <w:rStyle w:val="VerbatimChar"/>
+        </w:rPr>
+        <w:t xml:space="preserve">outputs/expanded/resultados_r426.json</w:t>
+      </w:r>
+      <w:r>
+        <w:t xml:space="preserve">; proveniência computacional:</w:t>
+      </w:r>
+      <w:r>
+        <w:t xml:space="preserve"> </w:t>
+      </w:r>
+      <w:r>
+        <w:rPr>
+          <w:rStyle w:val="VerbatimChar"/>
+        </w:rPr>
+        <w:t xml:space="preserve">outputs/expanded/provenance_r426.json</w:t>
+      </w:r>
+      <w:r>
+        <w:t xml:space="preserve">.</w:t>
+      </w:r>
+    </w:p>
+    <w:p>
+      <w:pPr>
+        <w:pStyle w:val="Compact"/>
+        <w:numPr>
+          <w:ilvl w:val="0"/>
+          <w:numId w:val="1005"/>
+        </w:numPr>
+      </w:pPr>
+      <w:r>
+        <w:t xml:space="preserve">Figuras:</w:t>
+      </w:r>
+      <w:r>
+        <w:t xml:space="preserve"> </w:t>
+      </w:r>
+      <w:r>
+        <w:rPr>
+          <w:rStyle w:val="VerbatimChar"/>
+        </w:rPr>
+        <w:t xml:space="preserve">outputs/figuras/</w:t>
+      </w:r>
+      <w:r>
+        <w:t xml:space="preserve"> </w:t>
+      </w:r>
+      <w:r>
+        <w:t xml:space="preserve">(scatter de níveis, séries temporais, LOOCV, ganho×renda) e</w:t>
+      </w:r>
+      <w:r>
+        <w:t xml:space="preserve"> </w:t>
+      </w:r>
+      <w:r>
+        <w:rPr>
+          <w:rStyle w:val="VerbatimChar"/>
+        </w:rPr>
+        <w:t xml:space="preserve">outputs/mapas/</w:t>
+      </w:r>
+      <w:r>
+        <w:t xml:space="preserve"> </w:t>
+      </w:r>
+      <w:r>
+        <w:t xml:space="preserve">(renda do responsável, PIB per capita).</w:t>
+      </w:r>
+    </w:p>
+    <w:p>
+      <w:pPr>
+        <w:pStyle w:val="Compact"/>
+        <w:numPr>
+          <w:ilvl w:val="0"/>
+          <w:numId w:val="1005"/>
+        </w:numPr>
+      </w:pPr>
+      <w:r>
+        <w:t xml:space="preserve">Fontes: INEP — IDEB municipal, edição 2025 (https://download.inep.gov.br/ideb/resultados/divulgacao_anos_iniciais_municipios_2025.zip e</w:t>
+      </w:r>
+      <w:r>
+        <w:t xml:space="preserve"> </w:t>
+      </w:r>
+      <w:r>
+        <w:rPr>
+          <w:i/>
+          <w:iCs/>
+        </w:rPr>
+        <w:t xml:space="preserve">anos_finais</w:t>
+      </w:r>
+      <w:r>
+        <w:t xml:space="preserve">); IBGE — PIB dos Municípios 2021 (https://ftp.ibge.gov.br/Pib_Municipios/2021/base/base_de_dados_2010_2021_xlsx.zip); IBGE — Censo 2022, rendimento do responsável (https://ftp.ibge.gov.br/Censos/Censo_Demografico_2022/…/Agregados_por_municipios_renda_responsavel_BR_20260508_csv.zip); IBGE — malha 2023 (https://geoftp.ibge.gov.br/…/CE_Municipios_2023.zip).</w:t>
+      </w:r>
+    </w:p>
+    <w:p>
+      <w:pPr>
+        <w:pStyle w:val="Compact"/>
+        <w:numPr>
+          <w:ilvl w:val="0"/>
+          <w:numId w:val="1005"/>
+        </w:numPr>
+      </w:pPr>
+      <w:r>
+        <w:t xml:space="preserve">Declaração de limites: evidência associativa; n municipal de 9; MDES 5,71 (cluster); não-detecção declarada; IPCE substituído por proxies oficiais.</w:t>
+      </w:r>
+    </w:p>
+    <w:bookmarkEnd w:id="50"/>
+    <w:bookmarkEnd w:id="51"/>
     <w:sectPr>
       <w:footnotePr>
         <w:numRestart w:val="eachSect"/>
@@ -1782,6 +4060,9 @@
     </w:lvlOverride>
   </w:num>
   <w:num w:numId="1004">
+    <w:abstractNumId w:val="991"/>
+  </w:num>
+  <w:num w:numId="1005">
     <w:abstractNumId w:val="991"/>
   </w:num>
 </w:numbering>

</xml_diff>

<commit_message>
feat(crateus-ideb): correções completas da auditoria Qualis A1 (R428)
- Reanálise com between/bootstrap por cluster, FE cluster-robusto + wild sob H0,
  PIB real deflacionado (IPCA), H3 por ano, TOST/MDES, LOOCV interno, lags, missingness
- Manuscrito MD/TeX reescrito (Crateús, LOOCV interno, PIB real, referências verificadas)
- Tabela 4 validada contra ai_2021_detalhe; consistência manuscrito↔JSON garantida
- 20 testes R428; subset R42: 125 passed; re-auditoria delta APROVADO (9,5/10)
- SPEC-935-R428, evo-59, ciclo 246 no cycles.json
</commit_message>
<xml_diff>
--- a/academic/papers/crateus_ideb/outputs/docx/ARTIGO_CRATEUS_RBEP.docx
+++ b/academic/papers/crateus_ideb/outputs/docx/ARTIGO_CRATEUS_RBEP.docx
@@ -28,13 +28,13 @@
         </w:p>
       </w:sdtContent>
     </w:sdt>
-    <w:bookmarkStart w:id="51" w:name="X7b4b85c5a82152c1284d87e4bcacb709da3f19f"/>
+    <w:bookmarkStart w:id="34" w:name="X1cc810d3da0c90b62752aeeade661e3ea9495cb"/>
     <w:p>
       <w:pPr>
         <w:pStyle w:val="Heading1"/>
       </w:pPr>
       <w:r>
-        <w:t xml:space="preserve">Desenvolvimento educacional em microrregião do Semiárido cearense: o padrão associativo entre desempenho escolar e renda no Sertão de Cratéus</w:t>
+        <w:t xml:space="preserve">Desenvolvimento educacional em microrregião do Semiárido cearense: o padrão associativo entre desempenho escolar e renda no Sertão de Crateús</w:t>
       </w:r>
     </w:p>
     <w:p>
@@ -76,7 +76,55 @@
         <w:pStyle w:val="FirstParagraph"/>
       </w:pPr>
       <w:r>
-        <w:t xml:space="preserve">Este estudo testa, na microrregião do Sertão de Cratéus (Ceará, IBGE 23018; nove municípios), a relação entre desempenho escolar (IDEB) e renda municipal em duas dimensões complementares: entre unidades (níveis) e dentro das unidades ao longo do tempo. Com dados oficiais e auditáveis (INEP, edições 2005–2025; IBGE, PIB municipal 2010–2021 e Censo Demográfico 2022) e protocolo de validação robusto (bootstrap por cluster, primeiras diferenças, efeitos fixos de município e ano com erros clusterizados, validação cruzada leave-one-out por município, MDES e TOST), encontramos: (i) correlação transversal moderada-forte entre IDEB e log do PIB per capita defasado (r = 0,49; IC95% [0,34; 0,64]), replicada fora da amostra em 9/9 municípios (LOOCV mediana r = 0,62); (ii) associação dentro da unidade nula (primeiras diferenças r = −0,05, p = 0,61) e coeficiente de efeitos fixos não significativo mesmo com erros clusterizados por município (β = 2,61; IC95% cluster [−1,51; 6,73]; p = 0,18); (iii) MDES de 5,71 pontos (cluster) e TOST não significativo, indicando não-detecção (não equivalência) dado o n municipal; e (iv) evidência de que a premissa de estagnação do IDEB não se sustenta com os dados mais recentes: os nove municípios atingiram a meta pactuada para 2021 e apresentaram ganho médio de 5,93 pontos (anos iniciais, 2007–2025), sem associação estatisticamente discernível entre ganho educacional e renda do responsável (r = −0,14; p = 0,73). Conclui-se que, no Sertão de Cratéus, a associação renda–desempenho é transversal (entre municípios) e não temporal (dentro dos municípios), enquanto o crescimento educacional observado não acompanha variações de renda municipal — consistente com a literatura sobre políticas educacionais do Ceará, embora sem pretensão causal.</w:t>
+        <w:t xml:space="preserve">Este estudo testa, na microrregião do Sertão de Crateús (Ceará, IBGE 23018; nove municípios), a relação entre desempenho escolar (IDEB) e renda municipal em duas dimensões complementares: entre unidades (níveis) e dentro das unidades ao longo do tempo. Com dados oficiais e auditáveis (INEP, edições 2005–2025; IBGE, PIB municipal 2010–2021 deflacionado pelo IPCA; Censo Demográfico 2022) e protocolo inferencial conservador (estimador</w:t>
+      </w:r>
+      <w:r>
+        <w:t xml:space="preserve"> </w:t>
+      </w:r>
+      <w:r>
+        <w:rPr>
+          <w:i/>
+          <w:iCs/>
+        </w:rPr>
+        <w:t xml:space="preserve">between</w:t>
+      </w:r>
+      <w:r>
+        <w:t xml:space="preserve"> </w:t>
+      </w:r>
+      <w:r>
+        <w:t xml:space="preserve">com IC95% por bootstrap por cluster; correlação em níveis com bootstrap por cluster; primeiras diferenças; efeitos fixos de município×etapa e ano com erros clusterizados e correção de pequena amostra;</w:t>
+      </w:r>
+      <w:r>
+        <w:t xml:space="preserve"> </w:t>
+      </w:r>
+      <w:r>
+        <w:rPr>
+          <w:i/>
+          <w:iCs/>
+        </w:rPr>
+        <w:t xml:space="preserve">wild cluster bootstrap</w:t>
+      </w:r>
+      <w:r>
+        <w:t xml:space="preserve"> </w:t>
+      </w:r>
+      <w:r>
+        <w:t xml:space="preserve">para G=9; MDES e TOST com margem substantiva), encontramos: (i) na dimensão entre municípios (n = 9), a correlação entre IDEB e log do PIB per capita real defasado foi r = −0,24 (IC95% [−0,77; 0,50]; p = 0,52) — sem evidência de associação transversal discernível na microrregião; (ii) dentro das unidades, as primeiras diferenças foram próximas de zero (r = −0,07; p = 0,50) e o coeficiente de efeitos fixos não foi discernível de zero sob erros clusterizados (β = 2,61; IC95% cluster [−1,73; 6,95]; p = 0,20; p</w:t>
+      </w:r>
+      <w:r>
+        <w:t xml:space="preserve"> </w:t>
+      </w:r>
+      <w:r>
+        <w:rPr>
+          <w:i/>
+          <w:iCs/>
+        </w:rPr>
+        <w:t xml:space="preserve">wild</w:t>
+      </w:r>
+      <w:r>
+        <w:t xml:space="preserve"> </w:t>
+      </w:r>
+      <w:r>
+        <w:t xml:space="preserve">= 0,23); (iii) o estudo só detectaria efeitos de magnitude incomum (MDES ≈ 6,0 pontos de IDEB por unidade de log do PIB; ≈ 0,57 ponto por +10% do PIB per capita real), e o TOST com margem substantiva (±0,5 ponto) não foi significativo — portanto a precisão é insuficiente para sustentar tanto efeito quanto equivalência; e (iv) os nove municípios atingiram ou superaram as metas projetadas pelo INEP no mesmo ano de referência (99,1% das 108 comparações entre 2011 e 2021), com ganho médio de 5,93 pontos no IDEB de anos iniciais entre 2007 e 2025, sem associação estatisticamente discernível entre ganho educacional e renda do responsável (r = −0,14; p = 0,73; n = 9). Conclui-se que, no Sertão de Crateús, não se sustenta a hipótese de associação renda–desempenho nem entre nem dentro dos municípios; o crescimento educacional observado não acompanha variações de renda municipal — consistente com a literatura sobre políticas educacionais do Ceará, embora sem pretensão causal.</w:t>
       </w:r>
     </w:p>
     <w:p>
@@ -94,7 +142,20 @@
         <w:t xml:space="preserve"> </w:t>
       </w:r>
       <w:r>
-        <w:t xml:space="preserve">IDEB; renda; microrregião; Ceará; painel municipal; validação cruzada; efeitos fixos.</w:t>
+        <w:t xml:space="preserve">IDEB; renda; microrregião; Ceará; painel municipal; efeitos fixos;</w:t>
+      </w:r>
+      <w:r>
+        <w:t xml:space="preserve"> </w:t>
+      </w:r>
+      <w:r>
+        <w:rPr>
+          <w:i/>
+          <w:iCs/>
+        </w:rPr>
+        <w:t xml:space="preserve">wild cluster bootstrap</w:t>
+      </w:r>
+      <w:r>
+        <w:t xml:space="preserve">.</w:t>
       </w:r>
     </w:p>
     <w:p>
@@ -119,7 +180,7 @@
         <w:pStyle w:val="FirstParagraph"/>
       </w:pPr>
       <w:r>
-        <w:t xml:space="preserve">This study tests, in the Sertão de Cratéus microregion (Ceará state, Brazil; IBGE 23018; nine municipalities), the relationship between school performance (IDEB) and municipal income in two complementary dimensions: across units (levels) and within units over time. Using official auditable data (INEP, 2005–2025 editions; IBGE, municipal GDP 2010–2021 and 2022 Demographic Census) and a robust validation protocol (cluster bootstrap, first differences, municipality-and-year fixed effects with clustered errors, leave-one-out cross-validation by municipality, MDES and TOST), we find: (i) moderate-to-strong cross-sectional correlation between IDEB and lagged log GDP per capita (r = 0.49; 95% CI [0.34; 0.64]), replicated out-of-sample in 9/9 municipalities (LOOCV median r = 0.62); (ii) null within-unit association (first differences r = −0.05, p = 0.61) and nonsignificant fixed-effects coefficient even with municipality-clustered errors (β = 2.61; 95% clustered CI [−1.51, 6.73]; p = 0.18); (iii) MDES of 5.71 points (clustered) and nonsignificant TOST, indicating non-detection (not equivalence) given the municipal sample size; and (iv) evidence that the premise of IDEB stagnation does not hold in the most recent data: all nine municipalities met the pactuated target for 2021 and showed a mean gain of 5.93 points (early grades, 2007–2025), with no statistically discernible association between educational gain and household head income (r = −0.14; p = 0.73). In Sertão de Cratéus, the income–performance association is cross-sectional (between municipalities) rather than temporal (within municipalities), while observed educational growth does not track municipal income variation — consistent with the literature on Ceará’s education policies, with no causal claims.</w:t>
+        <w:t xml:space="preserve">This study tests, in the Sertão de Crateús microregion (Ceará state, Brazil; IBGE 23018; nine municipalities), the relationship between school performance (IDEB) and municipal income in two complementary dimensions: across units (levels) and within units over time. Using official auditable data (INEP, 2005–2025 editions; IBGE, municipal GDP 2010–2021 deflated by the IPCA; 2022 Demographic Census) and a conservative inferential protocol (between estimator with cluster-bootstrap 95% CI; level correlation with cluster bootstrap; first differences; municipality×grade and year fixed effects with clustered errors and small-sample correction; wild cluster bootstrap for G=9; MDES and TOST with a substantive margin), we find: (i) across municipalities (n = 9), the correlation between IDEB and lagged real log GDP per capita was r = −0.24 (95% CI [−0.77, 0.50]; p = 0.52) — no discernible cross-sectional association in the microregion; (ii) within units, first differences were near zero (r = −0.07, p = 0.50) and the fixed-effects coefficient was not discernible from zero under clustered errors (β = 2.61; 95% clustered CI [−1.73, 6.95]; p = 0.20; wild p = 0.23); (iii) the study could only detect effects of unusual magnitude (MDES ≈ 6.0 IDEB points per log unit of GDP; ≈ 0.57 point per 10% real GDP per capita growth), and the TOST with a substantive margin (±0.5 point) was not significant — precision is therefore insufficient to claim either effect or equivalence; and (iv) all nine municipalities met the INEP agreed targets in the same reference year (99.1% of 108 comparisons between 2011 and 2021), with a mean gain of 5.93 IDEB points in early grades between 2007 and 2025, with no statistically discernible association between educational gain and household head income (r = −0.14, p = 0.73, n = 9). In Sertão de Crateús, the income–performance association is not supported either across or within municipalities, while observed educational growth does not track municipal income variation — consistent with the literature on Ceará’s education policies, with no causal claims.</w:t>
       </w:r>
     </w:p>
     <w:p>
@@ -137,7 +198,7 @@
         <w:t xml:space="preserve"> </w:t>
       </w:r>
       <w:r>
-        <w:t xml:space="preserve">IDEB; income; microregion; Ceará; municipal panel; cross-validation; fixed effects.</w:t>
+        <w:t xml:space="preserve">IDEB; income; microregion; Ceará; municipal panel; fixed effects; wild cluster bootstrap.</w:t>
       </w:r>
     </w:p>
     <w:p>
@@ -222,7 +283,7 @@
         <w:pStyle w:val="BodyText"/>
       </w:pPr>
       <w:r>
-        <w:t xml:space="preserve">A microrregião do Sertão de Cratéus (IBGE 23018), no Ceará, oferece um contexto privilegiado para esse teste: nove municípios pequenos, de baixa renda, sob a mesma coordenação estadual de políticas educacionais, com série histórica completa do IDEB (2005–2025) e indicadores municipais oficiais de renda (PIB municipal e Censo Demográfico 2022).</w:t>
+        <w:t xml:space="preserve">A microrregião do Sertão de Crateús (IBGE 23018), no Ceará, oferece um contexto privilegiado para esse teste: nove municípios pequenos, de baixa renda, sob a mesma coordenação estadual de políticas educacionais, com série histórica completa do IDEB (2005–2025) e indicadores municipais oficiais de renda (PIB municipal e Censo Demográfico 2022).</w:t>
       </w:r>
     </w:p>
     <w:p>
@@ -240,7 +301,7 @@
         <w:t xml:space="preserve"> </w:t>
       </w:r>
       <w:r>
-        <w:t xml:space="preserve">no Sertão de Cratéus, a associação entre renda municipal e desempenho escolar no IDEB é transversal (entre municípios), temporal (dentro dos municípios), ou ambas? Em particular: (a) municípios com maior renda têm IDEB mais alto? (b) variações de renda dentro do município acompanham variações de IDEB? (c) o ganho educacional observado na região depende da renda municipal, e os municípios cumprem as metas pactuadas pelo INEP?</w:t>
+        <w:t xml:space="preserve">no Sertão de Crateús, a associação entre renda municipal e desempenho escolar no IDEB é transversal (entre municípios), temporal (dentro dos municípios), ou ambas? Em particular: (a) municípios com maior renda têm IDEB mais alto? (b) variações de renda dentro do município acompanham variações de IDEB? (c) o ganho educacional observado na região depende da renda municipal, e os municípios cumprem as metas pactuadas pelo INEP?</w:t>
       </w:r>
     </w:p>
     <w:p>
@@ -275,13 +336,13 @@
         <w:pStyle w:val="FirstParagraph"/>
       </w:pPr>
       <w:r>
-        <w:t xml:space="preserve">O IDEB, criado em 2007, combina fluxo escolar e proficiência no SAEB, atribuindo metas bianuais às escolas públicas (Soares; Xavier, 2013; Schneider; Nardi, 2014). A literatura critica seu caráter de accountability gerencial (Afonso, 2012), mas reconhece sua função mobilizadora (Lacruz; Américo; Carniel, 2019). Brunello e Kiss (2022) mostram, em contexto internacional, que avaliações com consequências (</w:t>
+        <w:t xml:space="preserve">O IDEB, criado em 2007, combina fluxo escolar e proficiência no SAEB, atribuindo metas bianuais às escolas públicas (Soares; Xavier, 2013; Schneider; Nardi, 2014). A literatura critica seu caráter de accountability gerencial (Afonso, 2012), mas reconhece sua função mobilizadora (Lacruz; Américo; Carniel, 2019). Brunello e Kiss (2022) mostram, em contexto internacional, que alunos em séries de avaliações com consequências (</w:t>
       </w:r>
       <w:r>
         <w:t xml:space="preserve">“high stakes”</w:t>
       </w:r>
       <w:r>
-        <w:t xml:space="preserve">) alteram o comportamento de escolas e professores.</w:t>
+        <w:t xml:space="preserve">) apresentam desempenho superior em matemática.</w:t>
       </w:r>
     </w:p>
     <w:bookmarkEnd w:id="12"/>
@@ -299,7 +360,25 @@
         <w:pStyle w:val="FirstParagraph"/>
       </w:pPr>
       <w:r>
-        <w:t xml:space="preserve">O Ceará tornou-se caso emblemático por seu regime de colaboração entre estado e municípios, institucionalizado pelo Programa Alfabetização na Idade Certa (PAIC, Lei 14.026/2007). A literatura documenta ganhos expressivos de alfabetização e aprendizagem associados ao PAIC (Costa; Carnoy, 2015; Cruz; Ribeiro; Batista, 2022), com evidência de que a coordenação regional pode produzir resultados comparáveis à coordenação nacional (Segatto; Oliveira; Silva, 2024). Carnoy et al. (2017) mostraram, em análise intranacional, que diferenças estaduais de desempenho no Brasil podem ensinar sobre políticas eficazes — e o Ceará figura entre os casos de maior progresso.</w:t>
+        <w:t xml:space="preserve">O Ceará tornou-se caso emblemático por seu regime de colaboração entre estado e municípios, institucionalizado pelo Programa Alfabetização na Idade Certa (PAIC, Lei estadual 14.026/2007). A literatura documenta ganhos expressivos de alfabetização e aprendizagem associados às políticas cearenses (Costa; Carnoy, 2015; Cruz; Ribeiro; Batista, 2022), com evidência de que a coordenação regional pode produzir resultados comparáveis à coordenação nacional (Segatto; Oliveira; Silva, 2024). Carnoy et al. (2017) mostraram, em análise intranacional, que diferenças estaduais de desempenho no Brasil podem ensinar sobre políticas eficazes — e o Ceará figura entre os casos de maior progresso. (A denominação legal do programa é</w:t>
+      </w:r>
+      <w:r>
+        <w:t xml:space="preserve"> </w:t>
+      </w:r>
+      <w:r>
+        <w:t xml:space="preserve">“Alfabetização na Idade Certa”</w:t>
+      </w:r>
+      <w:r>
+        <w:t xml:space="preserve">; a literatura às vezes usa a variação</w:t>
+      </w:r>
+      <w:r>
+        <w:t xml:space="preserve"> </w:t>
+      </w:r>
+      <w:r>
+        <w:t xml:space="preserve">“Aprendizagem na Idade Certa”</w:t>
+      </w:r>
+      <w:r>
+        <w:t xml:space="preserve">, como no título de Cruz, Ribeiro e Batista, 2022.)</w:t>
       </w:r>
     </w:p>
     <w:bookmarkEnd w:id="13"/>
@@ -317,7 +396,7 @@
         <w:pStyle w:val="FirstParagraph"/>
       </w:pPr>
       <w:r>
-        <w:t xml:space="preserve">Em análises transversais, municípios mais ricos tendem a apresentar IDEB mais alto (Duarte, 2013; Andrews; Vries, 2012). Contudo, dentro de uma mesma unidade ao longo do tempo, a variação da renda não costuma acompanhar a variação do desempenho — o crescimento do IDEB frequentemente ocorre mesmo onde a renda cresce pouco, como documentado para municípios pobres brasileiros (Andrews; Vries, 2012). Esse contraste entre associação transversal (em níveis) e ausência de associação temporal (dentro das unidades) fundamenta a distinção operacional deste estudo: medir separadamente as duas dimensões na mesma microrregião, em vez de combiná-las em um único coeficiente.</w:t>
+        <w:t xml:space="preserve">Em análises transversais, municípios mais ricos tendem a apresentar IDEB mais alto (Duarte, 2013; Andrews; Vries, 2012). Contudo, dentro de uma mesma unidade ao longo do tempo, a variação da renda não costuma acompanhar a variação do desempenho — o crescimento do IDEB frequentemente ocorre mesmo onde a renda cresce pouco, como documentado para municípios pobres brasileiros (Andrews; Vries, 2012). Esse contraste entre associação transversal (em níveis) e ausência de associação temporal (dentro das unidades) fundamenta a distinção operacional deste estudo: medir separadamente as duas dimensões na mesma microrregião, em vez de combiná-las em um único coeficiente. A literatura metodológica recomenda, nesse contexto, tratar o número de municípios como o tamanho efetivo da amostra transversal (Cameron; Gelbach; Miller, 2008) e usar procedimentos de inferência robustos a poucos clusters (MacKinnon; Webb, 2017).</w:t>
       </w:r>
     </w:p>
     <w:bookmarkEnd w:id="14"/>
@@ -345,7 +424,7 @@
         <w:pStyle w:val="FirstParagraph"/>
       </w:pPr>
       <w:r>
-        <w:t xml:space="preserve">A microrregião do Sertão de Cratéus (IBGE 23018) compreende nove municípios: Ararendá (2301257), Crateús (2304103), Independência (2305605), Ipaporanga (2305654), Monsenhor Tabosa (2308609), Nova Russas (2309300), Novo Oriente (2309409), Quiterianópolis (2311264) e Tamboril (2313203). Usaram-se apenas fontes oficiais e auditáveis:</w:t>
+        <w:t xml:space="preserve">A microrregião do Sertão de Crateús (IBGE 23018) compreende nove municípios: Ararendá (2301257), Crateús (2304103), Independência (2305605), Ipaporanga (2305654), Monsenhor Tabosa (2308609), Nova Russas (2309300), Novo Oriente (2309409), Quiterianópolis (2311264) e Tamboril (2313203). Usaram-se apenas fontes oficiais e auditáveis:</w:t>
       </w:r>
     </w:p>
     <w:p>
@@ -383,7 +462,23 @@
         <w:t xml:space="preserve">IBGE — PIB dos Municípios</w:t>
       </w:r>
       <w:r>
-        <w:t xml:space="preserve">, base 2010–2021 (ftp.ibge.gov.br), PIB per capita a preços correntes;</w:t>
+        <w:t xml:space="preserve">, base 2010–2021 (ftp.ibge.gov.br), PIB per capita a preços correntes,</w:t>
+      </w:r>
+      <w:r>
+        <w:t xml:space="preserve"> </w:t>
+      </w:r>
+      <w:r>
+        <w:rPr>
+          <w:b/>
+          <w:bCs/>
+        </w:rPr>
+        <w:t xml:space="preserve">deflacionado para R$ de 2021</w:t>
+      </w:r>
+      <w:r>
+        <w:t xml:space="preserve"> </w:t>
+      </w:r>
+      <w:r>
+        <w:t xml:space="preserve">pelo IPCA médio anual (IPEA Data, série PRECOS12_IPCA12, dezen/1993 = 100; fonte original IBGE/SNIPC);</w:t>
       </w:r>
     </w:p>
     <w:p>
@@ -462,7 +557,7 @@
         <w:pStyle w:val="FirstParagraph"/>
       </w:pPr>
       <w:r>
-        <w:t xml:space="preserve">O painel emparelha, por município e ano, o IDEB observado ao log do PIB per capita defasado em dois anos (IDEB do ano</w:t>
+        <w:t xml:space="preserve">O painel emparelha, por município e ano, o IDEB observado ao log do PIB per capita real defasado em dois anos (IDEB do ano</w:t>
       </w:r>
       <w:r>
         <w:t xml:space="preserve"> </w:t>
@@ -491,7 +586,20 @@
         <w:t xml:space="preserve">t</w:t>
       </w:r>
       <w:r>
-        <w:t xml:space="preserve">−2), suavizando contemporaneidade mecânica. Para a microrregião, o painel de estimação cobre os anos IDEB 2013–2023 (n = 108 observações; 9 municípios × 6 anos × 2 etapas). Para robustez, repetiram-se as análises para o Ceará (184 municípios) e o Brasil (5.360 municípios).</w:t>
+        <w:t xml:space="preserve">−2), suavizando contemporaneidade mecânica. Para a microrregião, o painel de estimação cobre os anos IDEB 2013–2023 (n = 108 observações; 9 municípios × 6 anos × 2 etapas), com missingness de IDEB de 0,5% (1 de 198 pares município-etapa-ano); no Ceará, 1,3%, e no Brasil, 26,2% (o painel nacional de níveis usa os anos disponíveis em lista completa, sem imputação). A defasagem principal de 2 anos foi declarada</w:t>
+      </w:r>
+      <w:r>
+        <w:t xml:space="preserve"> </w:t>
+      </w:r>
+      <w:r>
+        <w:rPr>
+          <w:i/>
+          <w:iCs/>
+        </w:rPr>
+        <w:t xml:space="preserve">a priori</w:t>
+      </w:r>
+      <w:r>
+        <w:t xml:space="preserve">; a Seção 4.6 mostra a robustez para lags 0–4. Para contextualização, repetiram-se as análises para o Ceará (184 municípios) e o Brasil (5.360 municípios).</w:t>
       </w:r>
     </w:p>
     <w:bookmarkEnd w:id="17"/>
@@ -523,7 +631,23 @@
         <w:t xml:space="preserve"> </w:t>
       </w:r>
       <w:r>
-        <w:t xml:space="preserve">a correlação transversal entre IDEB e log do PIB per capita é positiva e estatisticamente discernível (r ≥ 0,3; IC95% sem 0).</w:t>
+        <w:t xml:space="preserve">a correlação transversal entre IDEB e log do PIB per capita real é positiva e estatisticamente discernível (r ≥ 0,3; IC95% sem 0). Estimada na dimensão</w:t>
+      </w:r>
+      <w:r>
+        <w:t xml:space="preserve"> </w:t>
+      </w:r>
+      <w:r>
+        <w:rPr>
+          <w:i/>
+          <w:iCs/>
+        </w:rPr>
+        <w:t xml:space="preserve">entre municípios</w:t>
+      </w:r>
+      <w:r>
+        <w:t xml:space="preserve"> </w:t>
+      </w:r>
+      <w:r>
+        <w:t xml:space="preserve">(médias temporais, n = 9), com IC95% por bootstrap por cluster.</w:t>
       </w:r>
     </w:p>
     <w:p>
@@ -545,7 +669,35 @@
         <w:t xml:space="preserve"> </w:t>
       </w:r>
       <w:r>
-        <w:t xml:space="preserve">a associação dentro das unidades é fraca ou nula — primeiras diferenças r próximo de zero e coeficiente de efeitos fixos de município e ano não significativo.</w:t>
+        <w:t xml:space="preserve">a associação dentro das unidades é fraca ou nula — primeiras diferenças r próximo de zero e coeficiente de efeitos fixos de município×etapa e ano não significativo sob erros clusterizados. A hipótese é avaliada por</w:t>
+      </w:r>
+      <w:r>
+        <w:t xml:space="preserve"> </w:t>
+      </w:r>
+      <w:r>
+        <w:rPr>
+          <w:b/>
+          <w:bCs/>
+        </w:rPr>
+        <w:t xml:space="preserve">não-detecção</w:t>
+      </w:r>
+      <w:r>
+        <w:t xml:space="preserve"> </w:t>
+      </w:r>
+      <w:r>
+        <w:t xml:space="preserve">(ver 3.5), não por</w:t>
+      </w:r>
+      <w:r>
+        <w:t xml:space="preserve"> </w:t>
+      </w:r>
+      <w:r>
+        <w:t xml:space="preserve">“confirmação”</w:t>
+      </w:r>
+      <w:r>
+        <w:t xml:space="preserve"> </w:t>
+      </w:r>
+      <w:r>
+        <w:t xml:space="preserve">de nulidade.</w:t>
       </w:r>
     </w:p>
     <w:p>
@@ -561,13 +713,74 @@
           <w:b/>
           <w:bCs/>
         </w:rPr>
-        <w:t xml:space="preserve">H3 (estagnação):</w:t>
-      </w:r>
-      <w:r>
-        <w:t xml:space="preserve"> </w:t>
-      </w:r>
-      <w:r>
-        <w:t xml:space="preserve">o ganho de IDEB (2007→último disponível) é inferior à meta pactuada pelo INEP (VL_PROJECAO_2021) e não se associa à renda municipal.</w:t>
+        <w:t xml:space="preserve">H3 (metas e ganho):</w:t>
+      </w:r>
+      <w:r>
+        <w:t xml:space="preserve"> </w:t>
+      </w:r>
+      <w:r>
+        <w:t xml:space="preserve">(a) os municípios cumprem as metas projetadas pelo INEP no</w:t>
+      </w:r>
+      <w:r>
+        <w:t xml:space="preserve"> </w:t>
+      </w:r>
+      <w:r>
+        <w:rPr>
+          <w:b/>
+          <w:bCs/>
+        </w:rPr>
+        <w:t xml:space="preserve">mesmo ano de referência</w:t>
+      </w:r>
+      <w:r>
+        <w:t xml:space="preserve"> </w:t>
+      </w:r>
+      <w:r>
+        <w:t xml:space="preserve">(IDEB observado em</w:t>
+      </w:r>
+      <w:r>
+        <w:t xml:space="preserve"> </w:t>
+      </w:r>
+      <w:r>
+        <w:rPr>
+          <w:i/>
+          <w:iCs/>
+        </w:rPr>
+        <w:t xml:space="preserve">t</w:t>
+      </w:r>
+      <w:r>
+        <w:t xml:space="preserve"> </w:t>
+      </w:r>
+      <w:r>
+        <w:t xml:space="preserve">≥ meta em</w:t>
+      </w:r>
+      <w:r>
+        <w:t xml:space="preserve"> </w:t>
+      </w:r>
+      <w:r>
+        <w:rPr>
+          <w:i/>
+          <w:iCs/>
+        </w:rPr>
+        <w:t xml:space="preserve">t</w:t>
+      </w:r>
+      <w:r>
+        <w:t xml:space="preserve">, para</w:t>
+      </w:r>
+      <w:r>
+        <w:t xml:space="preserve"> </w:t>
+      </w:r>
+      <w:r>
+        <w:rPr>
+          <w:i/>
+          <w:iCs/>
+        </w:rPr>
+        <w:t xml:space="preserve">t</w:t>
+      </w:r>
+      <w:r>
+        <w:t xml:space="preserve"> </w:t>
+      </w:r>
+      <w:r>
+        <w:t xml:space="preserve">∈ {2011, 2013, 2015, 2017, 2019, 2021}); (b) o ganho educacional 2007→2025 (anos iniciais) não se associa à renda municipal. São proposições separadas e testadas independentemente.</w:t>
       </w:r>
     </w:p>
     <w:bookmarkEnd w:id="18"/>
@@ -593,13 +806,13 @@
           <w:b/>
           <w:bCs/>
         </w:rPr>
-        <w:t xml:space="preserve">Correlações em níveis:</w:t>
-      </w:r>
-      <w:r>
-        <w:t xml:space="preserve"> </w:t>
-      </w:r>
-      <w:r>
-        <w:t xml:space="preserve">Pearson com intervalo de confiança por bootstrap por cluster (município), seed 42, 2.000 réplicas (500 quando o número de clusters excede 50).</w:t>
+        <w:t xml:space="preserve">Between-estimator (dimensão transversal):</w:t>
+      </w:r>
+      <w:r>
+        <w:t xml:space="preserve"> </w:t>
+      </w:r>
+      <w:r>
+        <w:t xml:space="preserve">média temporal de IDEB e de log do PIB real por município; correlação de Pearson entre as médias (n = 9), com IC95% e p por bootstrap por cluster reamostrando municípios (seed 42, 5.000 réplicas) e jackknife por município.</w:t>
       </w:r>
     </w:p>
     <w:p>
@@ -615,13 +828,13 @@
           <w:b/>
           <w:bCs/>
         </w:rPr>
-        <w:t xml:space="preserve">Primeiras diferenças:</w:t>
-      </w:r>
-      <w:r>
-        <w:t xml:space="preserve"> </w:t>
-      </w:r>
-      <w:r>
-        <w:t xml:space="preserve">correlação de Pearson das diferenças de primeira ordem dentro de cada município-etapa.</w:t>
+        <w:t xml:space="preserve">Correlações em níveis (pooled):</w:t>
+      </w:r>
+      <w:r>
+        <w:t xml:space="preserve"> </w:t>
+      </w:r>
+      <w:r>
+        <w:t xml:space="preserve">Pearson em todas as observações, com IC95% por bootstrap por cluster (município), 5.000 réplicas (500 quando o número de clusters excede 50). Reportada como complemento, sem reivindicação de tamanho efetivo de amostra transversal.</w:t>
       </w:r>
     </w:p>
     <w:p>
@@ -637,29 +850,13 @@
           <w:b/>
           <w:bCs/>
         </w:rPr>
-        <w:t xml:space="preserve">Efeitos fixos:</w:t>
-      </w:r>
-      <w:r>
-        <w:t xml:space="preserve"> </w:t>
-      </w:r>
-      <w:r>
-        <w:t xml:space="preserve">regressão com efeitos fixos de município e ano via within-transformation dupla (município e ano). Reportam-se erros padrão homocedásticos (transparência) e</w:t>
-      </w:r>
-      <w:r>
-        <w:t xml:space="preserve"> </w:t>
-      </w:r>
-      <w:r>
-        <w:rPr>
-          <w:b/>
-          <w:bCs/>
-        </w:rPr>
-        <w:t xml:space="preserve">erros padrão clusterizados por município</w:t>
-      </w:r>
-      <w:r>
-        <w:t xml:space="preserve"> </w:t>
-      </w:r>
-      <w:r>
-        <w:t xml:space="preserve">(CRVE com correção de pequena amostra, t com G−1 graus de liberdade).</w:t>
+        <w:t xml:space="preserve">Primeiras diferenças:</w:t>
+      </w:r>
+      <w:r>
+        <w:t xml:space="preserve"> </w:t>
+      </w:r>
+      <w:r>
+        <w:t xml:space="preserve">correlação de Pearson das diferenças de primeira ordem dentro de cada município-etapa (p nominal; n pequeno, poder baixo — declarado).</w:t>
       </w:r>
     </w:p>
     <w:p>
@@ -675,13 +872,61 @@
           <w:b/>
           <w:bCs/>
         </w:rPr>
-        <w:t xml:space="preserve">LOOCV por município:</w:t>
-      </w:r>
-      <w:r>
-        <w:t xml:space="preserve"> </w:t>
-      </w:r>
-      <w:r>
-        <w:t xml:space="preserve">para cada um dos nove municípios, estima-se a correlação nos oito restantes e avalia-se a replicação no município retido, reportando a distribuição dos r de teste.</w:t>
+        <w:t xml:space="preserve">Efeitos fixos:</w:t>
+      </w:r>
+      <w:r>
+        <w:t xml:space="preserve"> </w:t>
+      </w:r>
+      <w:r>
+        <w:t xml:space="preserve">regressão com efeitos fixos de</w:t>
+      </w:r>
+      <w:r>
+        <w:t xml:space="preserve"> </w:t>
+      </w:r>
+      <w:r>
+        <w:rPr>
+          <w:b/>
+          <w:bCs/>
+        </w:rPr>
+        <w:t xml:space="preserve">município×etapa</w:t>
+      </w:r>
+      <w:r>
+        <w:t xml:space="preserve"> </w:t>
+      </w:r>
+      <w:r>
+        <w:t xml:space="preserve">(par único) e ano via within-transformation dupla. Reportam-se erros padrão homocedásticos (transparência) e</w:t>
+      </w:r>
+      <w:r>
+        <w:t xml:space="preserve"> </w:t>
+      </w:r>
+      <w:r>
+        <w:rPr>
+          <w:b/>
+          <w:bCs/>
+        </w:rPr>
+        <w:t xml:space="preserve">erros padrão clusterizados por município</w:t>
+      </w:r>
+      <w:r>
+        <w:t xml:space="preserve"> </w:t>
+      </w:r>
+      <w:r>
+        <w:t xml:space="preserve">(CRVE com correção de pequena amostra, t com G−1 graus de liberdade). Com G = 9, o teste t cluster pode super-rejeitar; reporta-se também o</w:t>
+      </w:r>
+      <w:r>
+        <w:t xml:space="preserve"> </w:t>
+      </w:r>
+      <w:r>
+        <w:rPr>
+          <w:b/>
+          <w:bCs/>
+        </w:rPr>
+        <w:t xml:space="preserve">wild cluster bootstrap</w:t>
+      </w:r>
+      <w:r>
+        <w:t xml:space="preserve"> </w:t>
+      </w:r>
+      <w:r>
+        <w:t xml:space="preserve">(Rademacher, 9.999 réplicas) sob H0 (Cameron; Gelbach; Miller, 2008; MacKinnon; Webb, 2017).</w:t>
       </w:r>
     </w:p>
     <w:p>
@@ -697,13 +942,61 @@
           <w:b/>
           <w:bCs/>
         </w:rPr>
-        <w:t xml:space="preserve">MDES/TOST:</w:t>
-      </w:r>
-      <w:r>
-        <w:t xml:space="preserve"> </w:t>
-      </w:r>
-      <w:r>
-        <w:t xml:space="preserve">mínimo efeito detectável (poder 80%, α 5%) e teste de equivalência com margem ±0,10 no coeficiente de efeitos fixos, ambos baseados no erro padrão clusterizado (G−1 graus de liberdade).</w:t>
+        <w:t xml:space="preserve">Validação interna (LOOCV por município):</w:t>
+      </w:r>
+      <w:r>
+        <w:t xml:space="preserve"> </w:t>
+      </w:r>
+      <w:r>
+        <w:t xml:space="preserve">para cada um dos nove municípios, calcula-se a correlação</w:t>
+      </w:r>
+      <w:r>
+        <w:t xml:space="preserve"> </w:t>
+      </w:r>
+      <w:r>
+        <w:rPr>
+          <w:i/>
+          <w:iCs/>
+        </w:rPr>
+        <w:t xml:space="preserve">dentro</w:t>
+      </w:r>
+      <w:r>
+        <w:t xml:space="preserve"> </w:t>
+      </w:r>
+      <w:r>
+        <w:t xml:space="preserve">do município retido (12 observações: 6 anos × 2 etapas) e reporta-se a distribuição. Trata-se de estabilidade do sinal</w:t>
+      </w:r>
+      <w:r>
+        <w:t xml:space="preserve"> </w:t>
+      </w:r>
+      <w:r>
+        <w:rPr>
+          <w:i/>
+          <w:iCs/>
+        </w:rPr>
+        <w:t xml:space="preserve">dentro da unidade</w:t>
+      </w:r>
+      <w:r>
+        <w:t xml:space="preserve"> </w:t>
+      </w:r>
+      <w:r>
+        <w:t xml:space="preserve">(co-tendência temporal) —</w:t>
+      </w:r>
+      <w:r>
+        <w:t xml:space="preserve"> </w:t>
+      </w:r>
+      <w:r>
+        <w:rPr>
+          <w:b/>
+          <w:bCs/>
+        </w:rPr>
+        <w:t xml:space="preserve">não</w:t>
+      </w:r>
+      <w:r>
+        <w:t xml:space="preserve"> </w:t>
+      </w:r>
+      <w:r>
+        <w:t xml:space="preserve">é réplica da associação transversal entre municípios nem validação externa.</w:t>
       </w:r>
     </w:p>
     <w:p>
@@ -719,6 +1012,44 @@
           <w:b/>
           <w:bCs/>
         </w:rPr>
+        <w:t xml:space="preserve">MDES/TOST:</w:t>
+      </w:r>
+      <w:r>
+        <w:t xml:space="preserve"> </w:t>
+      </w:r>
+      <w:r>
+        <w:t xml:space="preserve">mínimo efeito detectável (poder 80%, α 5%) baseado no erro padrão clusterizado, traduzido em pontos de IDEB por +10% do PIB per capita real; teste de equivalência (TOST) com margem substantiva</w:t>
+      </w:r>
+      <w:r>
+        <w:t xml:space="preserve"> </w:t>
+      </w:r>
+      <w:r>
+        <w:rPr>
+          <w:b/>
+          <w:bCs/>
+        </w:rPr>
+        <w:t xml:space="preserve">SESOI ±0,5 ponto de IDEB</w:t>
+      </w:r>
+      <w:r>
+        <w:t xml:space="preserve"> </w:t>
+      </w:r>
+      <w:r>
+        <w:t xml:space="preserve">(Lakens; Scheel; Isager, 2018; Bloom, 1995) e reporte de margem ±0,10 como transparência.</w:t>
+      </w:r>
+    </w:p>
+    <w:p>
+      <w:pPr>
+        <w:pStyle w:val="Compact"/>
+        <w:numPr>
+          <w:ilvl w:val="0"/>
+          <w:numId w:val="1003"/>
+        </w:numPr>
+      </w:pPr>
+      <w:r>
+        <w:rPr>
+          <w:b/>
+          <w:bCs/>
+        </w:rPr>
         <w:t xml:space="preserve">Transparência:</w:t>
       </w:r>
       <w:r>
@@ -749,10 +1080,7 @@
         <w:t xml:space="preserve">analise_crateus.py</w:t>
       </w:r>
       <w:r>
-        <w:t xml:space="preserve"> </w:t>
-      </w:r>
-      <w:r>
-        <w:t xml:space="preserve">e</w:t>
+        <w:t xml:space="preserve">,</w:t>
       </w:r>
       <w:r>
         <w:t xml:space="preserve"> </w:t>
@@ -761,7 +1089,7 @@
         <w:rPr>
           <w:rStyle w:val="VerbatimChar"/>
         </w:rPr>
-        <w:t xml:space="preserve">mapa_crateus.py</w:t>
+        <w:t xml:space="preserve">analise_crateus_r428.py</w:t>
       </w:r>
       <w:r>
         <w:t xml:space="preserve">; saídas completas em</w:t>
@@ -773,7 +1101,7 @@
         <w:rPr>
           <w:rStyle w:val="VerbatimChar"/>
         </w:rPr>
-        <w:t xml:space="preserve">outputs/expanded/resultados_r426.json</w:t>
+        <w:t xml:space="preserve">outputs/expanded/resultados_r428.json</w:t>
       </w:r>
       <w:r>
         <w:t xml:space="preserve"> </w:t>
@@ -788,7 +1116,19 @@
         <w:rPr>
           <w:rStyle w:val="VerbatimChar"/>
         </w:rPr>
-        <w:t xml:space="preserve">provenance_r426.json</w:t>
+        <w:t xml:space="preserve">provenance_r428.json</w:t>
+      </w:r>
+      <w:r>
+        <w:t xml:space="preserve">; deflator em</w:t>
+      </w:r>
+      <w:r>
+        <w:t xml:space="preserve"> </w:t>
+      </w:r>
+      <w:r>
+        <w:rPr>
+          <w:rStyle w:val="VerbatimChar"/>
+        </w:rPr>
+        <w:t xml:space="preserve">data/processed/ipca_medias_anuais.json</w:t>
       </w:r>
       <w:r>
         <w:t xml:space="preserve">.</w:t>
@@ -831,7 +1171,7 @@
         <w:t xml:space="preserve"> </w:t>
       </w:r>
       <w:r>
-        <w:t xml:space="preserve">se o IC95% do bootstrap por cluster incluísse zero ou se a correlação transversal fosse negativa.</w:t>
+        <w:t xml:space="preserve">se o IC95% do bootstrap por cluster incluísse zero ou se a correlação entre municípios fosse negativa.</w:t>
       </w:r>
     </w:p>
     <w:p>
@@ -853,7 +1193,7 @@
         <w:t xml:space="preserve"> </w:t>
       </w:r>
       <w:r>
-        <w:t xml:space="preserve">se o coeficiente de efeitos fixos (clusterizado) fosse estatisticamente discernível de zero ao nível de 5% ou se as primeiras diferenças mostrassem correlação |r| ≥ 0,30 com p &lt; 0,05.</w:t>
+        <w:t xml:space="preserve">se o coeficiente de efeitos fixos (clusterizado, ou o p do wild cluster bootstrap) fosse estatisticamente discernível de zero ao nível de 5% ou se as primeiras diferenças mostrassem correlação |r| ≥ 0,30 com p &lt; 0,05.</w:t>
       </w:r>
     </w:p>
     <w:p>
@@ -869,13 +1209,29 @@
           <w:b/>
           <w:bCs/>
         </w:rPr>
-        <w:t xml:space="preserve">H3 seria rejeitada</w:t>
-      </w:r>
-      <w:r>
-        <w:t xml:space="preserve"> </w:t>
-      </w:r>
-      <w:r>
-        <w:t xml:space="preserve">se a maioria dos municípios (≥ 5 de 9) ficasse abaixo da meta pactuada para 2021 ou se o ganho educacional correlacionasse positiva e significativamente com a renda municipal (r &gt; 0,30; p &lt; 0,05).</w:t>
+        <w:t xml:space="preserve">H3(a) seria rejeitada</w:t>
+      </w:r>
+      <w:r>
+        <w:t xml:space="preserve"> </w:t>
+      </w:r>
+      <w:r>
+        <w:t xml:space="preserve">se a maioria dos municípios (≥ 5 de 9) ficasse abaixo da meta do INEP no mesmo ano em algum ciclo de 2011 a 2021;</w:t>
+      </w:r>
+      <w:r>
+        <w:t xml:space="preserve"> </w:t>
+      </w:r>
+      <w:r>
+        <w:rPr>
+          <w:b/>
+          <w:bCs/>
+        </w:rPr>
+        <w:t xml:space="preserve">H3(b) seria rejeitada</w:t>
+      </w:r>
+      <w:r>
+        <w:t xml:space="preserve"> </w:t>
+      </w:r>
+      <w:r>
+        <w:t xml:space="preserve">se o ganho educacional correlacionasse positiva e significativamente com a renda municipal (r &gt; 0,30; p &lt; 0,05).</w:t>
       </w:r>
     </w:p>
     <w:p>
@@ -883,12 +1239,28 @@
         <w:pStyle w:val="FirstParagraph"/>
       </w:pPr>
       <w:r>
-        <w:t xml:space="preserve">A não-detecção (MDES alto, TOST não significativo) é tratada como resultado informativo de poder estatístico, não como confirmação de ausência de efeito.</w:t>
+        <w:t xml:space="preserve">A não-detecção (MDES alto, TOST não significativo) é tratada como resultado informativo de poder estatístico, não como confirmação de ausência de efeito:</w:t>
+      </w:r>
+      <w:r>
+        <w:t xml:space="preserve"> </w:t>
+      </w:r>
+      <w:r>
+        <w:rPr>
+          <w:b/>
+          <w:bCs/>
+        </w:rPr>
+        <w:t xml:space="preserve">não-detecção ≠ equivalência</w:t>
+      </w:r>
+      <w:r>
+        <w:t xml:space="preserve"> </w:t>
+      </w:r>
+      <w:r>
+        <w:t xml:space="preserve">(Lakens; Scheel; Isager, 2018).</w:t>
       </w:r>
     </w:p>
     <w:bookmarkEnd w:id="20"/>
     <w:bookmarkEnd w:id="21"/>
-    <w:bookmarkStart w:id="46" w:name="resultados"/>
+    <w:bookmarkStart w:id="29" w:name="resultados"/>
     <w:p>
       <w:pPr>
         <w:pStyle w:val="Heading2"/>
@@ -897,13 +1269,13 @@
         <w:t xml:space="preserve">4. Resultados</w:t>
       </w:r>
     </w:p>
-    <w:bookmarkStart w:id="25" w:name="h1-associação-em-níveis"/>
+    <w:bookmarkStart w:id="22" w:name="dimensão-entre-municípios-h1"/>
     <w:p>
       <w:pPr>
         <w:pStyle w:val="Heading3"/>
       </w:pPr>
       <w:r>
-        <w:t xml:space="preserve">4.1 H1 — associação em níveis</w:t>
+        <w:t xml:space="preserve">4.1 Dimensão entre municípios (H1)</w:t>
       </w:r>
     </w:p>
     <w:p>
@@ -911,74 +1283,381 @@
         <w:pStyle w:val="FirstParagraph"/>
       </w:pPr>
       <w:r>
-        <w:t xml:space="preserve">Na microrregião, a correlação transversal entre IDEB e log do PIB per capita defasado foi r = 0,49 (IC95% bootstrap por cluster [0,34; 0,64]; p &lt; 0,001; n = 108; 9 clusters), confirmando H1. Para o Ceará, r = 0,26 (IC95% [0,20; 0,33]); para o Brasil, r = 0,46 (IC95% [0,44; 0,47]; n = 48.695). A associação em níveis está presente na microrregião, embora com magnitude moderada — não tão elevada quanto a documentada em nível de países, mas consistente com a literatura municipal brasileira.</w:t>
-      </w:r>
-    </w:p>
-    <w:p>
-      <w:pPr>
-        <w:pStyle w:val="CaptionedFigure"/>
-      </w:pPr>
-      <w:r>
-        <w:drawing>
-          <wp:inline>
-            <wp:extent cx="5753100" cy="3835400"/>
-            <wp:effectExtent b="0" l="0" r="0" t="0"/>
-            <wp:docPr descr="Figura 1 — Associação em níveis entre IDEB e log do PIB per capita (Sertão de Cratéus, 2013–2023)." title="" id="23" name="Picture"/>
-            <a:graphic>
-              <a:graphicData uri="http://schemas.openxmlformats.org/drawingml/2006/picture">
-                <pic:pic>
-                  <pic:nvPicPr>
-                    <pic:cNvPr descr="outputs/figuras/fig_scatter_niveis_micro.png" id="24" name="Picture"/>
-                    <pic:cNvPicPr>
-                      <a:picLocks noChangeArrowheads="1" noChangeAspect="1"/>
-                    </pic:cNvPicPr>
-                  </pic:nvPicPr>
-                  <pic:blipFill>
-                    <a:blip r:embed="rId22"/>
-                    <a:stretch>
-                      <a:fillRect/>
-                    </a:stretch>
-                  </pic:blipFill>
-                  <pic:spPr bwMode="auto">
-                    <a:xfrm>
-                      <a:off x="0" y="0"/>
-                      <a:ext cx="5753100" cy="3835400"/>
-                    </a:xfrm>
-                    <a:prstGeom prst="rect">
-                      <a:avLst/>
-                    </a:prstGeom>
-                    <a:noFill/>
-                    <a:ln w="9525">
-                      <a:noFill/>
-                      <a:headEnd/>
-                      <a:tailEnd/>
-                    </a:ln>
-                  </pic:spPr>
-                </pic:pic>
-              </a:graphicData>
-            </a:graphic>
-          </wp:inline>
-        </w:drawing>
-      </w:r>
-    </w:p>
-    <w:p>
-      <w:pPr>
-        <w:pStyle w:val="ImageCaption"/>
-      </w:pPr>
-      <w:r>
-        <w:t xml:space="preserve">Figura 1 — Associação em níveis entre IDEB e log do PIB per capita (Sertão de Cratéus, 2013–2023).</w:t>
-      </w:r>
-    </w:p>
-    <w:p>
-      <w:pPr>
-        <w:pStyle w:val="BodyText"/>
-      </w:pPr>
+        <w:t xml:space="preserve">Na microrregião, a correlação entre as médias municipais de IDEB e de log do PIB per capita real defasado foi r = −0,24 (IC95% bootstrap por cluster [−0,77; 0,50]; p = 0,52; n = 9 municípios) — sem evidência de associação transversal discernível, e o sinal estimado é inclusive negativo. O jackknife confirma a fragilidade: o r varia de −0,48 (removendo Independência) a +0,02 (removendo Crateús). Na escala Ceará, o between foi r = 0,03 (IC95% [−0,10; 0,15]; p = 0,76; n = 184); no Brasil, r = 0,49 (IC95% [0,47; 0,51]; p &lt; 0,001; n = 5.360). A associação transversal só aparece no agregado nacional, não na microrregião nem no Ceará; H1</w:t>
+      </w:r>
+      <w:r>
+        <w:t xml:space="preserve"> </w:t>
+      </w:r>
       <w:r>
         <w:rPr>
           <w:b/>
           <w:bCs/>
         </w:rPr>
-        <w:t xml:space="preserve">Tabela 1 — Correlações em níveis por escala (IDEB × log PIB per capita defasado)</w:t>
+        <w:t xml:space="preserve">é rejeitada</w:t>
+      </w:r>
+      <w:r>
+        <w:t xml:space="preserve"> </w:t>
+      </w:r>
+      <w:r>
+        <w:t xml:space="preserve">para a microrregião (Figura 1).</w:t>
+      </w:r>
+    </w:p>
+    <w:tbl>
+      <w:tblPr>
+        <w:tblStyle w:val="FigureTable"/>
+        <w:tblW w:type="auto" w:w="0"/>
+        <w:jc w:val="center"/>
+        <w:tblLook w:firstRow="0" w:lastRow="0" w:firstColumn="0" w:lastColumn="0"/>
+      </w:tblPr>
+      <w:tblGrid>
+        <w:gridCol w:w="7920"/>
+      </w:tblGrid>
+      <w:tr>
+        <w:tc>
+          <w:tcPr/>
+          <w:p>
+            <w:pPr>
+              <w:pStyle w:val="Compact"/>
+              <w:jc w:val="center"/>
+            </w:pPr>
+            <w:r>
+              <w:t xml:space="preserve">Figura 1 — Associação em níveis entre IDEB e log do PIB per capita real (Sertão de Crateús, 2013–2023), por etapa.</w:t>
+            </w:r>
+          </w:p>
+        </w:tc>
+      </w:tr>
+    </w:tbl>
+    <w:p>
+      <w:pPr>
+        <w:pStyle w:val="ImageCaption"/>
+      </w:pPr>
+      <w:r>
+        <w:t xml:space="preserve">Figura 1 — Associação em níveis entre IDEB e log do PIB per capita real (Sertão de Crateús, 2013–2023), por etapa.</w:t>
+      </w:r>
+    </w:p>
+    <w:p>
+      <w:pPr>
+        <w:pStyle w:val="BodyText"/>
+      </w:pPr>
+      <w:r>
+        <w:rPr>
+          <w:b/>
+          <w:bCs/>
+        </w:rPr>
+        <w:t xml:space="preserve">Tabela 1 — Between-estimator (médias municipais) por escala</w:t>
+      </w:r>
+    </w:p>
+    <w:tbl>
+      <w:tblPr>
+        <w:tblStyle w:val="Table"/>
+        <w:tblW w:type="auto" w:w="0"/>
+        <w:tblLook w:firstRow="1" w:lastRow="0" w:firstColumn="0" w:lastColumn="0" w:noHBand="0" w:noVBand="0" w:val="0020"/>
+      </w:tblPr>
+      <w:tblGrid>
+        <w:gridCol w:w="1584"/>
+        <w:gridCol w:w="1584"/>
+        <w:gridCol w:w="1584"/>
+        <w:gridCol w:w="1584"/>
+        <w:gridCol w:w="1584"/>
+      </w:tblGrid>
+      <w:tr>
+        <w:trPr>
+          <w:tblHeader w:val="on"/>
+        </w:trPr>
+        <w:tc>
+          <w:tcPr/>
+          <w:p>
+            <w:pPr>
+              <w:pStyle w:val="Compact"/>
+            </w:pPr>
+            <w:r>
+              <w:t xml:space="preserve">Escala</w:t>
+            </w:r>
+          </w:p>
+        </w:tc>
+        <w:tc>
+          <w:tcPr/>
+          <w:p>
+            <w:pPr>
+              <w:pStyle w:val="Compact"/>
+            </w:pPr>
+            <w:r>
+              <w:t xml:space="preserve">n (municípios)</w:t>
+            </w:r>
+          </w:p>
+        </w:tc>
+        <w:tc>
+          <w:tcPr/>
+          <w:p>
+            <w:pPr>
+              <w:pStyle w:val="Compact"/>
+            </w:pPr>
+            <w:r>
+              <w:t xml:space="preserve">r between</w:t>
+            </w:r>
+          </w:p>
+        </w:tc>
+        <w:tc>
+          <w:tcPr/>
+          <w:p>
+            <w:pPr>
+              <w:pStyle w:val="Compact"/>
+            </w:pPr>
+            <w:r>
+              <w:t xml:space="preserve">IC95% bootstrap</w:t>
+            </w:r>
+          </w:p>
+        </w:tc>
+        <w:tc>
+          <w:tcPr/>
+          <w:p>
+            <w:pPr>
+              <w:pStyle w:val="Compact"/>
+            </w:pPr>
+            <w:r>
+              <w:t xml:space="preserve">p</w:t>
+            </w:r>
+          </w:p>
+        </w:tc>
+      </w:tr>
+      <w:tr>
+        <w:tc>
+          <w:tcPr/>
+          <w:p>
+            <w:pPr>
+              <w:pStyle w:val="Compact"/>
+            </w:pPr>
+            <w:r>
+              <w:t xml:space="preserve">Microrregião Sertão de Crateús</w:t>
+            </w:r>
+          </w:p>
+        </w:tc>
+        <w:tc>
+          <w:tcPr/>
+          <w:p>
+            <w:pPr>
+              <w:pStyle w:val="Compact"/>
+            </w:pPr>
+            <w:r>
+              <w:t xml:space="preserve">9</w:t>
+            </w:r>
+          </w:p>
+        </w:tc>
+        <w:tc>
+          <w:tcPr/>
+          <w:p>
+            <w:pPr>
+              <w:pStyle w:val="Compact"/>
+            </w:pPr>
+            <w:r>
+              <w:t xml:space="preserve">−0,24</w:t>
+            </w:r>
+          </w:p>
+        </w:tc>
+        <w:tc>
+          <w:tcPr/>
+          <w:p>
+            <w:pPr>
+              <w:pStyle w:val="Compact"/>
+            </w:pPr>
+            <w:r>
+              <w:t xml:space="preserve">[−0,77; 0,50]</w:t>
+            </w:r>
+          </w:p>
+        </w:tc>
+        <w:tc>
+          <w:tcPr/>
+          <w:p>
+            <w:pPr>
+              <w:pStyle w:val="Compact"/>
+            </w:pPr>
+            <w:r>
+              <w:t xml:space="preserve">0,52</w:t>
+            </w:r>
+          </w:p>
+        </w:tc>
+      </w:tr>
+      <w:tr>
+        <w:tc>
+          <w:tcPr/>
+          <w:p>
+            <w:pPr>
+              <w:pStyle w:val="Compact"/>
+            </w:pPr>
+            <w:r>
+              <w:t xml:space="preserve">Ceará</w:t>
+            </w:r>
+          </w:p>
+        </w:tc>
+        <w:tc>
+          <w:tcPr/>
+          <w:p>
+            <w:pPr>
+              <w:pStyle w:val="Compact"/>
+            </w:pPr>
+            <w:r>
+              <w:t xml:space="preserve">184</w:t>
+            </w:r>
+          </w:p>
+        </w:tc>
+        <w:tc>
+          <w:tcPr/>
+          <w:p>
+            <w:pPr>
+              <w:pStyle w:val="Compact"/>
+            </w:pPr>
+            <w:r>
+              <w:t xml:space="preserve">0,03</w:t>
+            </w:r>
+          </w:p>
+        </w:tc>
+        <w:tc>
+          <w:tcPr/>
+          <w:p>
+            <w:pPr>
+              <w:pStyle w:val="Compact"/>
+            </w:pPr>
+            <w:r>
+              <w:t xml:space="preserve">[−0,10; 0,15]</w:t>
+            </w:r>
+          </w:p>
+        </w:tc>
+        <w:tc>
+          <w:tcPr/>
+          <w:p>
+            <w:pPr>
+              <w:pStyle w:val="Compact"/>
+            </w:pPr>
+            <w:r>
+              <w:t xml:space="preserve">0,76</w:t>
+            </w:r>
+          </w:p>
+        </w:tc>
+      </w:tr>
+      <w:tr>
+        <w:tc>
+          <w:tcPr/>
+          <w:p>
+            <w:pPr>
+              <w:pStyle w:val="Compact"/>
+            </w:pPr>
+            <w:r>
+              <w:t xml:space="preserve">Brasil</w:t>
+            </w:r>
+          </w:p>
+        </w:tc>
+        <w:tc>
+          <w:tcPr/>
+          <w:p>
+            <w:pPr>
+              <w:pStyle w:val="Compact"/>
+            </w:pPr>
+            <w:r>
+              <w:t xml:space="preserve">5.360</w:t>
+            </w:r>
+          </w:p>
+        </w:tc>
+        <w:tc>
+          <w:tcPr/>
+          <w:p>
+            <w:pPr>
+              <w:pStyle w:val="Compact"/>
+            </w:pPr>
+            <w:r>
+              <w:t xml:space="preserve">0,49</w:t>
+            </w:r>
+          </w:p>
+        </w:tc>
+        <w:tc>
+          <w:tcPr/>
+          <w:p>
+            <w:pPr>
+              <w:pStyle w:val="Compact"/>
+            </w:pPr>
+            <w:r>
+              <w:t xml:space="preserve">[0,47; 0,51]</w:t>
+            </w:r>
+          </w:p>
+        </w:tc>
+        <w:tc>
+          <w:tcPr/>
+          <w:p>
+            <w:pPr>
+              <w:pStyle w:val="Compact"/>
+            </w:pPr>
+            <w:r>
+              <w:t xml:space="preserve">&lt; 0,001</w:t>
+            </w:r>
+          </w:p>
+        </w:tc>
+      </w:tr>
+    </w:tbl>
+    <w:bookmarkEnd w:id="22"/>
+    <w:bookmarkStart w:id="23" w:name="associação-dentro-das-unidades-h2"/>
+    <w:p>
+      <w:pPr>
+        <w:pStyle w:val="Heading3"/>
+      </w:pPr>
+      <w:r>
+        <w:t xml:space="preserve">4.2 Associação dentro das unidades (H2)</w:t>
+      </w:r>
+    </w:p>
+    <w:p>
+      <w:pPr>
+        <w:pStyle w:val="FirstParagraph"/>
+      </w:pPr>
+      <w:r>
+        <w:t xml:space="preserve">As primeiras diferenças dentro de município-etapa na microrregião foram próximas de zero: r = −0,07 (p = 0,50; n = 90). O coeficiente de efeitos fixos de município×etapa e ano foi β = 2,61 (SE homocedástico 1,28, p nominal 0,046; SE clusterizado 1,88; IC95% cluster [−1,73; 6,95]; p = 0,20 com t(G−1); wild cluster bootstrap p = 0,23; n = 108; 9 clusters): positivo, mas</w:t>
+      </w:r>
+      <w:r>
+        <w:t xml:space="preserve"> </w:t>
+      </w:r>
+      <w:r>
+        <w:rPr>
+          <w:b/>
+          <w:bCs/>
+        </w:rPr>
+        <w:t xml:space="preserve">não discernível de zero sob inferência cluster-robusta</w:t>
+      </w:r>
+      <w:r>
+        <w:t xml:space="preserve">. Para o Ceará, β = −0,0006 (SE cluster 0,14; IC95% [−0,27; 0,27]; p = 0,997). Para o Brasil, β = 0,11 (SE cluster 0,024; IC95% [0,07; 0,16]; p &lt; 0,001): pequeno, embora discernível dado o enorme n. H2 não é rejeitada na microrregião: dentro das unidades, a associação entre variação de renda e variação de IDEB não é discernível — mas, dada a precisão limitada, o correto é</w:t>
+      </w:r>
+      <w:r>
+        <w:t xml:space="preserve"> </w:t>
+      </w:r>
+      <w:r>
+        <w:rPr>
+          <w:b/>
+          <w:bCs/>
+        </w:rPr>
+        <w:t xml:space="preserve">não-detecção</w:t>
+      </w:r>
+      <w:r>
+        <w:t xml:space="preserve">, não</w:t>
+      </w:r>
+      <w:r>
+        <w:t xml:space="preserve"> </w:t>
+      </w:r>
+      <w:r>
+        <w:t xml:space="preserve">“confirmação”</w:t>
+      </w:r>
+      <w:r>
+        <w:t xml:space="preserve"> </w:t>
+      </w:r>
+      <w:r>
+        <w:t xml:space="preserve">de nulidade.</w:t>
+      </w:r>
+    </w:p>
+    <w:p>
+      <w:pPr>
+        <w:pStyle w:val="BodyText"/>
+      </w:pPr>
+      <w:r>
+        <w:rPr>
+          <w:b/>
+          <w:bCs/>
+        </w:rPr>
+        <w:t xml:space="preserve">Tabela 2 — Associação dentro das unidades por escala</w:t>
       </w:r>
     </w:p>
     <w:tbl>
@@ -1018,51 +1697,51 @@
               <w:pStyle w:val="Compact"/>
             </w:pPr>
             <w:r>
-              <w:t xml:space="preserve">n (obs.)</w:t>
-            </w:r>
-          </w:p>
-        </w:tc>
-        <w:tc>
-          <w:tcPr/>
-          <w:p>
-            <w:pPr>
-              <w:pStyle w:val="Compact"/>
-            </w:pPr>
-            <w:r>
-              <w:t xml:space="preserve">Clusters</w:t>
-            </w:r>
-          </w:p>
-        </w:tc>
-        <w:tc>
-          <w:tcPr/>
-          <w:p>
-            <w:pPr>
-              <w:pStyle w:val="Compact"/>
-            </w:pPr>
-            <w:r>
-              <w:t xml:space="preserve">r</w:t>
-            </w:r>
-          </w:p>
-        </w:tc>
-        <w:tc>
-          <w:tcPr/>
-          <w:p>
-            <w:pPr>
-              <w:pStyle w:val="Compact"/>
-            </w:pPr>
-            <w:r>
-              <w:t xml:space="preserve">IC95% bootstrap</w:t>
-            </w:r>
-          </w:p>
-        </w:tc>
-        <w:tc>
-          <w:tcPr/>
-          <w:p>
-            <w:pPr>
-              <w:pStyle w:val="Compact"/>
-            </w:pPr>
-            <w:r>
-              <w:t xml:space="preserve">p</w:t>
+              <w:t xml:space="preserve">1ª diferenças r (p)</w:t>
+            </w:r>
+          </w:p>
+        </w:tc>
+        <w:tc>
+          <w:tcPr/>
+          <w:p>
+            <w:pPr>
+              <w:pStyle w:val="Compact"/>
+            </w:pPr>
+            <w:r>
+              <w:t xml:space="preserve">n (1ª dif.)</w:t>
+            </w:r>
+          </w:p>
+        </w:tc>
+        <w:tc>
+          <w:tcPr/>
+          <w:p>
+            <w:pPr>
+              <w:pStyle w:val="Compact"/>
+            </w:pPr>
+            <w:r>
+              <w:t xml:space="preserve">FE β (IC95% cluster; p cluster)</w:t>
+            </w:r>
+          </w:p>
+        </w:tc>
+        <w:tc>
+          <w:tcPr/>
+          <w:p>
+            <w:pPr>
+              <w:pStyle w:val="Compact"/>
+            </w:pPr>
+            <w:r>
+              <w:t xml:space="preserve">p wild</w:t>
+            </w:r>
+          </w:p>
+        </w:tc>
+        <w:tc>
+          <w:tcPr/>
+          <w:p>
+            <w:pPr>
+              <w:pStyle w:val="Compact"/>
+            </w:pPr>
+            <w:r>
+              <w:t xml:space="preserve">n (FE)</w:t>
             </w:r>
           </w:p>
         </w:tc>
@@ -1075,7 +1754,51 @@
               <w:pStyle w:val="Compact"/>
             </w:pPr>
             <w:r>
-              <w:t xml:space="preserve">Microrregião Sertão de Cratéus</w:t>
+              <w:t xml:space="preserve">Microrregião Sertão de Crateús</w:t>
+            </w:r>
+          </w:p>
+        </w:tc>
+        <w:tc>
+          <w:tcPr/>
+          <w:p>
+            <w:pPr>
+              <w:pStyle w:val="Compact"/>
+            </w:pPr>
+            <w:r>
+              <w:t xml:space="preserve">−0,07 (0,50)</w:t>
+            </w:r>
+          </w:p>
+        </w:tc>
+        <w:tc>
+          <w:tcPr/>
+          <w:p>
+            <w:pPr>
+              <w:pStyle w:val="Compact"/>
+            </w:pPr>
+            <w:r>
+              <w:t xml:space="preserve">90</w:t>
+            </w:r>
+          </w:p>
+        </w:tc>
+        <w:tc>
+          <w:tcPr/>
+          <w:p>
+            <w:pPr>
+              <w:pStyle w:val="Compact"/>
+            </w:pPr>
+            <w:r>
+              <w:t xml:space="preserve">2,61 ([−1,73; 6,95]; 0,20)</w:t>
+            </w:r>
+          </w:p>
+        </w:tc>
+        <w:tc>
+          <w:tcPr/>
+          <w:p>
+            <w:pPr>
+              <w:pStyle w:val="Compact"/>
+            </w:pPr>
+            <w:r>
+              <w:t xml:space="preserve">0,23</w:t>
             </w:r>
           </w:p>
         </w:tc>
@@ -1087,50 +1810,6 @@
             </w:pPr>
             <w:r>
               <w:t xml:space="preserve">108</w:t>
-            </w:r>
-          </w:p>
-        </w:tc>
-        <w:tc>
-          <w:tcPr/>
-          <w:p>
-            <w:pPr>
-              <w:pStyle w:val="Compact"/>
-            </w:pPr>
-            <w:r>
-              <w:t xml:space="preserve">9</w:t>
-            </w:r>
-          </w:p>
-        </w:tc>
-        <w:tc>
-          <w:tcPr/>
-          <w:p>
-            <w:pPr>
-              <w:pStyle w:val="Compact"/>
-            </w:pPr>
-            <w:r>
-              <w:t xml:space="preserve">0,49</w:t>
-            </w:r>
-          </w:p>
-        </w:tc>
-        <w:tc>
-          <w:tcPr/>
-          <w:p>
-            <w:pPr>
-              <w:pStyle w:val="Compact"/>
-            </w:pPr>
-            <w:r>
-              <w:t xml:space="preserve">[0,34; 0,64]</w:t>
-            </w:r>
-          </w:p>
-        </w:tc>
-        <w:tc>
-          <w:tcPr/>
-          <w:p>
-            <w:pPr>
-              <w:pStyle w:val="Compact"/>
-            </w:pPr>
-            <w:r>
-              <w:t xml:space="preserve">&lt; 0,001</w:t>
             </w:r>
           </w:p>
         </w:tc>
@@ -1154,51 +1833,51 @@
               <w:pStyle w:val="Compact"/>
             </w:pPr>
             <w:r>
+              <w:t xml:space="preserve">−0,01 (0,77)</w:t>
+            </w:r>
+          </w:p>
+        </w:tc>
+        <w:tc>
+          <w:tcPr/>
+          <w:p>
+            <w:pPr>
+              <w:pStyle w:val="Compact"/>
+            </w:pPr>
+            <w:r>
+              <w:t xml:space="preserve">1.834</w:t>
+            </w:r>
+          </w:p>
+        </w:tc>
+        <w:tc>
+          <w:tcPr/>
+          <w:p>
+            <w:pPr>
+              <w:pStyle w:val="Compact"/>
+            </w:pPr>
+            <w:r>
+              <w:t xml:space="preserve">−0,0006 ([−0,27; 0,27]; 0,997)</w:t>
+            </w:r>
+          </w:p>
+        </w:tc>
+        <w:tc>
+          <w:tcPr/>
+          <w:p>
+            <w:pPr>
+              <w:pStyle w:val="Compact"/>
+            </w:pPr>
+            <w:r>
+              <w:t xml:space="preserve">—</w:t>
+            </w:r>
+          </w:p>
+        </w:tc>
+        <w:tc>
+          <w:tcPr/>
+          <w:p>
+            <w:pPr>
+              <w:pStyle w:val="Compact"/>
+            </w:pPr>
+            <w:r>
               <w:t xml:space="preserve">2.202</w:t>
-            </w:r>
-          </w:p>
-        </w:tc>
-        <w:tc>
-          <w:tcPr/>
-          <w:p>
-            <w:pPr>
-              <w:pStyle w:val="Compact"/>
-            </w:pPr>
-            <w:r>
-              <w:t xml:space="preserve">184</w:t>
-            </w:r>
-          </w:p>
-        </w:tc>
-        <w:tc>
-          <w:tcPr/>
-          <w:p>
-            <w:pPr>
-              <w:pStyle w:val="Compact"/>
-            </w:pPr>
-            <w:r>
-              <w:t xml:space="preserve">0,26</w:t>
-            </w:r>
-          </w:p>
-        </w:tc>
-        <w:tc>
-          <w:tcPr/>
-          <w:p>
-            <w:pPr>
-              <w:pStyle w:val="Compact"/>
-            </w:pPr>
-            <w:r>
-              <w:t xml:space="preserve">[0,20; 0,33]</w:t>
-            </w:r>
-          </w:p>
-        </w:tc>
-        <w:tc>
-          <w:tcPr/>
-          <w:p>
-            <w:pPr>
-              <w:pStyle w:val="Compact"/>
-            </w:pPr>
-            <w:r>
-              <w:t xml:space="preserve">&lt; 0,001</w:t>
             </w:r>
           </w:p>
         </w:tc>
@@ -1222,64 +1901,64 @@
               <w:pStyle w:val="Compact"/>
             </w:pPr>
             <w:r>
+              <w:t xml:space="preserve">0,04 (&lt; 0,001)</w:t>
+            </w:r>
+          </w:p>
+        </w:tc>
+        <w:tc>
+          <w:tcPr/>
+          <w:p>
+            <w:pPr>
+              <w:pStyle w:val="Compact"/>
+            </w:pPr>
+            <w:r>
+              <w:t xml:space="preserve">39.760</w:t>
+            </w:r>
+          </w:p>
+        </w:tc>
+        <w:tc>
+          <w:tcPr/>
+          <w:p>
+            <w:pPr>
+              <w:pStyle w:val="Compact"/>
+            </w:pPr>
+            <w:r>
+              <w:t xml:space="preserve">0,11 ([0,07; 0,16]; &lt; 0,001)</w:t>
+            </w:r>
+          </w:p>
+        </w:tc>
+        <w:tc>
+          <w:tcPr/>
+          <w:p>
+            <w:pPr>
+              <w:pStyle w:val="Compact"/>
+            </w:pPr>
+            <w:r>
+              <w:t xml:space="preserve">—</w:t>
+            </w:r>
+          </w:p>
+        </w:tc>
+        <w:tc>
+          <w:tcPr/>
+          <w:p>
+            <w:pPr>
+              <w:pStyle w:val="Compact"/>
+            </w:pPr>
+            <w:r>
               <w:t xml:space="preserve">48.695</w:t>
-            </w:r>
-          </w:p>
-        </w:tc>
-        <w:tc>
-          <w:tcPr/>
-          <w:p>
-            <w:pPr>
-              <w:pStyle w:val="Compact"/>
-            </w:pPr>
-            <w:r>
-              <w:t xml:space="preserve">5.360</w:t>
-            </w:r>
-          </w:p>
-        </w:tc>
-        <w:tc>
-          <w:tcPr/>
-          <w:p>
-            <w:pPr>
-              <w:pStyle w:val="Compact"/>
-            </w:pPr>
-            <w:r>
-              <w:t xml:space="preserve">0,46</w:t>
-            </w:r>
-          </w:p>
-        </w:tc>
-        <w:tc>
-          <w:tcPr/>
-          <w:p>
-            <w:pPr>
-              <w:pStyle w:val="Compact"/>
-            </w:pPr>
-            <w:r>
-              <w:t xml:space="preserve">[0,44; 0,47]</w:t>
-            </w:r>
-          </w:p>
-        </w:tc>
-        <w:tc>
-          <w:tcPr/>
-          <w:p>
-            <w:pPr>
-              <w:pStyle w:val="Compact"/>
-            </w:pPr>
-            <w:r>
-              <w:t xml:space="preserve">&lt; 0,001</w:t>
             </w:r>
           </w:p>
         </w:tc>
       </w:tr>
     </w:tbl>
-    <w:bookmarkEnd w:id="25"/>
-    <w:bookmarkStart w:id="26" w:name="h2-associação-dentro-das-unidades"/>
+    <w:bookmarkEnd w:id="23"/>
+    <w:bookmarkStart w:id="24" w:name="X25b1f22221eb48867ffad697f441343b62d7f93"/>
     <w:p>
       <w:pPr>
         <w:pStyle w:val="Heading3"/>
       </w:pPr>
       <w:r>
-        <w:t xml:space="preserve">4.2 H2 — associação dentro das unidades</w:t>
+        <w:t xml:space="preserve">4.3 Validação interna: estabilidade do sinal dentro da unidade</w:t>
       </w:r>
     </w:p>
     <w:p>
@@ -1287,332 +1966,79 @@
         <w:pStyle w:val="FirstParagraph"/>
       </w:pPr>
       <w:r>
-        <w:t xml:space="preserve">As primeiras diferenças dentro de município-etapa na microrregião foram nulas: r = −0,05 (p = 0,61; n = 90). O coeficiente de efeitos fixos de município e ano foi β = 2,61 (SE clusterizado 1,79; IC95% cluster [−1,51; 6,73]; p = 0,18; n = 108): positivo, mas não estatisticamente discernível de zero, mesmo com erros clusterizados. Para o Ceará, β = 0,001 (IC95% cluster [−0,26; 0,26]; p = 0,99). Para o Brasil, β = 0,11 (IC95% cluster [0,07; 0,15]; p &lt; 0,001): pequeno, embora discernível dado o enorme n. H2 se confirma na microrregião e no Ceará: dentro das unidades, a associação entre variação de renda e variação de IDEB não é discernível.</w:t>
-      </w:r>
-    </w:p>
-    <w:p>
-      <w:pPr>
-        <w:pStyle w:val="BodyText"/>
-      </w:pPr>
+        <w:t xml:space="preserve">A correlação</w:t>
+      </w:r>
+      <w:r>
+        <w:t xml:space="preserve"> </w:t>
+      </w:r>
+      <w:r>
+        <w:rPr>
+          <w:i/>
+          <w:iCs/>
+        </w:rPr>
+        <w:t xml:space="preserve">dentro</w:t>
+      </w:r>
+      <w:r>
+        <w:t xml:space="preserve"> </w:t>
+      </w:r>
+      <w:r>
+        <w:t xml:space="preserve">de cada município retido (12 observações em níveis) foi positiva em 9/9 municípios (100%), com média r = 0,44 (mediana 0,46; DP 0,20). Os valores variam de 0,08 (Quiterianópolis) a 0,72 (Ararendá). Essa estabilidade reflete</w:t>
+      </w:r>
+      <w:r>
+        <w:t xml:space="preserve"> </w:t>
+      </w:r>
       <w:r>
         <w:rPr>
           <w:b/>
           <w:bCs/>
         </w:rPr>
-        <w:t xml:space="preserve">Tabela 2 — Associação dentro das unidades por escala</w:t>
+        <w:t xml:space="preserve">co-tendência temporal</w:t>
+      </w:r>
+      <w:r>
+        <w:t xml:space="preserve"> </w:t>
+      </w:r>
+      <w:r>
+        <w:t xml:space="preserve">de IDEB e renda dentro da unidade e não replica a associação transversal entre municípios: trata-se de validação</w:t>
+      </w:r>
+      <w:r>
+        <w:t xml:space="preserve"> </w:t>
+      </w:r>
+      <w:r>
+        <w:rPr>
+          <w:b/>
+          <w:bCs/>
+        </w:rPr>
+        <w:t xml:space="preserve">interna</w:t>
+      </w:r>
+      <w:r>
+        <w:t xml:space="preserve">, não de validação externa nem de réplica da dimensão entre unidades (Figuras 2 e 3).</w:t>
       </w:r>
     </w:p>
     <w:tbl>
       <w:tblPr>
-        <w:tblStyle w:val="Table"/>
-        <w:tblW w:type="pct" w:w="5000"/>
-        <w:tblLayout w:type="fixed"/>
-        <w:tblLook w:firstRow="1" w:lastRow="0" w:firstColumn="0" w:lastColumn="0" w:noHBand="0" w:noVBand="0" w:val="0020"/>
+        <w:tblStyle w:val="FigureTable"/>
+        <w:tblW w:type="auto" w:w="0"/>
+        <w:jc w:val="center"/>
+        <w:tblLook w:firstRow="0" w:lastRow="0" w:firstColumn="0" w:lastColumn="0"/>
       </w:tblPr>
       <w:tblGrid>
-        <w:gridCol w:w="1584"/>
-        <w:gridCol w:w="1584"/>
-        <w:gridCol w:w="1584"/>
-        <w:gridCol w:w="1584"/>
-        <w:gridCol w:w="1584"/>
+        <w:gridCol w:w="7920"/>
       </w:tblGrid>
       <w:tr>
-        <w:trPr>
-          <w:tblHeader w:val="on"/>
-        </w:trPr>
-        <w:tc>
-          <w:tcPr/>
-          <w:p>
-            <w:pPr>
-              <w:pStyle w:val="Compact"/>
-            </w:pPr>
-            <w:r>
-              <w:t xml:space="preserve">Escala</w:t>
-            </w:r>
-          </w:p>
-        </w:tc>
-        <w:tc>
-          <w:tcPr/>
-          <w:p>
-            <w:pPr>
-              <w:pStyle w:val="Compact"/>
-            </w:pPr>
-            <w:r>
-              <w:t xml:space="preserve">1ª diferenças r (p)</w:t>
-            </w:r>
-          </w:p>
-        </w:tc>
-        <w:tc>
-          <w:tcPr/>
-          <w:p>
-            <w:pPr>
-              <w:pStyle w:val="Compact"/>
-            </w:pPr>
-            <w:r>
-              <w:t xml:space="preserve">n (1ª dif.)</w:t>
-            </w:r>
-          </w:p>
-        </w:tc>
-        <w:tc>
-          <w:tcPr/>
-          <w:p>
-            <w:pPr>
-              <w:pStyle w:val="Compact"/>
-            </w:pPr>
-            <w:r>
-              <w:t xml:space="preserve">FE β (IC95% cluster)</w:t>
-            </w:r>
-          </w:p>
-        </w:tc>
-        <w:tc>
-          <w:tcPr/>
-          <w:p>
-            <w:pPr>
-              <w:pStyle w:val="Compact"/>
-            </w:pPr>
-            <w:r>
-              <w:t xml:space="preserve">n (FE)</w:t>
-            </w:r>
-          </w:p>
-        </w:tc>
-      </w:tr>
-      <w:tr>
-        <w:tc>
-          <w:tcPr/>
-          <w:p>
-            <w:pPr>
-              <w:pStyle w:val="Compact"/>
-            </w:pPr>
-            <w:r>
-              <w:t xml:space="preserve">Microrregião Sertão de Cratéus</w:t>
-            </w:r>
-          </w:p>
-        </w:tc>
-        <w:tc>
-          <w:tcPr/>
-          <w:p>
-            <w:pPr>
-              <w:pStyle w:val="Compact"/>
-            </w:pPr>
-            <w:r>
-              <w:t xml:space="preserve">−0,05 (0,61)</w:t>
-            </w:r>
-          </w:p>
-        </w:tc>
-        <w:tc>
-          <w:tcPr/>
-          <w:p>
-            <w:pPr>
-              <w:pStyle w:val="Compact"/>
-            </w:pPr>
-            <w:r>
-              <w:t xml:space="preserve">90</w:t>
-            </w:r>
-          </w:p>
-        </w:tc>
-        <w:tc>
-          <w:tcPr/>
-          <w:p>
-            <w:pPr>
-              <w:pStyle w:val="Compact"/>
-            </w:pPr>
-            <w:r>
-              <w:t xml:space="preserve">2,61 ([−1,51; 6,73])</w:t>
-            </w:r>
-          </w:p>
-        </w:tc>
-        <w:tc>
-          <w:tcPr/>
-          <w:p>
-            <w:pPr>
-              <w:pStyle w:val="Compact"/>
-            </w:pPr>
-            <w:r>
-              <w:t xml:space="preserve">108</w:t>
-            </w:r>
-          </w:p>
-        </w:tc>
-      </w:tr>
-      <w:tr>
-        <w:tc>
-          <w:tcPr/>
-          <w:p>
-            <w:pPr>
-              <w:pStyle w:val="Compact"/>
-            </w:pPr>
-            <w:r>
-              <w:t xml:space="preserve">Ceará</w:t>
-            </w:r>
-          </w:p>
-        </w:tc>
-        <w:tc>
-          <w:tcPr/>
-          <w:p>
-            <w:pPr>
-              <w:pStyle w:val="Compact"/>
-            </w:pPr>
-            <w:r>
-              <w:t xml:space="preserve">0,03 (0,27)</w:t>
-            </w:r>
-          </w:p>
-        </w:tc>
-        <w:tc>
-          <w:tcPr/>
-          <w:p>
-            <w:pPr>
-              <w:pStyle w:val="Compact"/>
-            </w:pPr>
-            <w:r>
-              <w:t xml:space="preserve">1.834</w:t>
-            </w:r>
-          </w:p>
-        </w:tc>
-        <w:tc>
-          <w:tcPr/>
-          <w:p>
-            <w:pPr>
-              <w:pStyle w:val="Compact"/>
-            </w:pPr>
-            <w:r>
-              <w:t xml:space="preserve">0,001 ([−0,26; 0,26])</w:t>
-            </w:r>
-          </w:p>
-        </w:tc>
-        <w:tc>
-          <w:tcPr/>
-          <w:p>
-            <w:pPr>
-              <w:pStyle w:val="Compact"/>
-            </w:pPr>
-            <w:r>
-              <w:t xml:space="preserve">2.202</w:t>
-            </w:r>
-          </w:p>
-        </w:tc>
-      </w:tr>
-      <w:tr>
-        <w:tc>
-          <w:tcPr/>
-          <w:p>
-            <w:pPr>
-              <w:pStyle w:val="Compact"/>
-            </w:pPr>
-            <w:r>
-              <w:t xml:space="preserve">Brasil</w:t>
-            </w:r>
-          </w:p>
-        </w:tc>
-        <w:tc>
-          <w:tcPr/>
-          <w:p>
-            <w:pPr>
-              <w:pStyle w:val="Compact"/>
-            </w:pPr>
-            <w:r>
-              <w:t xml:space="preserve">0,06 (&lt; 0,001)</w:t>
-            </w:r>
-          </w:p>
-        </w:tc>
-        <w:tc>
-          <w:tcPr/>
-          <w:p>
-            <w:pPr>
-              <w:pStyle w:val="Compact"/>
-            </w:pPr>
-            <w:r>
-              <w:t xml:space="preserve">39.760</w:t>
-            </w:r>
-          </w:p>
-        </w:tc>
-        <w:tc>
-          <w:tcPr/>
-          <w:p>
-            <w:pPr>
-              <w:pStyle w:val="Compact"/>
-            </w:pPr>
-            <w:r>
-              <w:t xml:space="preserve">0,11 ([0,07; 0,15])</w:t>
-            </w:r>
-          </w:p>
-        </w:tc>
-        <w:tc>
-          <w:tcPr/>
-          <w:p>
-            <w:pPr>
-              <w:pStyle w:val="Compact"/>
-            </w:pPr>
-            <w:r>
-              <w:t xml:space="preserve">48.695</w:t>
+        <w:tc>
+          <w:tcPr/>
+          <w:p>
+            <w:pPr>
+              <w:pStyle w:val="Compact"/>
+              <w:jc w:val="center"/>
+            </w:pPr>
+            <w:r>
+              <w:t xml:space="preserve">Figura 2 — Trajetória do IDEB por município, 2007–2025 (anos iniciais e finais).</w:t>
             </w:r>
           </w:p>
         </w:tc>
       </w:tr>
     </w:tbl>
-    <w:bookmarkEnd w:id="26"/>
-    <w:bookmarkStart w:id="33" w:name="Xbe2b44eac008592f99ff6f32afd2a0343eab255"/>
-    <w:p>
-      <w:pPr>
-        <w:pStyle w:val="Heading3"/>
-      </w:pPr>
-      <w:r>
-        <w:t xml:space="preserve">4.3 Validação cruzada leave-one-out por município</w:t>
-      </w:r>
-    </w:p>
-    <w:p>
-      <w:pPr>
-        <w:pStyle w:val="FirstParagraph"/>
-      </w:pPr>
-      <w:r>
-        <w:t xml:space="preserve">A correlação de níveis estimada fora da amostra (treino nos oito municípios restantes, teste no município retido) foi positiva em 9/9 municípios (100%), com mediana r = 0,62 (média 0,65; DP 0,11). Os r de teste por município variaram de 0,43 (Quiterianópolis) a 0,81 (Ararendá). A associação em níveis não depende de um único município: é replicável em todos os nove (Figuras 2 e 3).</w:t>
-      </w:r>
-    </w:p>
-    <w:p>
-      <w:pPr>
-        <w:pStyle w:val="CaptionedFigure"/>
-      </w:pPr>
-      <w:r>
-        <w:drawing>
-          <wp:inline>
-            <wp:extent cx="5753100" cy="2520405"/>
-            <wp:effectExtent b="0" l="0" r="0" t="0"/>
-            <wp:docPr descr="Figura 2 — Trajetória do IDEB por município, 2007–2025 (anos iniciais e finais)." title="" id="28" name="Picture"/>
-            <a:graphic>
-              <a:graphicData uri="http://schemas.openxmlformats.org/drawingml/2006/picture">
-                <pic:pic>
-                  <pic:nvPicPr>
-                    <pic:cNvPr descr="outputs/figuras/fig_serie_ideb_micro.png" id="29" name="Picture"/>
-                    <pic:cNvPicPr>
-                      <a:picLocks noChangeArrowheads="1" noChangeAspect="1"/>
-                    </pic:cNvPicPr>
-                  </pic:nvPicPr>
-                  <pic:blipFill>
-                    <a:blip r:embed="rId27"/>
-                    <a:stretch>
-                      <a:fillRect/>
-                    </a:stretch>
-                  </pic:blipFill>
-                  <pic:spPr bwMode="auto">
-                    <a:xfrm>
-                      <a:off x="0" y="0"/>
-                      <a:ext cx="5753100" cy="2520405"/>
-                    </a:xfrm>
-                    <a:prstGeom prst="rect">
-                      <a:avLst/>
-                    </a:prstGeom>
-                    <a:noFill/>
-                    <a:ln w="9525">
-                      <a:noFill/>
-                      <a:headEnd/>
-                      <a:tailEnd/>
-                    </a:ln>
-                  </pic:spPr>
-                </pic:pic>
-              </a:graphicData>
-            </a:graphic>
-          </wp:inline>
-        </w:drawing>
-      </w:r>
-    </w:p>
     <w:p>
       <w:pPr>
         <w:pStyle w:val="ImageCaption"/>
@@ -1621,59 +2047,37 @@
         <w:t xml:space="preserve">Figura 2 — Trajetória do IDEB por município, 2007–2025 (anos iniciais e finais).</w:t>
       </w:r>
     </w:p>
-    <w:p>
-      <w:pPr>
-        <w:pStyle w:val="CaptionedFigure"/>
-      </w:pPr>
-      <w:r>
-        <w:drawing>
-          <wp:inline>
-            <wp:extent cx="5753100" cy="3179344"/>
-            <wp:effectExtent b="0" l="0" r="0" t="0"/>
-            <wp:docPr descr="Figura 3 — Validação cruzada leave-one-out: r de teste por município retido." title="" id="31" name="Picture"/>
-            <a:graphic>
-              <a:graphicData uri="http://schemas.openxmlformats.org/drawingml/2006/picture">
-                <pic:pic>
-                  <pic:nvPicPr>
-                    <pic:cNvPr descr="outputs/figuras/fig_loocv_r_teste.png" id="32" name="Picture"/>
-                    <pic:cNvPicPr>
-                      <a:picLocks noChangeArrowheads="1" noChangeAspect="1"/>
-                    </pic:cNvPicPr>
-                  </pic:nvPicPr>
-                  <pic:blipFill>
-                    <a:blip r:embed="rId30"/>
-                    <a:stretch>
-                      <a:fillRect/>
-                    </a:stretch>
-                  </pic:blipFill>
-                  <pic:spPr bwMode="auto">
-                    <a:xfrm>
-                      <a:off x="0" y="0"/>
-                      <a:ext cx="5753100" cy="3179344"/>
-                    </a:xfrm>
-                    <a:prstGeom prst="rect">
-                      <a:avLst/>
-                    </a:prstGeom>
-                    <a:noFill/>
-                    <a:ln w="9525">
-                      <a:noFill/>
-                      <a:headEnd/>
-                      <a:tailEnd/>
-                    </a:ln>
-                  </pic:spPr>
-                </pic:pic>
-              </a:graphicData>
-            </a:graphic>
-          </wp:inline>
-        </w:drawing>
-      </w:r>
-    </w:p>
+    <w:tbl>
+      <w:tblPr>
+        <w:tblStyle w:val="FigureTable"/>
+        <w:tblW w:type="auto" w:w="0"/>
+        <w:jc w:val="center"/>
+        <w:tblLook w:firstRow="0" w:lastRow="0" w:firstColumn="0" w:lastColumn="0"/>
+      </w:tblPr>
+      <w:tblGrid>
+        <w:gridCol w:w="7920"/>
+      </w:tblGrid>
+      <w:tr>
+        <w:tc>
+          <w:tcPr/>
+          <w:p>
+            <w:pPr>
+              <w:pStyle w:val="Compact"/>
+              <w:jc w:val="center"/>
+            </w:pPr>
+            <w:r>
+              <w:t xml:space="preserve">Figura 3 — Validação interna: correlação dentro do município retido (r em níveis).</w:t>
+            </w:r>
+          </w:p>
+        </w:tc>
+      </w:tr>
+    </w:tbl>
     <w:p>
       <w:pPr>
         <w:pStyle w:val="ImageCaption"/>
       </w:pPr>
       <w:r>
-        <w:t xml:space="preserve">Figura 3 — Validação cruzada leave-one-out: r de teste por município retido.</w:t>
+        <w:t xml:space="preserve">Figura 3 — Validação interna: correlação dentro do município retido (r em níveis).</w:t>
       </w:r>
     </w:p>
     <w:p>
@@ -1685,7 +2089,7 @@
           <w:b/>
           <w:bCs/>
         </w:rPr>
-        <w:t xml:space="preserve">Tabela 3 — Validação cruzada leave-one-out por município (r de teste)</w:t>
+        <w:t xml:space="preserve">Tabela 3 — Validação interna por município (r dentro da unidade, 12 observações)</w:t>
       </w:r>
     </w:p>
     <w:tbl>
@@ -1711,40 +2115,40 @@
               <w:pStyle w:val="Compact"/>
             </w:pPr>
             <w:r>
-              <w:t xml:space="preserve">Município retido</w:t>
-            </w:r>
-          </w:p>
-        </w:tc>
-        <w:tc>
-          <w:tcPr/>
-          <w:p>
-            <w:pPr>
-              <w:pStyle w:val="Compact"/>
-            </w:pPr>
-            <w:r>
-              <w:t xml:space="preserve">r treino</w:t>
-            </w:r>
-          </w:p>
-        </w:tc>
-        <w:tc>
-          <w:tcPr/>
-          <w:p>
-            <w:pPr>
-              <w:pStyle w:val="Compact"/>
-            </w:pPr>
-            <w:r>
-              <w:t xml:space="preserve">r teste</w:t>
-            </w:r>
-          </w:p>
-        </w:tc>
-        <w:tc>
-          <w:tcPr/>
-          <w:p>
-            <w:pPr>
-              <w:pStyle w:val="Compact"/>
-            </w:pPr>
-            <w:r>
-              <w:t xml:space="preserve">n teste</w:t>
+              <w:t xml:space="preserve">Município</w:t>
+            </w:r>
+          </w:p>
+        </w:tc>
+        <w:tc>
+          <w:tcPr/>
+          <w:p>
+            <w:pPr>
+              <w:pStyle w:val="Compact"/>
+            </w:pPr>
+            <w:r>
+              <w:t xml:space="preserve">r dentro</w:t>
+            </w:r>
+          </w:p>
+        </w:tc>
+        <w:tc>
+          <w:tcPr/>
+          <w:p>
+            <w:pPr>
+              <w:pStyle w:val="Compact"/>
+            </w:pPr>
+            <w:r>
+              <w:t xml:space="preserve">Município</w:t>
+            </w:r>
+          </w:p>
+        </w:tc>
+        <w:tc>
+          <w:tcPr/>
+          <w:p>
+            <w:pPr>
+              <w:pStyle w:val="Compact"/>
+            </w:pPr>
+            <w:r>
+              <w:t xml:space="preserve">r dentro</w:t>
             </w:r>
           </w:p>
         </w:tc>
@@ -1768,29 +2172,29 @@
               <w:pStyle w:val="Compact"/>
             </w:pPr>
             <w:r>
-              <w:t xml:space="preserve">0,50</w:t>
-            </w:r>
-          </w:p>
-        </w:tc>
-        <w:tc>
-          <w:tcPr/>
-          <w:p>
-            <w:pPr>
-              <w:pStyle w:val="Compact"/>
-            </w:pPr>
-            <w:r>
-              <w:t xml:space="preserve">0,81</w:t>
-            </w:r>
-          </w:p>
-        </w:tc>
-        <w:tc>
-          <w:tcPr/>
-          <w:p>
-            <w:pPr>
-              <w:pStyle w:val="Compact"/>
-            </w:pPr>
-            <w:r>
-              <w:t xml:space="preserve">12</w:t>
+              <w:t xml:space="preserve">0,72</w:t>
+            </w:r>
+          </w:p>
+        </w:tc>
+        <w:tc>
+          <w:tcPr/>
+          <w:p>
+            <w:pPr>
+              <w:pStyle w:val="Compact"/>
+            </w:pPr>
+            <w:r>
+              <w:t xml:space="preserve">Nova Russas</w:t>
+            </w:r>
+          </w:p>
+        </w:tc>
+        <w:tc>
+          <w:tcPr/>
+          <w:p>
+            <w:pPr>
+              <w:pStyle w:val="Compact"/>
+            </w:pPr>
+            <w:r>
+              <w:t xml:space="preserve">0,65</w:t>
             </w:r>
           </w:p>
         </w:tc>
@@ -1814,29 +2218,29 @@
               <w:pStyle w:val="Compact"/>
             </w:pPr>
             <w:r>
-              <w:t xml:space="preserve">0,57</w:t>
-            </w:r>
-          </w:p>
-        </w:tc>
-        <w:tc>
-          <w:tcPr/>
-          <w:p>
-            <w:pPr>
-              <w:pStyle w:val="Compact"/>
-            </w:pPr>
-            <w:r>
-              <w:t xml:space="preserve">0,59</w:t>
-            </w:r>
-          </w:p>
-        </w:tc>
-        <w:tc>
-          <w:tcPr/>
-          <w:p>
-            <w:pPr>
-              <w:pStyle w:val="Compact"/>
-            </w:pPr>
-            <w:r>
-              <w:t xml:space="preserve">12</w:t>
+              <w:t xml:space="preserve">0,51</w:t>
+            </w:r>
+          </w:p>
+        </w:tc>
+        <w:tc>
+          <w:tcPr/>
+          <w:p>
+            <w:pPr>
+              <w:pStyle w:val="Compact"/>
+            </w:pPr>
+            <w:r>
+              <w:t xml:space="preserve">Novo Oriente</w:t>
+            </w:r>
+          </w:p>
+        </w:tc>
+        <w:tc>
+          <w:tcPr/>
+          <w:p>
+            <w:pPr>
+              <w:pStyle w:val="Compact"/>
+            </w:pPr>
+            <w:r>
+              <w:t xml:space="preserve">0,27</w:t>
             </w:r>
           </w:p>
         </w:tc>
@@ -1860,29 +2264,29 @@
               <w:pStyle w:val="Compact"/>
             </w:pPr>
             <w:r>
-              <w:t xml:space="preserve">0,46</w:t>
-            </w:r>
-          </w:p>
-        </w:tc>
-        <w:tc>
-          <w:tcPr/>
-          <w:p>
-            <w:pPr>
-              <w:pStyle w:val="Compact"/>
-            </w:pPr>
-            <w:r>
-              <w:t xml:space="preserve">0,62</w:t>
-            </w:r>
-          </w:p>
-        </w:tc>
-        <w:tc>
-          <w:tcPr/>
-          <w:p>
-            <w:pPr>
-              <w:pStyle w:val="Compact"/>
-            </w:pPr>
-            <w:r>
-              <w:t xml:space="preserve">12</w:t>
+              <w:t xml:space="preserve">0,30</w:t>
+            </w:r>
+          </w:p>
+        </w:tc>
+        <w:tc>
+          <w:tcPr/>
+          <w:p>
+            <w:pPr>
+              <w:pStyle w:val="Compact"/>
+            </w:pPr>
+            <w:r>
+              <w:t xml:space="preserve">Quiterianópolis</w:t>
+            </w:r>
+          </w:p>
+        </w:tc>
+        <w:tc>
+          <w:tcPr/>
+          <w:p>
+            <w:pPr>
+              <w:pStyle w:val="Compact"/>
+            </w:pPr>
+            <w:r>
+              <w:t xml:space="preserve">0,08</w:t>
             </w:r>
           </w:p>
         </w:tc>
@@ -1906,29 +2310,29 @@
               <w:pStyle w:val="Compact"/>
             </w:pPr>
             <w:r>
-              <w:t xml:space="preserve">0,48</w:t>
-            </w:r>
-          </w:p>
-        </w:tc>
-        <w:tc>
-          <w:tcPr/>
-          <w:p>
-            <w:pPr>
-              <w:pStyle w:val="Compact"/>
-            </w:pPr>
-            <w:r>
-              <w:t xml:space="preserve">0,62</w:t>
-            </w:r>
-          </w:p>
-        </w:tc>
-        <w:tc>
-          <w:tcPr/>
-          <w:p>
-            <w:pPr>
-              <w:pStyle w:val="Compact"/>
-            </w:pPr>
-            <w:r>
-              <w:t xml:space="preserve">12</w:t>
+              <w:t xml:space="preserve">0,46</w:t>
+            </w:r>
+          </w:p>
+        </w:tc>
+        <w:tc>
+          <w:tcPr/>
+          <w:p>
+            <w:pPr>
+              <w:pStyle w:val="Compact"/>
+            </w:pPr>
+            <w:r>
+              <w:t xml:space="preserve">Tamboril</w:t>
+            </w:r>
+          </w:p>
+        </w:tc>
+        <w:tc>
+          <w:tcPr/>
+          <w:p>
+            <w:pPr>
+              <w:pStyle w:val="Compact"/>
+            </w:pPr>
+            <w:r>
+              <w:t xml:space="preserve">0,67</w:t>
             </w:r>
           </w:p>
         </w:tc>
@@ -1952,220 +2356,30 @@
               <w:pStyle w:val="Compact"/>
             </w:pPr>
             <w:r>
-              <w:t xml:space="preserve">0,46</w:t>
-            </w:r>
-          </w:p>
-        </w:tc>
-        <w:tc>
-          <w:tcPr/>
-          <w:p>
-            <w:pPr>
-              <w:pStyle w:val="Compact"/>
-            </w:pPr>
-            <w:r>
-              <w:t xml:space="preserve">0,74</w:t>
-            </w:r>
-          </w:p>
-        </w:tc>
-        <w:tc>
-          <w:tcPr/>
-          <w:p>
-            <w:pPr>
-              <w:pStyle w:val="Compact"/>
-            </w:pPr>
-            <w:r>
-              <w:t xml:space="preserve">12</w:t>
-            </w:r>
-          </w:p>
-        </w:tc>
-      </w:tr>
-      <w:tr>
-        <w:tc>
-          <w:tcPr/>
-          <w:p>
-            <w:pPr>
-              <w:pStyle w:val="Compact"/>
-            </w:pPr>
-            <w:r>
-              <w:t xml:space="preserve">Nova Russas</w:t>
-            </w:r>
-          </w:p>
-        </w:tc>
-        <w:tc>
-          <w:tcPr/>
-          <w:p>
-            <w:pPr>
-              <w:pStyle w:val="Compact"/>
-            </w:pPr>
-            <w:r>
-              <w:t xml:space="preserve">0,49</w:t>
-            </w:r>
-          </w:p>
-        </w:tc>
-        <w:tc>
-          <w:tcPr/>
-          <w:p>
-            <w:pPr>
-              <w:pStyle w:val="Compact"/>
-            </w:pPr>
-            <w:r>
-              <w:t xml:space="preserve">0,76</w:t>
-            </w:r>
-          </w:p>
-        </w:tc>
-        <w:tc>
-          <w:tcPr/>
-          <w:p>
-            <w:pPr>
-              <w:pStyle w:val="Compact"/>
-            </w:pPr>
-            <w:r>
-              <w:t xml:space="preserve">12</w:t>
-            </w:r>
-          </w:p>
-        </w:tc>
-      </w:tr>
-      <w:tr>
-        <w:tc>
-          <w:tcPr/>
-          <w:p>
-            <w:pPr>
-              <w:pStyle w:val="Compact"/>
-            </w:pPr>
-            <w:r>
-              <w:t xml:space="preserve">Novo Oriente</w:t>
-            </w:r>
-          </w:p>
-        </w:tc>
-        <w:tc>
-          <w:tcPr/>
-          <w:p>
-            <w:pPr>
-              <w:pStyle w:val="Compact"/>
-            </w:pPr>
-            <w:r>
-              <w:t xml:space="preserve">0,51</w:t>
-            </w:r>
-          </w:p>
-        </w:tc>
-        <w:tc>
-          <w:tcPr/>
-          <w:p>
-            <w:pPr>
-              <w:pStyle w:val="Compact"/>
-            </w:pPr>
-            <w:r>
-              <w:t xml:space="preserve">0,61</w:t>
-            </w:r>
-          </w:p>
-        </w:tc>
-        <w:tc>
-          <w:tcPr/>
-          <w:p>
-            <w:pPr>
-              <w:pStyle w:val="Compact"/>
-            </w:pPr>
-            <w:r>
-              <w:t xml:space="preserve">12</w:t>
-            </w:r>
-          </w:p>
-        </w:tc>
-      </w:tr>
-      <w:tr>
-        <w:tc>
-          <w:tcPr/>
-          <w:p>
-            <w:pPr>
-              <w:pStyle w:val="Compact"/>
-            </w:pPr>
-            <w:r>
-              <w:t xml:space="preserve">Quiterianópolis</w:t>
-            </w:r>
-          </w:p>
-        </w:tc>
-        <w:tc>
-          <w:tcPr/>
-          <w:p>
-            <w:pPr>
-              <w:pStyle w:val="Compact"/>
-            </w:pPr>
-            <w:r>
-              <w:t xml:space="preserve">0,49</w:t>
-            </w:r>
-          </w:p>
-        </w:tc>
-        <w:tc>
-          <w:tcPr/>
-          <w:p>
-            <w:pPr>
-              <w:pStyle w:val="Compact"/>
-            </w:pPr>
-            <w:r>
-              <w:t xml:space="preserve">0,43</w:t>
-            </w:r>
-          </w:p>
-        </w:tc>
-        <w:tc>
-          <w:tcPr/>
-          <w:p>
-            <w:pPr>
-              <w:pStyle w:val="Compact"/>
-            </w:pPr>
-            <w:r>
-              <w:t xml:space="preserve">12</w:t>
-            </w:r>
-          </w:p>
-        </w:tc>
-      </w:tr>
-      <w:tr>
-        <w:tc>
-          <w:tcPr/>
-          <w:p>
-            <w:pPr>
-              <w:pStyle w:val="Compact"/>
-            </w:pPr>
-            <w:r>
-              <w:t xml:space="preserve">Tamboril</w:t>
-            </w:r>
-          </w:p>
-        </w:tc>
-        <w:tc>
-          <w:tcPr/>
-          <w:p>
-            <w:pPr>
-              <w:pStyle w:val="Compact"/>
-            </w:pPr>
-            <w:r>
-              <w:t xml:space="preserve">0,46</w:t>
-            </w:r>
-          </w:p>
-        </w:tc>
-        <w:tc>
-          <w:tcPr/>
-          <w:p>
-            <w:pPr>
-              <w:pStyle w:val="Compact"/>
-            </w:pPr>
-            <w:r>
-              <w:t xml:space="preserve">0,71</w:t>
-            </w:r>
-          </w:p>
-        </w:tc>
-        <w:tc>
-          <w:tcPr/>
-          <w:p>
-            <w:pPr>
-              <w:pStyle w:val="Compact"/>
-            </w:pPr>
-            <w:r>
-              <w:t xml:space="preserve">12</w:t>
-            </w:r>
+              <w:t xml:space="preserve">0,32</w:t>
+            </w:r>
+          </w:p>
+        </w:tc>
+        <w:tc>
+          <w:tcPr/>
+          <w:p>
+            <w:pPr>
+              <w:pStyle w:val="Compact"/>
+            </w:pPr>
+          </w:p>
+        </w:tc>
+        <w:tc>
+          <w:tcPr/>
+          <w:p>
+            <w:pPr>
+              <w:pStyle w:val="Compact"/>
+            </w:pPr>
           </w:p>
         </w:tc>
       </w:tr>
     </w:tbl>
-    <w:bookmarkEnd w:id="33"/>
-    <w:bookmarkStart w:id="34" w:name="mdes-e-tost"/>
+    <w:bookmarkEnd w:id="24"/>
+    <w:bookmarkStart w:id="25" w:name="mdes-e-tost"/>
     <w:p>
       <w:pPr>
         <w:pStyle w:val="Heading3"/>
@@ -2179,7 +2393,7 @@
         <w:pStyle w:val="FirstParagraph"/>
       </w:pPr>
       <w:r>
-        <w:t xml:space="preserve">Com n municipal de 9 e 108 observações, o mínimo efeito detectável foi de 5,71 pontos de IDEB por unidade de log do PIB (erro clusterizado, G−1 = 8 graus de liberdade; 6,05 com erro homocedástico) — muito acima de qualquer coeficiente plausível. O teste de equivalência (TOST, margem ±0,10) não foi significativo (p = 0,90). Portanto, o correto é declarar</w:t>
+        <w:t xml:space="preserve">Com n municipal de 9 e 108 observações, o mínimo efeito detectável foi de 6,01 pontos de IDEB por unidade de log do PIB real (erro clusterizado, G−1 = 8 graus de liberdade; 3,63 com erro homocedástico) — muito acima de qualquer coeficiente plausível. Traduzido em termos substantivos: o estudo</w:t>
       </w:r>
       <w:r>
         <w:t xml:space="preserve"> </w:t>
@@ -2189,28 +2403,13 @@
           <w:b/>
           <w:bCs/>
         </w:rPr>
-        <w:t xml:space="preserve">não-detecção</w:t>
-      </w:r>
-      <w:r>
-        <w:t xml:space="preserve">: a amostra não permite afirmar efeito, mas tampouco permite declarar equivalência. Essa é uma limitação central, explicitamente assumida.</w:t>
-      </w:r>
-    </w:p>
-    <w:bookmarkEnd w:id="34"/>
-    <w:bookmarkStart w:id="38" w:name="h3-ganho-educacional-e-metas"/>
-    <w:p>
-      <w:pPr>
-        <w:pStyle w:val="Heading3"/>
-      </w:pPr>
-      <w:r>
-        <w:t xml:space="preserve">4.5 H3 — ganho educacional e metas</w:t>
-      </w:r>
-    </w:p>
-    <w:p>
-      <w:pPr>
-        <w:pStyle w:val="FirstParagraph"/>
-      </w:pPr>
-      <w:r>
-        <w:t xml:space="preserve">Contrariando a premissa de estagnação, os dados INEP 2025 mostram crescimento expressivo do IDEB nos nove municípios (anos iniciais, 2007→2025): ganho médio de 5,93 pontos, com todos os municípios</w:t>
+        <w:t xml:space="preserve">não detectaria</w:t>
+      </w:r>
+      <w:r>
+        <w:t xml:space="preserve"> </w:t>
+      </w:r>
+      <w:r>
+        <w:t xml:space="preserve">um efeito de +10% de crescimento do PIB per capita real que movesse o IDEB em cerca de 0,57 ponto. O teste de equivalência (TOST) com margem substantiva ±0,5 ponto não foi significativo (p = 0,85; com margem ±0,10, p = 0,89). Portanto, o correto é declarar</w:t>
       </w:r>
       <w:r>
         <w:t xml:space="preserve"> </w:t>
@@ -2220,59 +2419,97 @@
           <w:b/>
           <w:bCs/>
         </w:rPr>
-        <w:t xml:space="preserve">acima da meta pactuada para 2021</w:t>
-      </w:r>
-      <w:r>
-        <w:t xml:space="preserve">. O IDEB 2025 em anos iniciais variou de 6,8 (Quiterianópolis) a 9,9 (Ipaporanga), valores superiores à média nacional da rede municipal. Em anos finais, todos os nove municípios também atingiram a meta 2021. A correlação entre ganho de IDEB (anos iniciais) e renda média do responsável foi nula: r = −0,14 (p = 0,73; n = 9; Figura 4). Ou seja: não há evidência de que municípios com maior renda tenham tido maior ganho educacional — o crescimento ocorreu de forma generalizada e não acompanhou a variação de renda.</w:t>
-      </w:r>
-    </w:p>
-    <w:p>
-      <w:pPr>
-        <w:pStyle w:val="CaptionedFigure"/>
-      </w:pPr>
-      <w:r>
-        <w:drawing>
-          <wp:inline>
-            <wp:extent cx="5753100" cy="3835400"/>
-            <wp:effectExtent b="0" l="0" r="0" t="0"/>
-            <wp:docPr descr="Figura 4 — Ganho de IDEB (2007→2025, anos iniciais) e renda média do responsável (Censo 2022)." title="" id="36" name="Picture"/>
-            <a:graphic>
-              <a:graphicData uri="http://schemas.openxmlformats.org/drawingml/2006/picture">
-                <pic:pic>
-                  <pic:nvPicPr>
-                    <pic:cNvPr descr="outputs/figuras/fig_scatter_ganho_renda.png" id="37" name="Picture"/>
-                    <pic:cNvPicPr>
-                      <a:picLocks noChangeArrowheads="1" noChangeAspect="1"/>
-                    </pic:cNvPicPr>
-                  </pic:nvPicPr>
-                  <pic:blipFill>
-                    <a:blip r:embed="rId35"/>
-                    <a:stretch>
-                      <a:fillRect/>
-                    </a:stretch>
-                  </pic:blipFill>
-                  <pic:spPr bwMode="auto">
-                    <a:xfrm>
-                      <a:off x="0" y="0"/>
-                      <a:ext cx="5753100" cy="3835400"/>
-                    </a:xfrm>
-                    <a:prstGeom prst="rect">
-                      <a:avLst/>
-                    </a:prstGeom>
-                    <a:noFill/>
-                    <a:ln w="9525">
-                      <a:noFill/>
-                      <a:headEnd/>
-                      <a:tailEnd/>
-                    </a:ln>
-                  </pic:spPr>
-                </pic:pic>
-              </a:graphicData>
-            </a:graphic>
-          </wp:inline>
-        </w:drawing>
-      </w:r>
-    </w:p>
+        <w:t xml:space="preserve">precisão insuficiente</w:t>
+      </w:r>
+      <w:r>
+        <w:t xml:space="preserve">: a amostra não permite afirmar efeito, mas tampouco permite declarar equivalência. Essa é uma limitação central, explicitamente assumida (Lakens; Scheel; Isager, 2018).</w:t>
+      </w:r>
+    </w:p>
+    <w:bookmarkEnd w:id="25"/>
+    <w:bookmarkStart w:id="26" w:name="h3-metas-do-inep-e-ganho-educacional"/>
+    <w:p>
+      <w:pPr>
+        <w:pStyle w:val="Heading3"/>
+      </w:pPr>
+      <w:r>
+        <w:t xml:space="preserve">4.5 H3 — metas do INEP e ganho educacional</w:t>
+      </w:r>
+    </w:p>
+    <w:p>
+      <w:pPr>
+        <w:pStyle w:val="FirstParagraph"/>
+      </w:pPr>
+      <w:r>
+        <w:rPr>
+          <w:b/>
+          <w:bCs/>
+        </w:rPr>
+        <w:t xml:space="preserve">H3(a):</w:t>
+      </w:r>
+      <w:r>
+        <w:t xml:space="preserve"> </w:t>
+      </w:r>
+      <w:r>
+        <w:t xml:space="preserve">comparando o IDEB observado com a projeção do INEP no</w:t>
+      </w:r>
+      <w:r>
+        <w:t xml:space="preserve"> </w:t>
+      </w:r>
+      <w:r>
+        <w:rPr>
+          <w:b/>
+          <w:bCs/>
+        </w:rPr>
+        <w:t xml:space="preserve">mesmo ano</w:t>
+      </w:r>
+      <w:r>
+        <w:t xml:space="preserve"> </w:t>
+      </w:r>
+      <w:r>
+        <w:t xml:space="preserve">(2011–2021), os nove municípios cumpriram a meta em 107 de 108 comparações (99,1%); no único desvio, um município, em 2013, não atingiu a meta. Em 2021, todos os 18 pares município-etapa cumpriram a meta; em anos iniciais, todos os nove municípios a atingiram ou superaram (ex.: Crateús, 6,5 vs. meta 5,2; Novo Oriente, 8,9 vs. 5,6).</w:t>
+      </w:r>
+      <w:r>
+        <w:t xml:space="preserve"> </w:t>
+      </w:r>
+      <w:r>
+        <w:rPr>
+          <w:b/>
+          <w:bCs/>
+        </w:rPr>
+        <w:t xml:space="preserve">H3(b):</w:t>
+      </w:r>
+      <w:r>
+        <w:t xml:space="preserve"> </w:t>
+      </w:r>
+      <w:r>
+        <w:t xml:space="preserve">o ganho médio do IDEB de anos iniciais entre 2007 e 2025 foi de 5,93 pontos, com todos os municípios acima da meta; a correlação entre ganho e renda média do responsável foi r = −0,14 (p = 0,73; n = 9; Figura 4). Não há evidência de que municípios com maior renda tenham tido maior ganho educacional.</w:t>
+      </w:r>
+    </w:p>
+    <w:tbl>
+      <w:tblPr>
+        <w:tblStyle w:val="FigureTable"/>
+        <w:tblW w:type="auto" w:w="0"/>
+        <w:jc w:val="center"/>
+        <w:tblLook w:firstRow="0" w:lastRow="0" w:firstColumn="0" w:lastColumn="0"/>
+      </w:tblPr>
+      <w:tblGrid>
+        <w:gridCol w:w="7920"/>
+      </w:tblGrid>
+      <w:tr>
+        <w:tc>
+          <w:tcPr/>
+          <w:p>
+            <w:pPr>
+              <w:pStyle w:val="Compact"/>
+              <w:jc w:val="center"/>
+            </w:pPr>
+            <w:r>
+              <w:t xml:space="preserve">Figura 4 — Ganho de IDEB (2007→2025, anos iniciais) e renda média do responsável (Censo 2022).</w:t>
+            </w:r>
+          </w:p>
+        </w:tc>
+      </w:tr>
+    </w:tbl>
     <w:p>
       <w:pPr>
         <w:pStyle w:val="ImageCaption"/>
@@ -2296,16 +2533,18 @@
     <w:tbl>
       <w:tblPr>
         <w:tblStyle w:val="Table"/>
-        <w:tblW w:type="auto" w:w="0"/>
+        <w:tblW w:type="pct" w:w="5000"/>
+        <w:tblLayout w:type="fixed"/>
         <w:tblLook w:firstRow="1" w:lastRow="0" w:firstColumn="0" w:lastColumn="0" w:noHBand="0" w:noVBand="0" w:val="0020"/>
       </w:tblPr>
       <w:tblGrid>
-        <w:gridCol w:w="1320"/>
-        <w:gridCol w:w="1320"/>
-        <w:gridCol w:w="1320"/>
-        <w:gridCol w:w="1320"/>
-        <w:gridCol w:w="1320"/>
-        <w:gridCol w:w="1320"/>
+        <w:gridCol w:w="1131"/>
+        <w:gridCol w:w="1131"/>
+        <w:gridCol w:w="1131"/>
+        <w:gridCol w:w="1131"/>
+        <w:gridCol w:w="1131"/>
+        <w:gridCol w:w="1131"/>
+        <w:gridCol w:w="1131"/>
       </w:tblGrid>
       <w:tr>
         <w:trPr>
@@ -2373,7 +2612,18 @@
               <w:pStyle w:val="Compact"/>
             </w:pPr>
             <w:r>
-              <w:t xml:space="preserve">Atingiu meta</w:t>
+              <w:t xml:space="preserve">IDEB 2021</w:t>
+            </w:r>
+          </w:p>
+        </w:tc>
+        <w:tc>
+          <w:tcPr/>
+          <w:p>
+            <w:pPr>
+              <w:pStyle w:val="Compact"/>
+            </w:pPr>
+            <w:r>
+              <w:t xml:space="preserve">Atingiu 2021</w:t>
             </w:r>
           </w:p>
         </w:tc>
@@ -2441,6 +2691,17 @@
               <w:pStyle w:val="Compact"/>
             </w:pPr>
             <w:r>
+              <w:t xml:space="preserve">9,5</w:t>
+            </w:r>
+          </w:p>
+        </w:tc>
+        <w:tc>
+          <w:tcPr/>
+          <w:p>
+            <w:pPr>
+              <w:pStyle w:val="Compact"/>
+            </w:pPr>
+            <w:r>
               <w:t xml:space="preserve">Sim</w:t>
             </w:r>
           </w:p>
@@ -2509,6 +2770,17 @@
               <w:pStyle w:val="Compact"/>
             </w:pPr>
             <w:r>
+              <w:t xml:space="preserve">6,5</w:t>
+            </w:r>
+          </w:p>
+        </w:tc>
+        <w:tc>
+          <w:tcPr/>
+          <w:p>
+            <w:pPr>
+              <w:pStyle w:val="Compact"/>
+            </w:pPr>
+            <w:r>
               <w:t xml:space="preserve">Sim</w:t>
             </w:r>
           </w:p>
@@ -2577,6 +2849,17 @@
               <w:pStyle w:val="Compact"/>
             </w:pPr>
             <w:r>
+              <w:t xml:space="preserve">8,7</w:t>
+            </w:r>
+          </w:p>
+        </w:tc>
+        <w:tc>
+          <w:tcPr/>
+          <w:p>
+            <w:pPr>
+              <w:pStyle w:val="Compact"/>
+            </w:pPr>
+            <w:r>
               <w:t xml:space="preserve">Sim</w:t>
             </w:r>
           </w:p>
@@ -2645,6 +2928,17 @@
               <w:pStyle w:val="Compact"/>
             </w:pPr>
             <w:r>
+              <w:t xml:space="preserve">6,6</w:t>
+            </w:r>
+          </w:p>
+        </w:tc>
+        <w:tc>
+          <w:tcPr/>
+          <w:p>
+            <w:pPr>
+              <w:pStyle w:val="Compact"/>
+            </w:pPr>
+            <w:r>
               <w:t xml:space="preserve">Sim</w:t>
             </w:r>
           </w:p>
@@ -2713,6 +3007,17 @@
               <w:pStyle w:val="Compact"/>
             </w:pPr>
             <w:r>
+              <w:t xml:space="preserve">6,3</w:t>
+            </w:r>
+          </w:p>
+        </w:tc>
+        <w:tc>
+          <w:tcPr/>
+          <w:p>
+            <w:pPr>
+              <w:pStyle w:val="Compact"/>
+            </w:pPr>
+            <w:r>
               <w:t xml:space="preserve">Sim</w:t>
             </w:r>
           </w:p>
@@ -2781,6 +3086,17 @@
               <w:pStyle w:val="Compact"/>
             </w:pPr>
             <w:r>
+              <w:t xml:space="preserve">7,2</w:t>
+            </w:r>
+          </w:p>
+        </w:tc>
+        <w:tc>
+          <w:tcPr/>
+          <w:p>
+            <w:pPr>
+              <w:pStyle w:val="Compact"/>
+            </w:pPr>
+            <w:r>
               <w:t xml:space="preserve">Sim</w:t>
             </w:r>
           </w:p>
@@ -2849,6 +3165,17 @@
               <w:pStyle w:val="Compact"/>
             </w:pPr>
             <w:r>
+              <w:t xml:space="preserve">8,9</w:t>
+            </w:r>
+          </w:p>
+        </w:tc>
+        <w:tc>
+          <w:tcPr/>
+          <w:p>
+            <w:pPr>
+              <w:pStyle w:val="Compact"/>
+            </w:pPr>
+            <w:r>
               <w:t xml:space="preserve">Sim</w:t>
             </w:r>
           </w:p>
@@ -2917,6 +3244,17 @@
               <w:pStyle w:val="Compact"/>
             </w:pPr>
             <w:r>
+              <w:t xml:space="preserve">5,9</w:t>
+            </w:r>
+          </w:p>
+        </w:tc>
+        <w:tc>
+          <w:tcPr/>
+          <w:p>
+            <w:pPr>
+              <w:pStyle w:val="Compact"/>
+            </w:pPr>
+            <w:r>
               <w:t xml:space="preserve">Sim</w:t>
             </w:r>
           </w:p>
@@ -2985,20 +3323,31 @@
               <w:pStyle w:val="Compact"/>
             </w:pPr>
             <w:r>
+              <w:t xml:space="preserve">6,6</w:t>
+            </w:r>
+          </w:p>
+        </w:tc>
+        <w:tc>
+          <w:tcPr/>
+          <w:p>
+            <w:pPr>
+              <w:pStyle w:val="Compact"/>
+            </w:pPr>
+            <w:r>
               <w:t xml:space="preserve">Sim</w:t>
             </w:r>
           </w:p>
         </w:tc>
       </w:tr>
     </w:tbl>
-    <w:bookmarkEnd w:id="38"/>
-    <w:bookmarkStart w:id="45" w:name="mapas"/>
+    <w:bookmarkEnd w:id="26"/>
+    <w:bookmarkStart w:id="27" w:name="robustez-da-defasagem"/>
     <w:p>
       <w:pPr>
         <w:pStyle w:val="Heading3"/>
       </w:pPr>
       <w:r>
-        <w:t xml:space="preserve">4.6 Mapas</w:t>
+        <w:t xml:space="preserve">4.6 Robustez da defasagem</w:t>
       </w:r>
     </w:p>
     <w:p>
@@ -3006,56 +3355,52 @@
         <w:pStyle w:val="FirstParagraph"/>
       </w:pPr>
       <w:r>
+        <w:t xml:space="preserve">Para as defasagens 0–4, a correlação pooled (níveis) variou entre r = 0,16 e r = 0,26 na microrregião e as primeiras diferenças oscilaram entre −0,07 e +0,18, sem padrão monotônico — reforçando que nenhuma especificação produz associação temporal discernível na microrregião.</w:t>
+      </w:r>
+    </w:p>
+    <w:bookmarkEnd w:id="27"/>
+    <w:bookmarkStart w:id="28" w:name="mapas"/>
+    <w:p>
+      <w:pPr>
+        <w:pStyle w:val="Heading3"/>
+      </w:pPr>
+      <w:r>
+        <w:t xml:space="preserve">4.7 Mapas</w:t>
+      </w:r>
+    </w:p>
+    <w:p>
+      <w:pPr>
+        <w:pStyle w:val="FirstParagraph"/>
+      </w:pPr>
+      <w:r>
         <w:t xml:space="preserve">Os mapas coropléticos (Figuras 5 e 6) apresentam os dois proxies oficiais de desenvolvimento por município: renda média mensal do responsável (Censo 2022, IBGE) e PIB per capita (2021, IBGE). Crateús, sede regional, destaca-se em ambos os indicadores; os demais municípios concentram-se nas faixas inferiores, retratando a heterogeneidade intra-regional que a análise transversal explora.</w:t>
       </w:r>
     </w:p>
-    <w:p>
-      <w:pPr>
-        <w:pStyle w:val="CaptionedFigure"/>
-      </w:pPr>
-      <w:r>
-        <w:drawing>
-          <wp:inline>
-            <wp:extent cx="5753100" cy="5890876"/>
-            <wp:effectExtent b="0" l="0" r="0" t="0"/>
-            <wp:docPr descr="Figura 5 — Renda média mensal do responsável por município (Censo 2022, IBGE)." title="" id="40" name="Picture"/>
-            <a:graphic>
-              <a:graphicData uri="http://schemas.openxmlformats.org/drawingml/2006/picture">
-                <pic:pic>
-                  <pic:nvPicPr>
-                    <pic:cNvPr descr="outputs/mapas/mapa_renda_responsavel_censo2022.png" id="41" name="Picture"/>
-                    <pic:cNvPicPr>
-                      <a:picLocks noChangeArrowheads="1" noChangeAspect="1"/>
-                    </pic:cNvPicPr>
-                  </pic:nvPicPr>
-                  <pic:blipFill>
-                    <a:blip r:embed="rId39"/>
-                    <a:stretch>
-                      <a:fillRect/>
-                    </a:stretch>
-                  </pic:blipFill>
-                  <pic:spPr bwMode="auto">
-                    <a:xfrm>
-                      <a:off x="0" y="0"/>
-                      <a:ext cx="5753100" cy="5890876"/>
-                    </a:xfrm>
-                    <a:prstGeom prst="rect">
-                      <a:avLst/>
-                    </a:prstGeom>
-                    <a:noFill/>
-                    <a:ln w="9525">
-                      <a:noFill/>
-                      <a:headEnd/>
-                      <a:tailEnd/>
-                    </a:ln>
-                  </pic:spPr>
-                </pic:pic>
-              </a:graphicData>
-            </a:graphic>
-          </wp:inline>
-        </w:drawing>
-      </w:r>
-    </w:p>
+    <w:tbl>
+      <w:tblPr>
+        <w:tblStyle w:val="FigureTable"/>
+        <w:tblW w:type="auto" w:w="0"/>
+        <w:jc w:val="center"/>
+        <w:tblLook w:firstRow="0" w:lastRow="0" w:firstColumn="0" w:lastColumn="0"/>
+      </w:tblPr>
+      <w:tblGrid>
+        <w:gridCol w:w="7920"/>
+      </w:tblGrid>
+      <w:tr>
+        <w:tc>
+          <w:tcPr/>
+          <w:p>
+            <w:pPr>
+              <w:pStyle w:val="Compact"/>
+              <w:jc w:val="center"/>
+            </w:pPr>
+            <w:r>
+              <w:t xml:space="preserve">Figura 5 — Renda média mensal do responsável por município (Censo 2022, IBGE).</w:t>
+            </w:r>
+          </w:p>
+        </w:tc>
+      </w:tr>
+    </w:tbl>
     <w:p>
       <w:pPr>
         <w:pStyle w:val="ImageCaption"/>
@@ -3064,53 +3409,31 @@
         <w:t xml:space="preserve">Figura 5 — Renda média mensal do responsável por município (Censo 2022, IBGE).</w:t>
       </w:r>
     </w:p>
-    <w:p>
-      <w:pPr>
-        <w:pStyle w:val="CaptionedFigure"/>
-      </w:pPr>
-      <w:r>
-        <w:drawing>
-          <wp:inline>
-            <wp:extent cx="5753100" cy="6294568"/>
-            <wp:effectExtent b="0" l="0" r="0" t="0"/>
-            <wp:docPr descr="Figura 6 — PIB per capita por município (2021, IBGE)." title="" id="43" name="Picture"/>
-            <a:graphic>
-              <a:graphicData uri="http://schemas.openxmlformats.org/drawingml/2006/picture">
-                <pic:pic>
-                  <pic:nvPicPr>
-                    <pic:cNvPr descr="outputs/mapas/mapa_pib_per_capita_2021.png" id="44" name="Picture"/>
-                    <pic:cNvPicPr>
-                      <a:picLocks noChangeArrowheads="1" noChangeAspect="1"/>
-                    </pic:cNvPicPr>
-                  </pic:nvPicPr>
-                  <pic:blipFill>
-                    <a:blip r:embed="rId42"/>
-                    <a:stretch>
-                      <a:fillRect/>
-                    </a:stretch>
-                  </pic:blipFill>
-                  <pic:spPr bwMode="auto">
-                    <a:xfrm>
-                      <a:off x="0" y="0"/>
-                      <a:ext cx="5753100" cy="6294568"/>
-                    </a:xfrm>
-                    <a:prstGeom prst="rect">
-                      <a:avLst/>
-                    </a:prstGeom>
-                    <a:noFill/>
-                    <a:ln w="9525">
-                      <a:noFill/>
-                      <a:headEnd/>
-                      <a:tailEnd/>
-                    </a:ln>
-                  </pic:spPr>
-                </pic:pic>
-              </a:graphicData>
-            </a:graphic>
-          </wp:inline>
-        </w:drawing>
-      </w:r>
-    </w:p>
+    <w:tbl>
+      <w:tblPr>
+        <w:tblStyle w:val="FigureTable"/>
+        <w:tblW w:type="auto" w:w="0"/>
+        <w:jc w:val="center"/>
+        <w:tblLook w:firstRow="0" w:lastRow="0" w:firstColumn="0" w:lastColumn="0"/>
+      </w:tblPr>
+      <w:tblGrid>
+        <w:gridCol w:w="7920"/>
+      </w:tblGrid>
+      <w:tr>
+        <w:tc>
+          <w:tcPr/>
+          <w:p>
+            <w:pPr>
+              <w:pStyle w:val="Compact"/>
+              <w:jc w:val="center"/>
+            </w:pPr>
+            <w:r>
+              <w:t xml:space="preserve">Figura 6 — PIB per capita por município (2021, IBGE).</w:t>
+            </w:r>
+          </w:p>
+        </w:tc>
+      </w:tr>
+    </w:tbl>
     <w:p>
       <w:pPr>
         <w:pStyle w:val="ImageCaption"/>
@@ -3119,9 +3442,9 @@
         <w:t xml:space="preserve">Figura 6 — PIB per capita por município (2021, IBGE).</w:t>
       </w:r>
     </w:p>
-    <w:bookmarkEnd w:id="45"/>
-    <w:bookmarkEnd w:id="46"/>
-    <w:bookmarkStart w:id="47" w:name="discussão"/>
+    <w:bookmarkEnd w:id="28"/>
+    <w:bookmarkEnd w:id="29"/>
+    <w:bookmarkStart w:id="30" w:name="discussão"/>
     <w:p>
       <w:pPr>
         <w:pStyle w:val="Heading2"/>
@@ -3135,7 +3458,7 @@
         <w:pStyle w:val="FirstParagraph"/>
       </w:pPr>
       <w:r>
-        <w:t xml:space="preserve">Os resultados indicam que, no Sertão de Cratéus, a associação entre renda e desempenho escolar é</w:t>
+        <w:t xml:space="preserve">Os resultados indicam que, no Sertão de Crateús,</w:t>
       </w:r>
       <w:r>
         <w:t xml:space="preserve"> </w:t>
@@ -3145,35 +3468,10 @@
           <w:b/>
           <w:bCs/>
         </w:rPr>
-        <w:t xml:space="preserve">transversal, não temporal</w:t>
-      </w:r>
-      <w:r>
-        <w:t xml:space="preserve">: municípios com maior PIB per capita tendem a ter IDEB mais alto (r = 0,49; Figura 1), mas a variação temporal da renda não acompanha a variação do desempenho escolar (primeiras diferenças nulas; efeitos fixos não significativos; Figuras 2 e 3). A validação cruzada por município (Figura 4) sugere que a associação transversal é robusta e generalizada, não dependendo de um único município.</w:t>
-      </w:r>
-    </w:p>
-    <w:p>
-      <w:pPr>
-        <w:pStyle w:val="BodyText"/>
-      </w:pPr>
-      <w:r>
-        <w:t xml:space="preserve">Dois pontos merecem destaque. Primeiro, a associação transversal não deve ser lida como</w:t>
-      </w:r>
-      <w:r>
-        <w:t xml:space="preserve"> </w:t>
-      </w:r>
-      <w:r>
-        <w:t xml:space="preserve">“a pobreza determina o baixo desempenho”</w:t>
-      </w:r>
-      <w:r>
-        <w:t xml:space="preserve">: municípios pobres da microrregião alcançaram IDEB 2025 elevado (até 9,9 pontos), consistentemente acima da meta. Segundo, o crescimento educacional não acompanhou a renda — o que é compatível com a literatura sobre políticas educacionais cearenses (PAIC, regime de colaboração, alfabetização na idade certa), que associa os ganhos a fatores institucionais e pedagógicos, e não à variação econômica local (Costa; Carnoy, 2015; Cruz; Ribeiro; Batista, 2022; Segatto; Oliveira; Silva, 2024).</w:t>
-      </w:r>
-    </w:p>
-    <w:p>
-      <w:pPr>
-        <w:pStyle w:val="BodyText"/>
-      </w:pPr>
-      <w:r>
-        <w:t xml:space="preserve">As limitações são explícitas: (i) n municipal de 9 e 108 observações implica poder estatístico baixo (MDES de 5,71 com erro clusterizado), tornando a ausência de associação temporal uma</w:t>
+        <w:t xml:space="preserve">não se sustenta a hipótese de associação renda–desempenho em nenhuma das duas dimensões testadas</w:t>
+      </w:r>
+      <w:r>
+        <w:t xml:space="preserve">: entre municípios, a correlação estimada é negativa e não discernível de zero (r = −0,24; IC95% [−0,77; 0,50]; Figura 1); dentro dos municípios, as primeiras diferenças são próximas de zero e os efeitos fixos não são discerníveis de zero sob erros clusterizados (β = 2,61; IC95% [−1,73; 6,95]; p = 0,20; Figuras 2 e 3). A precisão do estudo é limitada (MDES ≈ 6,0; TOST não significativo mesmo com margem substantiva), de modo que a leitura correta é de</w:t>
       </w:r>
       <w:r>
         <w:t xml:space="preserve"> </w:t>
@@ -3183,31 +3481,26 @@
           <w:b/>
           <w:bCs/>
         </w:rPr>
-        <w:t xml:space="preserve">não-detecção</w:t>
-      </w:r>
-      <w:r>
-        <w:t xml:space="preserve"> </w:t>
-      </w:r>
-      <w:r>
-        <w:t xml:space="preserve">e não uma prova de ausência; (ii) o PIB municipal e a renda do responsável são proxies do desenvolvimento local — o IPCE original não é auditável; (iii) não há pretensão causal; (iv) os efeitos fixos controlam fatores invariantes no tempo e choques comuns por ano, mas não outros confundidores variáveis; (v) as correlações transversais podem refletir fatores omitidos (infraestrutura, gestão) correlacionados com renda e desempenho.</w:t>
-      </w:r>
-    </w:p>
-    <w:bookmarkEnd w:id="47"/>
-    <w:bookmarkStart w:id="48" w:name="considerações-finais"/>
-    <w:p>
-      <w:pPr>
-        <w:pStyle w:val="Heading2"/>
-      </w:pPr>
-      <w:r>
-        <w:t xml:space="preserve">6. Considerações finais</w:t>
-      </w:r>
-    </w:p>
-    <w:p>
-      <w:pPr>
-        <w:pStyle w:val="FirstParagraph"/>
-      </w:pPr>
-      <w:r>
-        <w:t xml:space="preserve">Este estudo responde à pergunta de pesquisa com evidência associativa subnacional: no Sertão de Cratéus, a relação entre renda e desempenho escolar é</w:t>
+        <w:t xml:space="preserve">precisão insuficiente para detectar efeitos plausíveis</w:t>
+      </w:r>
+      <w:r>
+        <w:t xml:space="preserve">, e não de prova de ausência de efeito.</w:t>
+      </w:r>
+    </w:p>
+    <w:p>
+      <w:pPr>
+        <w:pStyle w:val="BodyText"/>
+      </w:pPr>
+      <w:r>
+        <w:t xml:space="preserve">Dois pontos merecem destaque. Primeiro, a ausência de associação transversal discernível na microrregião — ao contrário do agregado nacional (r = 0,49 no Brasil) — sugere que, em contextos de pobreza estrutural com política educacional coordenada, a variação de renda entre municípios pequenos explica pouco da variação de desempenho. Segundo, o crescimento educacional não acompanhou a renda: municípios pobres da microrregião alcançaram IDEB 2025 elevado (até 9,9 pontos) e todos cumpriram as metas do INEP no ano de referência — o que é compatível com a literatura sobre políticas educacionais cearenses (PAIC, regime de colaboração, alfabetização na idade certa), que associa os ganhos a fatores institucionais e pedagógicos, e não à variação econômica local (Costa; Carnoy, 2015; Cruz; Ribeiro; Batista, 2022; Segatto; Oliveira; Silva, 2024).</w:t>
+      </w:r>
+    </w:p>
+    <w:p>
+      <w:pPr>
+        <w:pStyle w:val="BodyText"/>
+      </w:pPr>
+      <w:r>
+        <w:t xml:space="preserve">As limitações são explícitas: (i) n municipal de 9 e 108 observações implica poder estatístico baixo (MDES ≈ 6,0 com erro clusterizado), tornando a ausência de associação temporal e transversal uma</w:t>
       </w:r>
       <w:r>
         <w:t xml:space="preserve"> </w:t>
@@ -3217,17 +3510,51 @@
           <w:b/>
           <w:bCs/>
         </w:rPr>
-        <w:t xml:space="preserve">transversal, não temporal</w:t>
-      </w:r>
-      <w:r>
-        <w:t xml:space="preserve"> </w:t>
-      </w:r>
-      <w:r>
-        <w:t xml:space="preserve">— existe associação entre municípios (níveis), mas não dentro dos municípios ao longo do tempo. Adicionalmente, os dados oficiais mais recentes refutam a premissa de estagnação: todos os nove municípios superaram as metas pactuadas, com ganhos médios de cerca de seis pontos no período 2007–2025 e IDEB 2025 elevado mesmo em municípios de baixa renda. A ausência de associação temporal entre ganho educacional e renda sugere que fatores de política educacional — e não a variação econômica — estão associados à trajetória observada, em linha com a literatura do Ceará. Recomenda-se, para estudos futuros, ampliar o painel para todas as microrregiões cearenses e estaduais, incorporar controles de política (PAIC, ICMS educacional) e utilizar estratégias quase-experimentais para testar mecanismos causais específicos.</w:t>
-      </w:r>
-    </w:p>
-    <w:bookmarkEnd w:id="48"/>
-    <w:bookmarkStart w:id="49" w:name="referências"/>
+        <w:t xml:space="preserve">não-detecção</w:t>
+      </w:r>
+      <w:r>
+        <w:t xml:space="preserve"> </w:t>
+      </w:r>
+      <w:r>
+        <w:t xml:space="preserve">e não uma prova de ausência; (ii) com G = 9, o teste t cluster pode super-rejeitar — daí o wild cluster bootstrap como robustez (MacKinnon; Webb, 2017); (iii) o PIB municipal e a renda do responsável são proxies do desenvolvimento local — o IPCE original não é auditável; (iv) não há pretensão causal; (v) os efeitos fixos controlam fatores invariantes no tempo e choques comuns por ano, mas não outros confundidores variáveis; (vi) a comparação das metas do INEP é descritiva e não controla por tendências subjacentes.</w:t>
+      </w:r>
+    </w:p>
+    <w:bookmarkEnd w:id="30"/>
+    <w:bookmarkStart w:id="31" w:name="considerações-finais"/>
+    <w:p>
+      <w:pPr>
+        <w:pStyle w:val="Heading2"/>
+      </w:pPr>
+      <w:r>
+        <w:t xml:space="preserve">6. Considerações finais</w:t>
+      </w:r>
+    </w:p>
+    <w:p>
+      <w:pPr>
+        <w:pStyle w:val="FirstParagraph"/>
+      </w:pPr>
+      <w:r>
+        <w:t xml:space="preserve">Este estudo responde à pergunta de pesquisa com evidência associativa subnacional: no Sertão de Crateús, a relação entre renda e desempenho escolar</w:t>
+      </w:r>
+      <w:r>
+        <w:t xml:space="preserve"> </w:t>
+      </w:r>
+      <w:r>
+        <w:rPr>
+          <w:b/>
+          <w:bCs/>
+        </w:rPr>
+        <w:t xml:space="preserve">não é discernível nem entre nem dentro dos municípios</w:t>
+      </w:r>
+      <w:r>
+        <w:t xml:space="preserve"> </w:t>
+      </w:r>
+      <w:r>
+        <w:t xml:space="preserve">— a associação transversal observada no agregado nacional não se reproduz na microrregião, e a variação temporal da renda não acompanha a variação do desempenho. Adicionalmente, os dados oficiais mostram que os nove municípios atingiram ou superaram as metas projetadas pelo INEP na grande maioria das 108 comparações município-etapa-ano (99,1%; único desvio em Ipaporanga, 2013) — e, em 2021, todos os 18 pares cumpriram a meta —, com ganhos médios de cerca de seis pontos no período 2007–2025 e IDEB 2025 elevado mesmo em municípios de baixa renda. A ausência de associação entre ganho educacional e renda sugere que fatores de política educacional — e não a variação econômica — estão associados à trajetória observada, em linha com a literatura do Ceará. Recomenda-se, para estudos futuros, ampliar o painel para todas as microrregiões cearenses e estaduais (aumentando o número efetivo de unidades), incorporar controles de política (PAIC, ICMS educacional) e utilizar estratégias quase-experimentais para testar mecanismos causais específicos.</w:t>
+      </w:r>
+    </w:p>
+    <w:bookmarkEnd w:id="31"/>
+    <w:bookmarkStart w:id="32" w:name="referências"/>
     <w:p>
       <w:pPr>
         <w:pStyle w:val="Heading2"/>
@@ -3283,7 +3610,7 @@
         <w:pStyle w:val="BodyText"/>
       </w:pPr>
       <w:r>
-        <w:t xml:space="preserve">BRUNELLO, G.; KISS, D. Math scores in high stakes grades.</w:t>
+        <w:t xml:space="preserve">BLOOM, H. S. Minimum detectable effects: a simple way to report the statistical power of experimental designs.</w:t>
       </w:r>
       <w:r>
         <w:t xml:space="preserve"> </w:t>
@@ -3293,10 +3620,10 @@
           <w:i/>
           <w:iCs/>
         </w:rPr>
-        <w:t xml:space="preserve">Economics of Education Review</w:t>
-      </w:r>
-      <w:r>
-        <w:t xml:space="preserve">, v. 87, 102219, 2022. https://doi.org/10.1016/j.econedurev.2021.102219</w:t>
+        <w:t xml:space="preserve">Evaluation Review</w:t>
+      </w:r>
+      <w:r>
+        <w:t xml:space="preserve">, Thousand Oaks, v. 19, n. 5, p. 547–556, 1995. https://doi.org/10.1177/0193841X9501900504</w:t>
       </w:r>
     </w:p>
     <w:p>
@@ -3304,7 +3631,7 @@
         <w:pStyle w:val="BodyText"/>
       </w:pPr>
       <w:r>
-        <w:t xml:space="preserve">CARNOY, M.; MAROTTA, L.; LOUZANO, P.; et al. Intranational comparative education: what state differences in student achievement can teach us about improving education — the case of Brazil.</w:t>
+        <w:t xml:space="preserve">BRUNELLO, G.; KISS, D. Math scores in high stakes grades.</w:t>
       </w:r>
       <w:r>
         <w:t xml:space="preserve"> </w:t>
@@ -3314,10 +3641,10 @@
           <w:i/>
           <w:iCs/>
         </w:rPr>
-        <w:t xml:space="preserve">Comparative Education Review</w:t>
-      </w:r>
-      <w:r>
-        <w:t xml:space="preserve">, v. 61, n. 4, 2017. https://doi.org/10.1086/693981</w:t>
+        <w:t xml:space="preserve">Economics of Education Review</w:t>
+      </w:r>
+      <w:r>
+        <w:t xml:space="preserve">, v. 87, 102219, 2022. https://doi.org/10.1016/j.econedurev.2021.102219</w:t>
       </w:r>
     </w:p>
     <w:p>
@@ -3325,7 +3652,7 @@
         <w:pStyle w:val="BodyText"/>
       </w:pPr>
       <w:r>
-        <w:t xml:space="preserve">CITO, L.; MARÔCO, J. Beyond the average: mapping educational inequality in Brazil with PISA 2022.</w:t>
+        <w:t xml:space="preserve">CAMERON, A. C.; GELBACH, J. B.; MILLER, D. L. Bootstrap-based improvements for inference with clustered errors.</w:t>
       </w:r>
       <w:r>
         <w:t xml:space="preserve"> </w:t>
@@ -3335,10 +3662,10 @@
           <w:i/>
           <w:iCs/>
         </w:rPr>
-        <w:t xml:space="preserve">Large-scale Assessments in Education</w:t>
-      </w:r>
-      <w:r>
-        <w:t xml:space="preserve">, v. 14, 2026. https://doi.org/10.1186/s40536-026-00302-0</w:t>
+        <w:t xml:space="preserve">The Review of Economics and Statistics</w:t>
+      </w:r>
+      <w:r>
+        <w:t xml:space="preserve">, Cambridge, MA, v. 90, n. 3, p. 414–427, 2008. https://doi.org/10.1162/rest.90.3.414</w:t>
       </w:r>
     </w:p>
     <w:p>
@@ -3346,7 +3673,7 @@
         <w:pStyle w:val="BodyText"/>
       </w:pPr>
       <w:r>
-        <w:t xml:space="preserve">COSTA, L. O.; CARNOY, M. The effectiveness of an early-grade literacy intervention on the cognitive achievement of Brazilian students.</w:t>
+        <w:t xml:space="preserve">CARNOY, M.; MAROTTA, L.; LOUZANO, P.; KHAVENSON, T.; GUIMARÃES, F. R. F.; CARNAUBA, F. Intranational comparative education: what state differences in student achievement can teach us about improving education — the case of Brazil.</w:t>
       </w:r>
       <w:r>
         <w:t xml:space="preserve"> </w:t>
@@ -3356,10 +3683,10 @@
           <w:i/>
           <w:iCs/>
         </w:rPr>
-        <w:t xml:space="preserve">Educational Evaluation and Policy Analysis</w:t>
-      </w:r>
-      <w:r>
-        <w:t xml:space="preserve">, v. 37, n. 4, p. 567–590, 2015. https://doi.org/10.3102/0162373715571437</w:t>
+        <w:t xml:space="preserve">Comparative Education Review</w:t>
+      </w:r>
+      <w:r>
+        <w:t xml:space="preserve">, Chicago, v. 61, n. 4, p. 726–759, nov. 2017. https://doi.org/10.1086/693981</w:t>
       </w:r>
     </w:p>
     <w:p>
@@ -3367,7 +3694,7 @@
         <w:pStyle w:val="BodyText"/>
       </w:pPr>
       <w:r>
-        <w:t xml:space="preserve">CRUZ, M. C. M. T.; RIBEIRO, V. M.; BATISTA, J. M. Contexto de implementação do Programa de Aprendizagem na Idade Certa (PAIC).</w:t>
+        <w:t xml:space="preserve">CITO, L.; MARÔCO, J. Beyond the average: mapping educational inequality in Brazil with PISA 2022.</w:t>
       </w:r>
       <w:r>
         <w:t xml:space="preserve"> </w:t>
@@ -3377,10 +3704,10 @@
           <w:i/>
           <w:iCs/>
         </w:rPr>
-        <w:t xml:space="preserve">Revista Ibero-Americana de Estudos em Educação</w:t>
-      </w:r>
-      <w:r>
-        <w:t xml:space="preserve">, Araraquara, v. 17, n. esp. 3, p. 2405–2432, 2022. https://doi.org/10.21723/riaee.v17iesp.3.16719</w:t>
+        <w:t xml:space="preserve">Large-scale Assessments in Education</w:t>
+      </w:r>
+      <w:r>
+        <w:t xml:space="preserve">, v. 14, art. 30, 2026. https://doi.org/10.1186/s40536-026-00302-0</w:t>
       </w:r>
     </w:p>
     <w:p>
@@ -3388,7 +3715,7 @@
         <w:pStyle w:val="BodyText"/>
       </w:pPr>
       <w:r>
-        <w:t xml:space="preserve">DUARTE, N. de S. O impacto da pobreza no Ideb: um estudo multinível.</w:t>
+        <w:t xml:space="preserve">COSTA, L. O.; CARNOY, M. The effectiveness of an early-grade literacy intervention on the cognitive achievement of Brazilian students.</w:t>
       </w:r>
       <w:r>
         <w:t xml:space="preserve"> </w:t>
@@ -3398,10 +3725,10 @@
           <w:i/>
           <w:iCs/>
         </w:rPr>
-        <w:t xml:space="preserve">Revista Brasileira de Estudos Pedagógicos</w:t>
-      </w:r>
-      <w:r>
-        <w:t xml:space="preserve">, Brasília, DF, v. 94, n. 237, p. 343–363, 2013. https://doi.org/10.1590/S2176-66812013000200002</w:t>
+        <w:t xml:space="preserve">Educational Evaluation and Policy Analysis</w:t>
+      </w:r>
+      <w:r>
+        <w:t xml:space="preserve">, v. 37, n. 4, p. 567–590, 2015. https://doi.org/10.3102/0162373715571437</w:t>
       </w:r>
     </w:p>
     <w:p>
@@ -3409,7 +3736,7 @@
         <w:pStyle w:val="BodyText"/>
       </w:pPr>
       <w:r>
-        <w:t xml:space="preserve">HANUSHEK, E. A.; WOESSMANN, L.</w:t>
+        <w:t xml:space="preserve">CRUZ, M. C. M. T.; RIBEIRO, V. M.; BATISTA, J. M. Contexto de implementação do Programa de Aprendizagem na Idade Certa (PAIC).</w:t>
       </w:r>
       <w:r>
         <w:t xml:space="preserve"> </w:t>
@@ -3419,10 +3746,31 @@
           <w:i/>
           <w:iCs/>
         </w:rPr>
-        <w:t xml:space="preserve">The Knowledge Capital of Nations: education and the economics of growth</w:t>
-      </w:r>
-      <w:r>
-        <w:t xml:space="preserve">. Cambridge, MA: MIT Press, 2015. https://doi.org/10.7551/mitpress/9780262029179.001.0001</w:t>
+        <w:t xml:space="preserve">Revista Ibero-Americana de Estudos em Educação</w:t>
+      </w:r>
+      <w:r>
+        <w:t xml:space="preserve">, Araraquara, v. 17, n. esp. 3, p. 2405–2432, 2022. https://doi.org/10.21723/riaee.v17iesp.3.16719. [Nota: o título do artigo usa a variação</w:t>
+      </w:r>
+      <w:r>
+        <w:t xml:space="preserve"> </w:t>
+      </w:r>
+      <w:r>
+        <w:t xml:space="preserve">“Aprendizagem”</w:t>
+      </w:r>
+      <w:r>
+        <w:t xml:space="preserve">; a denominação legal do programa é</w:t>
+      </w:r>
+      <w:r>
+        <w:t xml:space="preserve"> </w:t>
+      </w:r>
+      <w:r>
+        <w:t xml:space="preserve">“Alfabetização na Idade Certa”</w:t>
+      </w:r>
+      <w:r>
+        <w:t xml:space="preserve"> </w:t>
+      </w:r>
+      <w:r>
+        <w:t xml:space="preserve">(Lei estadual 14.026/2007).]</w:t>
       </w:r>
     </w:p>
     <w:p>
@@ -3430,7 +3778,7 @@
         <w:pStyle w:val="BodyText"/>
       </w:pPr>
       <w:r>
-        <w:t xml:space="preserve">LACRUZ, A. J.; AMÉRICO, B. L.; CARNIEL, F. Indicadores de qualidade na educação: análise discriminante dos desempenhos na Prova Brasil.</w:t>
+        <w:t xml:space="preserve">DUARTE, N. de S. O impacto da pobreza no Ideb: um estudo multinível.</w:t>
       </w:r>
       <w:r>
         <w:t xml:space="preserve"> </w:t>
@@ -3443,7 +3791,7 @@
         <w:t xml:space="preserve">Revista Brasileira de Estudos Pedagógicos</w:t>
       </w:r>
       <w:r>
-        <w:t xml:space="preserve">, Brasília, DF, v. 100, n. 254, 2019. https://doi.org/10.1590/S1413-24782019240002</w:t>
+        <w:t xml:space="preserve">, Brasília, DF, v. 94, n. 237, p. 343–363, 2013. https://doi.org/10.1590/S2176-66812013000200002</w:t>
       </w:r>
     </w:p>
     <w:p>
@@ -3451,7 +3799,7 @@
         <w:pStyle w:val="BodyText"/>
       </w:pPr>
       <w:r>
-        <w:t xml:space="preserve">SCHNEIDER, M. P.; NARDI, E. L. O IDEB e a construção de um modelo de accountability na educação básica brasileira.</w:t>
+        <w:t xml:space="preserve">HANUSHEK, E. A.; WOESSMANN, L.</w:t>
       </w:r>
       <w:r>
         <w:t xml:space="preserve"> </w:t>
@@ -3461,10 +3809,10 @@
           <w:i/>
           <w:iCs/>
         </w:rPr>
-        <w:t xml:space="preserve">Revista Portuguesa de Educação</w:t>
-      </w:r>
-      <w:r>
-        <w:t xml:space="preserve">, Braga, v. 27, n. 1, p. 7–28, 2014. https://doi.org/10.21814/rpe.4295</w:t>
+        <w:t xml:space="preserve">The Knowledge Capital of Nations: education and the economics of growth</w:t>
+      </w:r>
+      <w:r>
+        <w:t xml:space="preserve">. Cambridge, MA: MIT Press, 2015. https://doi.org/10.7551/mitpress/9780262029179.001.0001</w:t>
       </w:r>
     </w:p>
     <w:p>
@@ -3472,7 +3820,7 @@
         <w:pStyle w:val="BodyText"/>
       </w:pPr>
       <w:r>
-        <w:t xml:space="preserve">SEGATTO, C. I.; OLIVEIRA, K. de; SILVA, A. L. N. da. Os limites do PNE (2014-2024) no regime de colaboração.</w:t>
+        <w:t xml:space="preserve">LACRUZ, A. J.; AMÉRICO, B. L.; CARNIEL, F. Indicadores de qualidade na educação: análise discriminante dos desempenhos na Prova Brasil.</w:t>
       </w:r>
       <w:r>
         <w:t xml:space="preserve"> </w:t>
@@ -3482,10 +3830,10 @@
           <w:i/>
           <w:iCs/>
         </w:rPr>
-        <w:t xml:space="preserve">Estudos em Avaliação Educacional</w:t>
-      </w:r>
-      <w:r>
-        <w:t xml:space="preserve">, São Paulo, v. 35, e10549, 2024. https://doi.org/10.18222/eae.v35.10549</w:t>
+        <w:t xml:space="preserve">Revista Brasileira de Educação</w:t>
+      </w:r>
+      <w:r>
+        <w:t xml:space="preserve">, Rio de Janeiro, v. 24, e240002, p. 1–26, 2019. https://doi.org/10.1590/S1413-24782019240002</w:t>
       </w:r>
     </w:p>
     <w:p>
@@ -3493,7 +3841,7 @@
         <w:pStyle w:val="BodyText"/>
       </w:pPr>
       <w:r>
-        <w:t xml:space="preserve">SOARES, J. F.; XAVIER, F. P. Pressupostos educacionais e estatísticos do Ideb.</w:t>
+        <w:t xml:space="preserve">LAKENS, D.; SCHEEL, A. M.; ISAGER, P. M. Equivalence testing for psychological research: a tutorial.</w:t>
       </w:r>
       <w:r>
         <w:t xml:space="preserve"> </w:t>
@@ -3503,14 +3851,98 @@
           <w:i/>
           <w:iCs/>
         </w:rPr>
+        <w:t xml:space="preserve">Advances in Methods and Practices in Psychological Science</w:t>
+      </w:r>
+      <w:r>
+        <w:t xml:space="preserve">, Thousand Oaks, v. 1, n. 2, p. 259–269, 2018. https://doi.org/10.1177/2515245918770963</w:t>
+      </w:r>
+    </w:p>
+    <w:p>
+      <w:pPr>
+        <w:pStyle w:val="BodyText"/>
+      </w:pPr>
+      <w:r>
+        <w:t xml:space="preserve">MACKINNON, J. G.; WEBB, M. D. Wild bootstrap inference for wildly different cluster sizes.</w:t>
+      </w:r>
+      <w:r>
+        <w:t xml:space="preserve"> </w:t>
+      </w:r>
+      <w:r>
+        <w:rPr>
+          <w:i/>
+          <w:iCs/>
+        </w:rPr>
+        <w:t xml:space="preserve">Journal of Applied Econometrics</w:t>
+      </w:r>
+      <w:r>
+        <w:t xml:space="preserve">, Chichester, v. 32, n. 2, p. 233–254, 2017. https://doi.org/10.1002/jae.2508</w:t>
+      </w:r>
+    </w:p>
+    <w:p>
+      <w:pPr>
+        <w:pStyle w:val="BodyText"/>
+      </w:pPr>
+      <w:r>
+        <w:t xml:space="preserve">SCHNEIDER, M. P.; NARDI, E. L. O IDEB e a construção de um modelo de accountability na educação básica brasileira.</w:t>
+      </w:r>
+      <w:r>
+        <w:t xml:space="preserve"> </w:t>
+      </w:r>
+      <w:r>
+        <w:rPr>
+          <w:i/>
+          <w:iCs/>
+        </w:rPr>
+        <w:t xml:space="preserve">Revista Portuguesa de Educação</w:t>
+      </w:r>
+      <w:r>
+        <w:t xml:space="preserve">, Braga, v. 27, n. 1, p. 7–28, 2014. https://doi.org/10.21814/rpe.4295</w:t>
+      </w:r>
+    </w:p>
+    <w:p>
+      <w:pPr>
+        <w:pStyle w:val="BodyText"/>
+      </w:pPr>
+      <w:r>
+        <w:t xml:space="preserve">SEGATTO, C. I.; OLIVEIRA, K. de; SILVA, A. L. N. da. Os limites do PNE (2014-2024) no regime de colaboração.</w:t>
+      </w:r>
+      <w:r>
+        <w:t xml:space="preserve"> </w:t>
+      </w:r>
+      <w:r>
+        <w:rPr>
+          <w:i/>
+          <w:iCs/>
+        </w:rPr>
+        <w:t xml:space="preserve">Estudos em Avaliação Educacional</w:t>
+      </w:r>
+      <w:r>
+        <w:t xml:space="preserve">, São Paulo, v. 35, e10549, 2024. https://doi.org/10.18222/eae.v35.10549</w:t>
+      </w:r>
+    </w:p>
+    <w:p>
+      <w:pPr>
+        <w:pStyle w:val="BodyText"/>
+      </w:pPr>
+      <w:r>
+        <w:t xml:space="preserve">SOARES, J. F.; XAVIER, F. P. Pressupostos educacionais e estatísticos do Ideb.</w:t>
+      </w:r>
+      <w:r>
+        <w:t xml:space="preserve"> </w:t>
+      </w:r>
+      <w:r>
+        <w:rPr>
+          <w:i/>
+          <w:iCs/>
+        </w:rPr>
         <w:t xml:space="preserve">Educação &amp; Sociedade</w:t>
       </w:r>
       <w:r>
         <w:t xml:space="preserve">, Campinas, v. 34, n. 124, p. 903–923, 2013. https://doi.org/10.1590/S0101-73302013000300013</w:t>
       </w:r>
     </w:p>
-    <w:bookmarkEnd w:id="49"/>
-    <w:bookmarkStart w:id="50" w:name="Xb81c9ee436544be0586c5f0ff6fd02321a9d8f1"/>
+    <w:bookmarkEnd w:id="32"/>
+    <w:bookmarkStart w:id="33" w:name="Xb81c9ee436544be0586c5f0ff6fd02321a9d8f1"/>
     <w:p>
       <w:pPr>
         <w:pStyle w:val="Heading2"/>
@@ -3561,6 +3993,18 @@
         <w:rPr>
           <w:rStyle w:val="VerbatimChar"/>
         </w:rPr>
+        <w:t xml:space="preserve">scripts/analise_crateus_r428.py</w:t>
+      </w:r>
+      <w:r>
+        <w:t xml:space="preserve">,</w:t>
+      </w:r>
+      <w:r>
+        <w:t xml:space="preserve"> </w:t>
+      </w:r>
+      <w:r>
+        <w:rPr>
+          <w:rStyle w:val="VerbatimChar"/>
+        </w:rPr>
         <w:t xml:space="preserve">scripts/mapa_crateus.py</w:t>
       </w:r>
       <w:r>
@@ -3612,7 +4056,7 @@
         </w:numPr>
       </w:pPr>
       <w:r>
-        <w:t xml:space="preserve">Resultados completos:</w:t>
+        <w:t xml:space="preserve">Deflator:</w:t>
       </w:r>
       <w:r>
         <w:t xml:space="preserve"> </w:t>
@@ -3621,22 +4065,13 @@
         <w:rPr>
           <w:rStyle w:val="VerbatimChar"/>
         </w:rPr>
-        <w:t xml:space="preserve">outputs/expanded/resultados_r426.json</w:t>
-      </w:r>
-      <w:r>
-        <w:t xml:space="preserve">; proveniência computacional:</w:t>
-      </w:r>
-      <w:r>
-        <w:t xml:space="preserve"> </w:t>
-      </w:r>
-      <w:r>
-        <w:rPr>
-          <w:rStyle w:val="VerbatimChar"/>
-        </w:rPr>
-        <w:t xml:space="preserve">outputs/expanded/provenance_r426.json</w:t>
-      </w:r>
-      <w:r>
-        <w:t xml:space="preserve">.</w:t>
+        <w:t xml:space="preserve">data/processed/ipca_medias_anuais.json</w:t>
+      </w:r>
+      <w:r>
+        <w:t xml:space="preserve"> </w:t>
+      </w:r>
+      <w:r>
+        <w:t xml:space="preserve">(IPEA Data, série PRECOS12_IPCA12; fonte original IBGE/SNIPC; fator 2021/ano).</w:t>
       </w:r>
     </w:p>
     <w:p>
@@ -3648,7 +4083,7 @@
         </w:numPr>
       </w:pPr>
       <w:r>
-        <w:t xml:space="preserve">Figuras:</w:t>
+        <w:t xml:space="preserve">Resultados completos:</w:t>
       </w:r>
       <w:r>
         <w:t xml:space="preserve"> </w:t>
@@ -3657,13 +4092,10 @@
         <w:rPr>
           <w:rStyle w:val="VerbatimChar"/>
         </w:rPr>
-        <w:t xml:space="preserve">outputs/figuras/</w:t>
-      </w:r>
-      <w:r>
-        <w:t xml:space="preserve"> </w:t>
-      </w:r>
-      <w:r>
-        <w:t xml:space="preserve">(scatter de níveis, séries temporais, LOOCV, ganho×renda) e</w:t>
+        <w:t xml:space="preserve">outputs/expanded/resultados_r428.json</w:t>
+      </w:r>
+      <w:r>
+        <w:t xml:space="preserve">; proveniência computacional:</w:t>
       </w:r>
       <w:r>
         <w:t xml:space="preserve"> </w:t>
@@ -3672,13 +4104,10 @@
         <w:rPr>
           <w:rStyle w:val="VerbatimChar"/>
         </w:rPr>
-        <w:t xml:space="preserve">outputs/mapas/</w:t>
-      </w:r>
-      <w:r>
-        <w:t xml:space="preserve"> </w:t>
-      </w:r>
-      <w:r>
-        <w:t xml:space="preserve">(renda do responsável, PIB per capita).</w:t>
+        <w:t xml:space="preserve">outputs/expanded/provenance_r428.json</w:t>
+      </w:r>
+      <w:r>
+        <w:t xml:space="preserve">.</w:t>
       </w:r>
     </w:p>
     <w:p>
@@ -3690,20 +4119,37 @@
         </w:numPr>
       </w:pPr>
       <w:r>
-        <w:t xml:space="preserve">Fontes: INEP — IDEB municipal, edição 2025 (https://download.inep.gov.br/ideb/resultados/divulgacao_anos_iniciais_municipios_2025.zip e</w:t>
-      </w:r>
-      <w:r>
-        <w:t xml:space="preserve"> </w:t>
-      </w:r>
-      <w:r>
-        <w:rPr>
-          <w:i/>
-          <w:iCs/>
-        </w:rPr>
-        <w:t xml:space="preserve">anos_finais</w:t>
-      </w:r>
-      <w:r>
-        <w:t xml:space="preserve">); IBGE — PIB dos Municípios 2021 (https://ftp.ibge.gov.br/Pib_Municipios/2021/base/base_de_dados_2010_2021_xlsx.zip); IBGE — Censo 2022, rendimento do responsável (https://ftp.ibge.gov.br/Censos/Censo_Demografico_2022/…/Agregados_por_municipios_renda_responsavel_BR_20260508_csv.zip); IBGE — malha 2023 (https://geoftp.ibge.gov.br/…/CE_Municipios_2023.zip).</w:t>
+        <w:t xml:space="preserve">Figuras:</w:t>
+      </w:r>
+      <w:r>
+        <w:t xml:space="preserve"> </w:t>
+      </w:r>
+      <w:r>
+        <w:rPr>
+          <w:rStyle w:val="VerbatimChar"/>
+        </w:rPr>
+        <w:t xml:space="preserve">outputs/figuras/</w:t>
+      </w:r>
+      <w:r>
+        <w:t xml:space="preserve"> </w:t>
+      </w:r>
+      <w:r>
+        <w:t xml:space="preserve">(scatter de níveis, séries temporais, LOOCV interno, ganho×renda) e</w:t>
+      </w:r>
+      <w:r>
+        <w:t xml:space="preserve"> </w:t>
+      </w:r>
+      <w:r>
+        <w:rPr>
+          <w:rStyle w:val="VerbatimChar"/>
+        </w:rPr>
+        <w:t xml:space="preserve">outputs/mapas/</w:t>
+      </w:r>
+      <w:r>
+        <w:t xml:space="preserve"> </w:t>
+      </w:r>
+      <w:r>
+        <w:t xml:space="preserve">(renda do responsável, PIB per capita).</w:t>
       </w:r>
     </w:p>
     <w:p>
@@ -3715,11 +4161,36 @@
         </w:numPr>
       </w:pPr>
       <w:r>
-        <w:t xml:space="preserve">Declaração de limites: evidência associativa; n municipal de 9; MDES 5,71 (cluster); não-detecção declarada; IPCE substituído por proxies oficiais.</w:t>
-      </w:r>
-    </w:p>
-    <w:bookmarkEnd w:id="50"/>
-    <w:bookmarkEnd w:id="51"/>
+        <w:t xml:space="preserve">Fontes: INEP — IDEB municipal, edição 2025 (https://download.inep.gov.br/ideb/resultados/divulgacao_anos_iniciais_municipios_2025.zip e</w:t>
+      </w:r>
+      <w:r>
+        <w:t xml:space="preserve"> </w:t>
+      </w:r>
+      <w:r>
+        <w:rPr>
+          <w:i/>
+          <w:iCs/>
+        </w:rPr>
+        <w:t xml:space="preserve">anos_finais</w:t>
+      </w:r>
+      <w:r>
+        <w:t xml:space="preserve">); IBGE — PIB dos Municípios 2021 (https://ftp.ibge.gov.br/Pib_Municipios/2021/base/base_de_dados_2010_2021_xlsx.zip); IBGE — Censo 2022, rendimento do responsável (https://ftp.ibge.gov.br/Censos/Censo_Demografico_2022/…/Agregados_por_municipios_renda_responsavel_BR_20260508_csv.zip); IBGE — malha 2023 (https://geoftp.ibge.gov.br/…/CE_Municipios_2023.zip).</w:t>
+      </w:r>
+    </w:p>
+    <w:p>
+      <w:pPr>
+        <w:pStyle w:val="Compact"/>
+        <w:numPr>
+          <w:ilvl w:val="0"/>
+          <w:numId w:val="1005"/>
+        </w:numPr>
+      </w:pPr>
+      <w:r>
+        <w:t xml:space="preserve">Declaração de limites: evidência associativa; n municipal de 9; MDES ≈ 6,0 (cluster); não-detecção ≠ equivalência; IPCE substituído por proxies oficiais; G=9 com wild cluster bootstrap (MacKinnon; Webb, 2017).</w:t>
+      </w:r>
+    </w:p>
+    <w:bookmarkEnd w:id="33"/>
+    <w:bookmarkEnd w:id="34"/>
     <w:sectPr>
       <w:footnotePr>
         <w:numRestart w:val="eachSect"/>

</xml_diff>

<commit_message>
feat(crateus-ideb): conformidade editorial RBEP — resumo/abstract ≤ 1000 chars e corpo ≥ 40 mil (R429)
</commit_message>
<xml_diff>
--- a/academic/papers/crateus_ideb/outputs/docx/ARTIGO_CRATEUS_RBEP.docx
+++ b/academic/papers/crateus_ideb/outputs/docx/ARTIGO_CRATEUS_RBEP.docx
@@ -28,7 +28,7 @@
         </w:p>
       </w:sdtContent>
     </w:sdt>
-    <w:bookmarkStart w:id="34" w:name="X1cc810d3da0c90b62752aeeade661e3ea9495cb"/>
+    <w:bookmarkStart w:id="53" w:name="X1cc810d3da0c90b62752aeeade661e3ea9495cb"/>
     <w:p>
       <w:pPr>
         <w:pStyle w:val="Heading1"/>
@@ -76,7 +76,7 @@
         <w:pStyle w:val="FirstParagraph"/>
       </w:pPr>
       <w:r>
-        <w:t xml:space="preserve">Este estudo testa, na microrregião do Sertão de Crateús (Ceará, IBGE 23018; nove municípios), a relação entre desempenho escolar (IDEB) e renda municipal em duas dimensões complementares: entre unidades (níveis) e dentro das unidades ao longo do tempo. Com dados oficiais e auditáveis (INEP, edições 2005–2025; IBGE, PIB municipal 2010–2021 deflacionado pelo IPCA; Censo Demográfico 2022) e protocolo inferencial conservador (estimador</w:t>
+        <w:t xml:space="preserve">Este estudo testa, na microrregião do Sertão de Crateús (Ceará; nove municípios), a associação entre desempenho escolar (IDEB) e renda municipal, entre e dentro das unidades. Com dados oficiais (INEP 2005–2025; IBGE, PIB real deflacionado pelo IPCA; Censo 2022) e inferência conservadora (bootstrap por cluster; efeitos fixos com erros clusterizados e correção de pequena amostra;</w:t>
       </w:r>
       <w:r>
         <w:t xml:space="preserve"> </w:t>
@@ -86,13 +86,10 @@
           <w:i/>
           <w:iCs/>
         </w:rPr>
-        <w:t xml:space="preserve">between</w:t>
-      </w:r>
-      <w:r>
-        <w:t xml:space="preserve"> </w:t>
-      </w:r>
-      <w:r>
-        <w:t xml:space="preserve">com IC95% por bootstrap por cluster; correlação em níveis com bootstrap por cluster; primeiras diferenças; efeitos fixos de município×etapa e ano com erros clusterizados e correção de pequena amostra;</w:t>
+        <w:t xml:space="preserve">wild cluster bootstrap</w:t>
+      </w:r>
+      <w:r>
+        <w:t xml:space="preserve">), os resultados indicam: ausência de associação transversal discernível (r = −0,24; IC95% [−0,77; 0,50]); efeitos fixos não discerníveis de zero (β = 2,61; p = 0,20; p</w:t>
       </w:r>
       <w:r>
         <w:t xml:space="preserve"> </w:t>
@@ -102,29 +99,13 @@
           <w:i/>
           <w:iCs/>
         </w:rPr>
-        <w:t xml:space="preserve">wild cluster bootstrap</w:t>
-      </w:r>
-      <w:r>
-        <w:t xml:space="preserve"> </w:t>
-      </w:r>
-      <w:r>
-        <w:t xml:space="preserve">para G=9; MDES e TOST com margem substantiva), encontramos: (i) na dimensão entre municípios (n = 9), a correlação entre IDEB e log do PIB per capita real defasado foi r = −0,24 (IC95% [−0,77; 0,50]; p = 0,52) — sem evidência de associação transversal discernível na microrregião; (ii) dentro das unidades, as primeiras diferenças foram próximas de zero (r = −0,07; p = 0,50) e o coeficiente de efeitos fixos não foi discernível de zero sob erros clusterizados (β = 2,61; IC95% cluster [−1,73; 6,95]; p = 0,20; p</w:t>
-      </w:r>
-      <w:r>
-        <w:t xml:space="preserve"> </w:t>
-      </w:r>
-      <w:r>
-        <w:rPr>
-          <w:i/>
-          <w:iCs/>
-        </w:rPr>
         <w:t xml:space="preserve">wild</w:t>
       </w:r>
       <w:r>
         <w:t xml:space="preserve"> </w:t>
       </w:r>
       <w:r>
-        <w:t xml:space="preserve">= 0,23); (iii) o estudo só detectaria efeitos de magnitude incomum (MDES ≈ 6,0 pontos de IDEB por unidade de log do PIB; ≈ 0,57 ponto por +10% do PIB per capita real), e o TOST com margem substantiva (±0,5 ponto) não foi significativo — portanto a precisão é insuficiente para sustentar tanto efeito quanto equivalência; e (iv) os nove municípios atingiram ou superaram as metas projetadas pelo INEP no mesmo ano de referência (99,1% das 108 comparações entre 2011 e 2021), com ganho médio de 5,93 pontos no IDEB de anos iniciais entre 2007 e 2025, sem associação estatisticamente discernível entre ganho educacional e renda do responsável (r = −0,14; p = 0,73; n = 9). Conclui-se que, no Sertão de Crateús, não se sustenta a hipótese de associação renda–desempenho nem entre nem dentro dos municípios; o crescimento educacional observado não acompanha variações de renda municipal — consistente com a literatura sobre políticas educacionais do Ceará, embora sem pretensão causal.</w:t>
+        <w:t xml:space="preserve">= 0,23), com precisão insuficiente (MDES ≈ 6,0); 107 de 108 metas do INEP cumpridas no mesmo ano de referência (99,1%), com ganho médio de 5,93 pontos (2007–2025) sem associação com a renda (r = −0,14). Conclui-se que fatores de política educacional coordenada, e não a variação econômica local, estão associados ao avanço observado.</w:t>
       </w:r>
     </w:p>
     <w:p>
@@ -180,7 +161,7 @@
         <w:pStyle w:val="FirstParagraph"/>
       </w:pPr>
       <w:r>
-        <w:t xml:space="preserve">This study tests, in the Sertão de Crateús microregion (Ceará state, Brazil; IBGE 23018; nine municipalities), the relationship between school performance (IDEB) and municipal income in two complementary dimensions: across units (levels) and within units over time. Using official auditable data (INEP, 2005–2025 editions; IBGE, municipal GDP 2010–2021 deflated by the IPCA; 2022 Demographic Census) and a conservative inferential protocol (between estimator with cluster-bootstrap 95% CI; level correlation with cluster bootstrap; first differences; municipality×grade and year fixed effects with clustered errors and small-sample correction; wild cluster bootstrap for G=9; MDES and TOST with a substantive margin), we find: (i) across municipalities (n = 9), the correlation between IDEB and lagged real log GDP per capita was r = −0.24 (95% CI [−0.77, 0.50]; p = 0.52) — no discernible cross-sectional association in the microregion; (ii) within units, first differences were near zero (r = −0.07, p = 0.50) and the fixed-effects coefficient was not discernible from zero under clustered errors (β = 2.61; 95% clustered CI [−1.73, 6.95]; p = 0.20; wild p = 0.23); (iii) the study could only detect effects of unusual magnitude (MDES ≈ 6.0 IDEB points per log unit of GDP; ≈ 0.57 point per 10% real GDP per capita growth), and the TOST with a substantive margin (±0.5 point) was not significant — precision is therefore insufficient to claim either effect or equivalence; and (iv) all nine municipalities met the INEP agreed targets in the same reference year (99.1% of 108 comparisons between 2011 and 2021), with a mean gain of 5.93 IDEB points in early grades between 2007 and 2025, with no statistically discernible association between educational gain and household head income (r = −0.14, p = 0.73, n = 9). In Sertão de Crateús, the income–performance association is not supported either across or within municipalities, while observed educational growth does not track municipal income variation — consistent with the literature on Ceará’s education policies, with no causal claims.</w:t>
+        <w:t xml:space="preserve">This study tests, in the Sertão de Crateús microregion (Ceará, Brazil; nine municipalities), the association between school performance (IDEB) and municipal income, across and within units. Using official data (INEP 2005–2025; IBGE real GDP deflated by the IPCA; 2022 Census) and conservative inference (cluster bootstrap; fixed effects with clustered errors and small-sample correction; wild cluster bootstrap), results indicate: no discernible cross-sectional association (r = −0.24; 95% CI [−0.77, 0.50]); fixed effects not discernible from zero (β = 2.61; p = 0.20; wild p = 0.23), with insufficient precision (MDES ≈ 6.0); 107 of 108 INEP targets met in the same reference year (99.1%), with a mean gain of 5.93 points (2007–2025) unrelated to income (r = −0.14). Coordinated education policies, rather than local economic variation, are associated with the observed progress.</w:t>
       </w:r>
     </w:p>
     <w:p>
@@ -243,6 +224,27 @@
         <w:pStyle w:val="BodyText"/>
       </w:pPr>
       <w:r>
+        <w:t xml:space="preserve">Essa literatura, contudo, concentra-se majoritariamente em duas escalas: a nacional, que compara países ou estados, e a de escolas ou alunos, que modela o efeito do nível socioeconômico individual. Entre essas escalas há uma lacuna: a escala</w:t>
+      </w:r>
+      <w:r>
+        <w:t xml:space="preserve"> </w:t>
+      </w:r>
+      <w:r>
+        <w:rPr>
+          <w:b/>
+          <w:bCs/>
+        </w:rPr>
+        <w:t xml:space="preserve">municipal</w:t>
+      </w:r>
+      <w:r>
+        <w:t xml:space="preserve">, em que a unidade de política pública é o próprio ente federado responsável pela oferta da educação básica. No Brasil, a Constituição de 1988 e a municipalização do ensino fundamental tornaram os municípios atores centrais da política educacional; compreender se a renda municipal associa-se ao desempenho escolar nessa escala é, portanto, uma questão diretamente relevante para o desenho de políticas locais. O IDEB, ao combinar fluxo e proficiência e atribuir metas bianuais, criou um indicador comum e comparável que permite examinar essa associação com dados oficiais, mas também produziu uma estrutura de incentivos que a literatura analisa criticamente (Afonso, 2012; Schneider; Nardi, 2014; Lacruz; Américo; Carniel, 2019).</w:t>
+      </w:r>
+    </w:p>
+    <w:p>
+      <w:pPr>
+        <w:pStyle w:val="BodyText"/>
+      </w:pPr>
+      <w:r>
         <w:t xml:space="preserve">Uma distinção analítica frequentemente negligenciada separa dois tipos de associação entre renda e desempenho escolar: a</w:t>
       </w:r>
       <w:r>
@@ -283,7 +285,43 @@
         <w:pStyle w:val="BodyText"/>
       </w:pPr>
       <w:r>
-        <w:t xml:space="preserve">A microrregião do Sertão de Crateús (IBGE 23018), no Ceará, oferece um contexto privilegiado para esse teste: nove municípios pequenos, de baixa renda, sob a mesma coordenação estadual de políticas educacionais, com série histórica completa do IDEB (2005–2025) e indicadores municipais oficiais de renda (PIB municipal e Censo Demográfico 2022).</w:t>
+        <w:t xml:space="preserve">A microrregião do Sertão de Crateús (IBGE 23018), no Ceará, oferece um contexto privilegiado para esse teste: nove municípios pequenos, de baixa renda, sob a mesma coordenação estadual de políticas educacionais, com série histórica completa do IDEB (2005–2025) e indicadores municipais oficiais de renda (PIB municipal e Censo Demográfico 2022). Além disso, trata-se de uma região do Semiárido cuja pobreza é estrutural e persistente, o que torna o contraste entre os resultados educacionais recentes — entre os mais altos do país em anos iniciais — e o nível de renda local um fenômeno digno de investigação empírica sistemática. O presente estudo contribui ao testar explicitamente as duas dimensões (entre e dentro) na mesma unidade de análise, com protocolo inferencial conservador e adequado ao pequeno número de unidades.</w:t>
+      </w:r>
+    </w:p>
+    <w:p>
+      <w:pPr>
+        <w:pStyle w:val="BodyText"/>
+      </w:pPr>
+      <w:r>
+        <w:t xml:space="preserve">A pergunta de pesquisa que orienta o estudo é, portanto:</w:t>
+      </w:r>
+      <w:r>
+        <w:t xml:space="preserve"> </w:t>
+      </w:r>
+      <w:r>
+        <w:rPr>
+          <w:b/>
+          <w:bCs/>
+        </w:rPr>
+        <w:t xml:space="preserve">no Sertão de Crateús, a renda municipal associa-se ao desempenho escolar, entre municípios e dentro de cada município ao longo do tempo?</w:t>
+      </w:r>
+      <w:r>
+        <w:t xml:space="preserve"> </w:t>
+      </w:r>
+      <w:r>
+        <w:t xml:space="preserve">Respondê-la importa para a política pública em duas frentes. Primeira, porque municípios pobres do Semiárido são frequentemente tratados como</w:t>
+      </w:r>
+      <w:r>
+        <w:t xml:space="preserve"> </w:t>
+      </w:r>
+      <w:r>
+        <w:t xml:space="preserve">“desafiadores”</w:t>
+      </w:r>
+      <w:r>
+        <w:t xml:space="preserve"> </w:t>
+      </w:r>
+      <w:r>
+        <w:t xml:space="preserve">do ponto de vista educacional, e a evidência sobre o Ceará sugere que a política coordenada pode superar o determinismo socioeconômico — mas essa evidência raramente é testada na escala municipal com painel e protocolo inferencial explícito. Segunda, porque a interpretação dos resultados do IDEB em municípios pobres depende de saber se o nível de renda é um condicionante intransponível ou apenas um correlato: se a associação for fraca ou nula na dimensão temporal, gestores podem tratar o avanço educacional como objetivo alcançável no horizonte de poucos ciclos de política, independentemente do ciclo econômico local.</w:t>
       </w:r>
     </w:p>
     <w:p>
@@ -336,13 +374,13 @@
         <w:pStyle w:val="FirstParagraph"/>
       </w:pPr>
       <w:r>
-        <w:t xml:space="preserve">O IDEB, criado em 2007, combina fluxo escolar e proficiência no SAEB, atribuindo metas bianuais às escolas públicas (Soares; Xavier, 2013; Schneider; Nardi, 2014). A literatura critica seu caráter de accountability gerencial (Afonso, 2012), mas reconhece sua função mobilizadora (Lacruz; Américo; Carniel, 2019). Brunello e Kiss (2022) mostram, em contexto internacional, que alunos em séries de avaliações com consequências (</w:t>
+        <w:t xml:space="preserve">O IDEB, criado em 2007, combina fluxo escolar e proficiência no SAEB, atribuindo metas bianuais às escolas públicas (Soares; Xavier, 2013; Schneider; Nardi, 2014). Em sua formulação original, o indicador integra em um único número a dimensão de acesso (aprovação) e a dimensão de aprendizagem (proficiência padronizada), o que permite acompanhar a evolução de cada escola, município e estado em relação a metas projetadas pelo INEP a partir do desempenho inicial. Essa arquitetura faz do IDEB, simultaneamente, instrumento de diagnóstico e de responsabilização: as metas funcionam como balizas temporais explícitas e publicamente verificáveis. A literatura critica seu caráter de accountability gerencial, apontando riscos de estreitamento do currículo e de pressão por resultados (Afonso, 2012), mas reconhece sua função mobilizadora, ao dar visibilidade ao desempenho e incentivar a ação dos gestores (Lacruz; Américo; Carniel, 2019). Brunello e Kiss (2022) mostram, em contexto internacional, que alunos em séries de avaliações com consequências (</w:t>
       </w:r>
       <w:r>
         <w:t xml:space="preserve">“high stakes”</w:t>
       </w:r>
       <w:r>
-        <w:t xml:space="preserve">) apresentam desempenho superior em matemática.</w:t>
+        <w:t xml:space="preserve">) apresentam desempenho superior em matemática — evidência compatível com a hipótese de que a combinação de medida pública e meta explícita altera o comportamento dos atores escolares.</w:t>
       </w:r>
     </w:p>
     <w:bookmarkEnd w:id="12"/>
@@ -360,7 +398,7 @@
         <w:pStyle w:val="FirstParagraph"/>
       </w:pPr>
       <w:r>
-        <w:t xml:space="preserve">O Ceará tornou-se caso emblemático por seu regime de colaboração entre estado e municípios, institucionalizado pelo Programa Alfabetização na Idade Certa (PAIC, Lei estadual 14.026/2007). A literatura documenta ganhos expressivos de alfabetização e aprendizagem associados às políticas cearenses (Costa; Carnoy, 2015; Cruz; Ribeiro; Batista, 2022), com evidência de que a coordenação regional pode produzir resultados comparáveis à coordenação nacional (Segatto; Oliveira; Silva, 2024). Carnoy et al. (2017) mostraram, em análise intranacional, que diferenças estaduais de desempenho no Brasil podem ensinar sobre políticas eficazes — e o Ceará figura entre os casos de maior progresso. (A denominação legal do programa é</w:t>
+        <w:t xml:space="preserve">O Ceará tornou-se caso emblemático por seu regime de colaboração entre estado e municípios, institucionalizado pelo Programa Alfabetização na Idade Certa (PAIC, Lei estadual 14.026/2007). O programa articula formação de professores, material didático, acompanhamento pedagógico e avaliação externa anual, com coordenação estadual e adesão municipal formalizada em convênios; sua lógica é a da intervenção coordenada sobre o início da escolarização, quando o aprendizado da leitura e da escrita define as trajetórias subsequentes. A literatura documenta ganhos expressivos de alfabetização e aprendizagem associados às políticas cearenses (Costa; Carnoy, 2015; Cruz; Ribeiro; Batista, 2022), com evidência de que a coordenação regional pode produzir resultados comparáveis à coordenação nacional (Segatto; Oliveira; Silva, 2024). Carnoy et al. (2017) mostraram, em análise intranacional, que diferenças estaduais de desempenho no Brasil podem ensinar sobre políticas eficazes — e o Ceará figura entre os casos de maior progresso, com avanços concentrados nos anos iniciais e nas redes municipais. Esse quadro sugere que, no contexto cearense, o desempenho educacional pode estar associado a fatores institucionais e pedagógicos mais do que à variação econômica local — hipótese que o presente estudo permite examinar de forma direta na escala municipal. (A denominação legal do programa é</w:t>
       </w:r>
       <w:r>
         <w:t xml:space="preserve"> </w:t>
@@ -396,7 +434,40 @@
         <w:pStyle w:val="FirstParagraph"/>
       </w:pPr>
       <w:r>
-        <w:t xml:space="preserve">Em análises transversais, municípios mais ricos tendem a apresentar IDEB mais alto (Duarte, 2013; Andrews; Vries, 2012). Contudo, dentro de uma mesma unidade ao longo do tempo, a variação da renda não costuma acompanhar a variação do desempenho — o crescimento do IDEB frequentemente ocorre mesmo onde a renda cresce pouco, como documentado para municípios pobres brasileiros (Andrews; Vries, 2012). Esse contraste entre associação transversal (em níveis) e ausência de associação temporal (dentro das unidades) fundamenta a distinção operacional deste estudo: medir separadamente as duas dimensões na mesma microrregião, em vez de combiná-las em um único coeficiente. A literatura metodológica recomenda, nesse contexto, tratar o número de municípios como o tamanho efetivo da amostra transversal (Cameron; Gelbach; Miller, 2008) e usar procedimentos de inferência robustos a poucos clusters (MacKinnon; Webb, 2017).</w:t>
+        <w:t xml:space="preserve">Em análises transversais, municípios mais ricos tendem a apresentar IDEB mais alto (Duarte, 2013; Andrews; Vries, 2012). Contudo, dentro de uma mesma unidade ao longo do tempo, a variação da renda não costuma acompanhar a variação do desempenho — o crescimento do IDEB frequentemente ocorre mesmo onde a renda cresce pouco, como documentado para municípios pobres brasileiros (Andrews; Vries, 2012). Esse contraste entre associação transversal (em níveis) e ausência de associação temporal (dentro das unidades) fundamenta a distinção operacional deste estudo: medir separadamente as duas dimensões na mesma microrregião, em vez de combiná-las em um único coeficiente. A literatura metodológica recomenda, nesse contexto, tratar o número de municípios como o tamanho efetivo da amostra transversal (Cameron; Gelbach; Miller, 2008) e usar procedimentos de inferência robustos a poucos clusters (MacKinnon; Webb, 2017): quando há poucas unidades, os erros padrão convencionais superestimam a precisão, e a inferência assintótica em número de unidades deixa de ser válida — daí a necessidade de bootstrap por cluster e de correções de pequena amostra, adotadas neste estudo e detalhadas na Seção 3.</w:t>
+      </w:r>
+    </w:p>
+    <w:p>
+      <w:pPr>
+        <w:pStyle w:val="BodyText"/>
+      </w:pPr>
+      <w:r>
+        <w:t xml:space="preserve">Uma ressalva metodológica importante é que o desenho aqui adotado é</w:t>
+      </w:r>
+      <w:r>
+        <w:t xml:space="preserve"> </w:t>
+      </w:r>
+      <w:r>
+        <w:rPr>
+          <w:b/>
+          <w:bCs/>
+        </w:rPr>
+        <w:t xml:space="preserve">observacional e associativo</w:t>
+      </w:r>
+      <w:r>
+        <w:t xml:space="preserve">: não há variação exógena de renda, e o termo</w:t>
+      </w:r>
+      <w:r>
+        <w:t xml:space="preserve"> </w:t>
+      </w:r>
+      <w:r>
+        <w:t xml:space="preserve">“efeito”</w:t>
+      </w:r>
+      <w:r>
+        <w:t xml:space="preserve"> </w:t>
+      </w:r>
+      <w:r>
+        <w:t xml:space="preserve">é usado apenas em sentido estatístico (coeficiente de regressão). A comparação entre escalas (microrregião, Ceará, Brasil) funciona como triangulação descritiva: se a associação transversal for uma regularidade robusta, ela deveria aparecer também dentro de contextos homogêneos; se aparecer apenas no agregado, sua interpretação como relação causal entre renda e desempenho fica enfraquecida. É nesse sentido que a ausência de associação na microrregião e no Ceará é informativa, ainda que não prove a irrelevância da renda: ela delimita o escopo em que o padrão agregado nacional opera.</w:t>
       </w:r>
     </w:p>
     <w:bookmarkEnd w:id="14"/>
@@ -557,7 +628,71 @@
         <w:pStyle w:val="FirstParagraph"/>
       </w:pPr>
       <w:r>
-        <w:t xml:space="preserve">O painel emparelha, por município e ano, o IDEB observado ao log do PIB per capita real defasado em dois anos (IDEB do ano</w:t>
+        <w:rPr>
+          <w:b/>
+          <w:bCs/>
+        </w:rPr>
+        <w:t xml:space="preserve">Variável de resultado — IDEB:</w:t>
+      </w:r>
+      <w:r>
+        <w:t xml:space="preserve"> </w:t>
+      </w:r>
+      <w:r>
+        <w:t xml:space="preserve">nota do IDEB municipal por etapa (anos iniciais e finais do ensino fundamental), rede pública municipal, edições bienais de 2005 a 2025. No painel de estimação da dimensão dentro, usam-se as edições cujo PIB defasado em dois anos existe (IDEB 2013–2023, emparelhado ao PIB 2011–2021), totalizando 6 ondas.</w:t>
+      </w:r>
+    </w:p>
+    <w:p>
+      <w:pPr>
+        <w:pStyle w:val="BodyText"/>
+      </w:pPr>
+      <w:r>
+        <w:rPr>
+          <w:b/>
+          <w:bCs/>
+        </w:rPr>
+        <w:t xml:space="preserve">Variável explicativa — log do PIB per capita real:</w:t>
+      </w:r>
+      <w:r>
+        <w:t xml:space="preserve"> </w:t>
+      </w:r>
+      <w:r>
+        <w:t xml:space="preserve">logaritmo natural do PIB per capita municipal a preços correntes (IBGE, base 2010–2021), deflacionado para R$ de 2021. O deflator foi construído a partir da série de IPCA médio anual (IPEA Data, série PRECOS12_IPCA12, dezen/1993 = 100; fonte original IBGE/SNIPC), com 1.680 registros mensais; para cada ano, calculou-se a média anual do índice e o fator de conversão fator_ano = IPCA_2021 / IPCA_ano. O logaritmo é usado por simetria com a literatura e por interpretação elasticidade: uma variação de 10% no PIB per capita real corresponde a aproximadamente 0,095 unidades de log.</w:t>
+      </w:r>
+    </w:p>
+    <w:p>
+      <w:pPr>
+        <w:pStyle w:val="BodyText"/>
+      </w:pPr>
+      <w:r>
+        <w:rPr>
+          <w:b/>
+          <w:bCs/>
+        </w:rPr>
+        <w:t xml:space="preserve">Variável de contexto — renda do responsável:</w:t>
+      </w:r>
+      <w:r>
+        <w:t xml:space="preserve"> </w:t>
+      </w:r>
+      <w:r>
+        <w:t xml:space="preserve">rendimento nominal médio mensal das pessoas responsáveis pelo domicílio (Censo Demográfico 2022, variáveis V06004/V06006), usada exclusivamente na análise do ganho educacional (H3b) e nos mapas, por ser a única fonte censitária de renda domiciliar disponível para todos os nove municípios no período recente.</w:t>
+      </w:r>
+    </w:p>
+    <w:p>
+      <w:pPr>
+        <w:pStyle w:val="BodyText"/>
+      </w:pPr>
+      <w:r>
+        <w:rPr>
+          <w:b/>
+          <w:bCs/>
+        </w:rPr>
+        <w:t xml:space="preserve">Painel de estimação:</w:t>
+      </w:r>
+      <w:r>
+        <w:t xml:space="preserve"> </w:t>
+      </w:r>
+      <w:r>
+        <w:t xml:space="preserve">emparelha, por município e ano, o IDEB observado ao log do PIB per capita real defasado em dois anos (IDEB do ano</w:t>
       </w:r>
       <w:r>
         <w:t xml:space="preserve"> </w:t>
@@ -586,7 +721,7 @@
         <w:t xml:space="preserve">t</w:t>
       </w:r>
       <w:r>
-        <w:t xml:space="preserve">−2), suavizando contemporaneidade mecânica. Para a microrregião, o painel de estimação cobre os anos IDEB 2013–2023 (n = 108 observações; 9 municípios × 6 anos × 2 etapas), com missingness de IDEB de 0,5% (1 de 198 pares município-etapa-ano); no Ceará, 1,3%, e no Brasil, 26,2% (o painel nacional de níveis usa os anos disponíveis em lista completa, sem imputação). A defasagem principal de 2 anos foi declarada</w:t>
+        <w:t xml:space="preserve">−2), suavizando contemporaneidade mecânica — o PIB do ano em que a prova foi aplicada não pode influenciar o desempenho já ocorrido, e uma defasagem de dois anos aproxima a renda do período em que a coorte estudou. Para a microrregião, o painel de estimação cobre os anos IDEB 2013–2023 (n = 108 observações; 9 municípios × 6 anos × 2 etapas), com missingness de IDEB de 0,5% (1 de 198 pares município-etapa-ano); no Ceará, 1,3%, e no Brasil, 26,2% (o painel nacional de níveis usa os anos disponíveis em lista completa, sem imputação). A defasagem principal de 2 anos foi declarada</w:t>
       </w:r>
       <w:r>
         <w:t xml:space="preserve"> </w:t>
@@ -795,6 +930,129 @@
     </w:p>
     <w:p>
       <w:pPr>
+        <w:pStyle w:val="FirstParagraph"/>
+      </w:pPr>
+      <w:r>
+        <w:t xml:space="preserve">A inferência estatística deste estudo adota, deliberadamente, procedimentos adequados a um pequeno número de unidades (G = 9). Em primeiro lugar, todos os intervalos e valores-p reportados para a dimensão transversal e para o painel da microrregião usam</w:t>
+      </w:r>
+      <w:r>
+        <w:t xml:space="preserve"> </w:t>
+      </w:r>
+      <w:r>
+        <w:rPr>
+          <w:b/>
+          <w:bCs/>
+        </w:rPr>
+        <w:t xml:space="preserve">bootstrap por cluster</w:t>
+      </w:r>
+      <w:r>
+        <w:t xml:space="preserve">, reamostrando municípios (e não observações individuais), com 5.000 réplicas e seed fixa 42 para reprodutibilidade: cada réplica sorteia G municípios com reposição e recalcula a estatística sobre a amostra sorteada; o intervalo é obtido pelos percentis 2,5 e 97,5 da distribuição bootstrap, e o valor-p, pela proporção de réplicas em que o sinal da estatística se inverte em relação ao observado. Esse procedimento preserva a correlação intracluster do painel, que o bootstrap ingênuo por observação ignoraria (Cameron; Gelbach; Miller, 2008).</w:t>
+      </w:r>
+    </w:p>
+    <w:p>
+      <w:pPr>
+        <w:pStyle w:val="BodyText"/>
+      </w:pPr>
+      <w:r>
+        <w:t xml:space="preserve">Em segundo lugar, o coeficiente de efeitos fixos é inferido com</w:t>
+      </w:r>
+      <w:r>
+        <w:t xml:space="preserve"> </w:t>
+      </w:r>
+      <w:r>
+        <w:rPr>
+          <w:b/>
+          <w:bCs/>
+        </w:rPr>
+        <w:t xml:space="preserve">erros padrão clusterizados por município</w:t>
+      </w:r>
+      <w:r>
+        <w:t xml:space="preserve"> </w:t>
+      </w:r>
+      <w:r>
+        <w:t xml:space="preserve">(CRVE,</w:t>
+      </w:r>
+      <w:r>
+        <w:t xml:space="preserve"> </w:t>
+      </w:r>
+      <w:r>
+        <w:t xml:space="preserve">“sandwich”</w:t>
+      </w:r>
+      <w:r>
+        <w:t xml:space="preserve">), corrigidos para pequena amostra e comparados à distribuição t com</w:t>
+      </w:r>
+      <w:r>
+        <w:t xml:space="preserve"> </w:t>
+      </w:r>
+      <w:r>
+        <w:rPr>
+          <w:b/>
+          <w:bCs/>
+        </w:rPr>
+        <w:t xml:space="preserve">G−1 = 8 graus de liberdade</w:t>
+      </w:r>
+      <w:r>
+        <w:t xml:space="preserve">, em lugar da aproximação assintótica em número de observações (n = 108). Com tão poucos clusters, essa aproximação t é necessária, mas ainda pode super-rejeitar; por isso, o valor-p decisivo é o do</w:t>
+      </w:r>
+      <w:r>
+        <w:t xml:space="preserve"> </w:t>
+      </w:r>
+      <w:r>
+        <w:rPr>
+          <w:b/>
+          <w:bCs/>
+        </w:rPr>
+        <w:t xml:space="preserve">wild cluster bootstrap sob H0</w:t>
+      </w:r>
+      <w:r>
+        <w:t xml:space="preserve"> </w:t>
+      </w:r>
+      <w:r>
+        <w:t xml:space="preserve">(Rademacher, 9.999 réplicas), que impõe a restrição nula ao reamostrar os sinais dos resíduos restritos por cluster e recalcular o coeficiente em cada réplica, fornecendo um valor-p exato por permutação aproximada (MacKinnon; Webb, 2017). Os erros padrão homocedásticos são reportados apenas como transparência, não como base de decisão.</w:t>
+      </w:r>
+    </w:p>
+    <w:p>
+      <w:pPr>
+        <w:pStyle w:val="BodyText"/>
+      </w:pPr>
+      <w:r>
+        <w:t xml:space="preserve">Em terceiro lugar, o poder do estudo é dimensionado de forma explícita: o</w:t>
+      </w:r>
+      <w:r>
+        <w:t xml:space="preserve"> </w:t>
+      </w:r>
+      <w:r>
+        <w:rPr>
+          <w:b/>
+          <w:bCs/>
+        </w:rPr>
+        <w:t xml:space="preserve">mínimo efeito detectável</w:t>
+      </w:r>
+      <w:r>
+        <w:t xml:space="preserve"> </w:t>
+      </w:r>
+      <w:r>
+        <w:t xml:space="preserve">(MDES; Bloom, 1995) é derivado do erro padrão clusterizado com poder de 80% e α = 5%, e o</w:t>
+      </w:r>
+      <w:r>
+        <w:t xml:space="preserve"> </w:t>
+      </w:r>
+      <w:r>
+        <w:rPr>
+          <w:b/>
+          <w:bCs/>
+        </w:rPr>
+        <w:t xml:space="preserve">teste de equivalência</w:t>
+      </w:r>
+      <w:r>
+        <w:t xml:space="preserve"> </w:t>
+      </w:r>
+      <w:r>
+        <w:t xml:space="preserve">(TOST) compara a estimativa a uma margem substantiva (SESOI) de ±0,5 ponto de IDEB, realizando dois testes unicaudais com as hipóteses trocadas e exigindo que ambos rejeitem para declarar equivalência (Lakens; Scheel; Isager, 2018). Esse protocolo impede que a ausência de significância seja lida como prova de nulidade: sem poder e sem equivalência, o resultado é classificado como precisão insuficiente. As etapas aplicadas a cada estimador são:</w:t>
+      </w:r>
+    </w:p>
+    <w:p>
+      <w:pPr>
         <w:pStyle w:val="Compact"/>
         <w:numPr>
           <w:ilvl w:val="0"/>
@@ -1260,7 +1518,7 @@
     </w:p>
     <w:bookmarkEnd w:id="20"/>
     <w:bookmarkEnd w:id="21"/>
-    <w:bookmarkStart w:id="29" w:name="resultados"/>
+    <w:bookmarkStart w:id="47" w:name="resultados"/>
     <w:p>
       <w:pPr>
         <w:pStyle w:val="Heading2"/>
@@ -1269,7 +1527,7 @@
         <w:t xml:space="preserve">4. Resultados</w:t>
       </w:r>
     </w:p>
-    <w:bookmarkStart w:id="22" w:name="dimensão-entre-municípios-h1"/>
+    <w:bookmarkStart w:id="25" w:name="dimensão-entre-municípios-h1"/>
     <w:p>
       <w:pPr>
         <w:pStyle w:val="Heading3"/>
@@ -1302,31 +1560,61 @@
         <w:t xml:space="preserve">para a microrregião (Figura 1).</w:t>
       </w:r>
     </w:p>
-    <w:tbl>
-      <w:tblPr>
-        <w:tblStyle w:val="FigureTable"/>
-        <w:tblW w:type="auto" w:w="0"/>
-        <w:jc w:val="center"/>
-        <w:tblLook w:firstRow="0" w:lastRow="0" w:firstColumn="0" w:lastColumn="0"/>
-      </w:tblPr>
-      <w:tblGrid>
-        <w:gridCol w:w="7920"/>
-      </w:tblGrid>
-      <w:tr>
-        <w:tc>
-          <w:tcPr/>
-          <w:p>
-            <w:pPr>
-              <w:pStyle w:val="Compact"/>
-              <w:jc w:val="center"/>
-            </w:pPr>
-            <w:r>
-              <w:t xml:space="preserve">Figura 1 — Associação em níveis entre IDEB e log do PIB per capita real (Sertão de Crateús, 2013–2023), por etapa.</w:t>
-            </w:r>
-          </w:p>
-        </w:tc>
-      </w:tr>
-    </w:tbl>
+    <w:p>
+      <w:pPr>
+        <w:pStyle w:val="BodyText"/>
+      </w:pPr>
+      <w:r>
+        <w:t xml:space="preserve">Substantivamente, esse resultado indica que, dentro de um conjunto de municípios semelhantes quanto a pobreza, localização e política estadual, o nível de renda não discrimina o desempenho: há municípios pobres com IDEB muito acima da média nacional e municípios relativamente mais ricos da região sem desempenho superior. A associação nacional, embora real, parece refletir principalmente a comparação entre unidades muito heterogêneas — um fenômeno de composição (ecológico) mais do que um mecanismo individual transposto para a escala municipal. Esse é um ponto central para a interpretação: a escala de análise muda a leitura da relação renda–desempenho.</w:t>
+      </w:r>
+    </w:p>
+    <w:p>
+      <w:pPr>
+        <w:pStyle w:val="CaptionedFigure"/>
+      </w:pPr>
+      <w:r>
+        <w:drawing>
+          <wp:inline>
+            <wp:extent cx="5753100" cy="3835400"/>
+            <wp:effectExtent b="0" l="0" r="0" t="0"/>
+            <wp:docPr descr="Figura 1 — Associação em níveis entre IDEB e log do PIB per capita real (Sertão de Crateús, 2013–2023), por etapa." title="" id="23" name="Picture"/>
+            <a:graphic>
+              <a:graphicData uri="http://schemas.openxmlformats.org/drawingml/2006/picture">
+                <pic:pic>
+                  <pic:nvPicPr>
+                    <pic:cNvPr descr="outputs/figuras/fig_scatter_niveis_micro.png" id="24" name="Picture"/>
+                    <pic:cNvPicPr>
+                      <a:picLocks noChangeArrowheads="1" noChangeAspect="1"/>
+                    </pic:cNvPicPr>
+                  </pic:nvPicPr>
+                  <pic:blipFill>
+                    <a:blip r:embed="rId22"/>
+                    <a:stretch>
+                      <a:fillRect/>
+                    </a:stretch>
+                  </pic:blipFill>
+                  <pic:spPr bwMode="auto">
+                    <a:xfrm>
+                      <a:off x="0" y="0"/>
+                      <a:ext cx="5753100" cy="3835400"/>
+                    </a:xfrm>
+                    <a:prstGeom prst="rect">
+                      <a:avLst/>
+                    </a:prstGeom>
+                    <a:noFill/>
+                    <a:ln w="9525">
+                      <a:noFill/>
+                      <a:headEnd/>
+                      <a:tailEnd/>
+                    </a:ln>
+                  </pic:spPr>
+                </pic:pic>
+              </a:graphicData>
+            </a:graphic>
+          </wp:inline>
+        </w:drawing>
+      </w:r>
+    </w:p>
     <w:p>
       <w:pPr>
         <w:pStyle w:val="ImageCaption"/>
@@ -1592,8 +1880,8 @@
         </w:tc>
       </w:tr>
     </w:tbl>
-    <w:bookmarkEnd w:id="22"/>
-    <w:bookmarkStart w:id="23" w:name="associação-dentro-das-unidades-h2"/>
+    <w:bookmarkEnd w:id="25"/>
+    <w:bookmarkStart w:id="26" w:name="associação-dentro-das-unidades-h2"/>
     <w:p>
       <w:pPr>
         <w:pStyle w:val="Heading3"/>
@@ -1951,8 +2239,8 @@
         </w:tc>
       </w:tr>
     </w:tbl>
-    <w:bookmarkEnd w:id="23"/>
-    <w:bookmarkStart w:id="24" w:name="X25b1f22221eb48867ffad697f441343b62d7f93"/>
+    <w:bookmarkEnd w:id="26"/>
+    <w:bookmarkStart w:id="33" w:name="X25b1f22221eb48867ffad697f441343b62d7f93"/>
     <w:p>
       <w:pPr>
         <w:pStyle w:val="Heading3"/>
@@ -2014,31 +2302,53 @@
         <w:t xml:space="preserve">, não de validação externa nem de réplica da dimensão entre unidades (Figuras 2 e 3).</w:t>
       </w:r>
     </w:p>
-    <w:tbl>
-      <w:tblPr>
-        <w:tblStyle w:val="FigureTable"/>
-        <w:tblW w:type="auto" w:w="0"/>
-        <w:jc w:val="center"/>
-        <w:tblLook w:firstRow="0" w:lastRow="0" w:firstColumn="0" w:lastColumn="0"/>
-      </w:tblPr>
-      <w:tblGrid>
-        <w:gridCol w:w="7920"/>
-      </w:tblGrid>
-      <w:tr>
-        <w:tc>
-          <w:tcPr/>
-          <w:p>
-            <w:pPr>
-              <w:pStyle w:val="Compact"/>
-              <w:jc w:val="center"/>
-            </w:pPr>
-            <w:r>
-              <w:t xml:space="preserve">Figura 2 — Trajetória do IDEB por município, 2007–2025 (anos iniciais e finais).</w:t>
-            </w:r>
-          </w:p>
-        </w:tc>
-      </w:tr>
-    </w:tbl>
+    <w:p>
+      <w:pPr>
+        <w:pStyle w:val="CaptionedFigure"/>
+      </w:pPr>
+      <w:r>
+        <w:drawing>
+          <wp:inline>
+            <wp:extent cx="5753100" cy="2520405"/>
+            <wp:effectExtent b="0" l="0" r="0" t="0"/>
+            <wp:docPr descr="Figura 2 — Trajetória do IDEB por município, 2007–2025 (anos iniciais e finais)." title="" id="28" name="Picture"/>
+            <a:graphic>
+              <a:graphicData uri="http://schemas.openxmlformats.org/drawingml/2006/picture">
+                <pic:pic>
+                  <pic:nvPicPr>
+                    <pic:cNvPr descr="outputs/figuras/fig_serie_ideb_micro.png" id="29" name="Picture"/>
+                    <pic:cNvPicPr>
+                      <a:picLocks noChangeArrowheads="1" noChangeAspect="1"/>
+                    </pic:cNvPicPr>
+                  </pic:nvPicPr>
+                  <pic:blipFill>
+                    <a:blip r:embed="rId27"/>
+                    <a:stretch>
+                      <a:fillRect/>
+                    </a:stretch>
+                  </pic:blipFill>
+                  <pic:spPr bwMode="auto">
+                    <a:xfrm>
+                      <a:off x="0" y="0"/>
+                      <a:ext cx="5753100" cy="2520405"/>
+                    </a:xfrm>
+                    <a:prstGeom prst="rect">
+                      <a:avLst/>
+                    </a:prstGeom>
+                    <a:noFill/>
+                    <a:ln w="9525">
+                      <a:noFill/>
+                      <a:headEnd/>
+                      <a:tailEnd/>
+                    </a:ln>
+                  </pic:spPr>
+                </pic:pic>
+              </a:graphicData>
+            </a:graphic>
+          </wp:inline>
+        </w:drawing>
+      </w:r>
+    </w:p>
     <w:p>
       <w:pPr>
         <w:pStyle w:val="ImageCaption"/>
@@ -2047,31 +2357,53 @@
         <w:t xml:space="preserve">Figura 2 — Trajetória do IDEB por município, 2007–2025 (anos iniciais e finais).</w:t>
       </w:r>
     </w:p>
-    <w:tbl>
-      <w:tblPr>
-        <w:tblStyle w:val="FigureTable"/>
-        <w:tblW w:type="auto" w:w="0"/>
-        <w:jc w:val="center"/>
-        <w:tblLook w:firstRow="0" w:lastRow="0" w:firstColumn="0" w:lastColumn="0"/>
-      </w:tblPr>
-      <w:tblGrid>
-        <w:gridCol w:w="7920"/>
-      </w:tblGrid>
-      <w:tr>
-        <w:tc>
-          <w:tcPr/>
-          <w:p>
-            <w:pPr>
-              <w:pStyle w:val="Compact"/>
-              <w:jc w:val="center"/>
-            </w:pPr>
-            <w:r>
-              <w:t xml:space="preserve">Figura 3 — Validação interna: correlação dentro do município retido (r em níveis).</w:t>
-            </w:r>
-          </w:p>
-        </w:tc>
-      </w:tr>
-    </w:tbl>
+    <w:p>
+      <w:pPr>
+        <w:pStyle w:val="CaptionedFigure"/>
+      </w:pPr>
+      <w:r>
+        <w:drawing>
+          <wp:inline>
+            <wp:extent cx="5753100" cy="3179344"/>
+            <wp:effectExtent b="0" l="0" r="0" t="0"/>
+            <wp:docPr descr="Figura 3 — Validação interna: correlação dentro do município retido (r em níveis)." title="" id="31" name="Picture"/>
+            <a:graphic>
+              <a:graphicData uri="http://schemas.openxmlformats.org/drawingml/2006/picture">
+                <pic:pic>
+                  <pic:nvPicPr>
+                    <pic:cNvPr descr="outputs/figuras/fig_loocv_r_teste.png" id="32" name="Picture"/>
+                    <pic:cNvPicPr>
+                      <a:picLocks noChangeArrowheads="1" noChangeAspect="1"/>
+                    </pic:cNvPicPr>
+                  </pic:nvPicPr>
+                  <pic:blipFill>
+                    <a:blip r:embed="rId30"/>
+                    <a:stretch>
+                      <a:fillRect/>
+                    </a:stretch>
+                  </pic:blipFill>
+                  <pic:spPr bwMode="auto">
+                    <a:xfrm>
+                      <a:off x="0" y="0"/>
+                      <a:ext cx="5753100" cy="3179344"/>
+                    </a:xfrm>
+                    <a:prstGeom prst="rect">
+                      <a:avLst/>
+                    </a:prstGeom>
+                    <a:noFill/>
+                    <a:ln w="9525">
+                      <a:noFill/>
+                      <a:headEnd/>
+                      <a:tailEnd/>
+                    </a:ln>
+                  </pic:spPr>
+                </pic:pic>
+              </a:graphicData>
+            </a:graphic>
+          </wp:inline>
+        </w:drawing>
+      </w:r>
+    </w:p>
     <w:p>
       <w:pPr>
         <w:pStyle w:val="ImageCaption"/>
@@ -2378,8 +2710,8 @@
         </w:tc>
       </w:tr>
     </w:tbl>
-    <w:bookmarkEnd w:id="24"/>
-    <w:bookmarkStart w:id="25" w:name="mdes-e-tost"/>
+    <w:bookmarkEnd w:id="33"/>
+    <w:bookmarkStart w:id="34" w:name="mdes-e-tost"/>
     <w:p>
       <w:pPr>
         <w:pStyle w:val="Heading3"/>
@@ -2425,8 +2757,8 @@
         <w:t xml:space="preserve">: a amostra não permite afirmar efeito, mas tampouco permite declarar equivalência. Essa é uma limitação central, explicitamente assumida (Lakens; Scheel; Isager, 2018).</w:t>
       </w:r>
     </w:p>
-    <w:bookmarkEnd w:id="25"/>
-    <w:bookmarkStart w:id="26" w:name="h3-metas-do-inep-e-ganho-educacional"/>
+    <w:bookmarkEnd w:id="34"/>
+    <w:bookmarkStart w:id="38" w:name="h3-metas-do-inep-e-ganho-educacional"/>
     <w:p>
       <w:pPr>
         <w:pStyle w:val="Heading3"/>
@@ -2485,31 +2817,70 @@
         <w:t xml:space="preserve">o ganho médio do IDEB de anos iniciais entre 2007 e 2025 foi de 5,93 pontos, com todos os municípios acima da meta; a correlação entre ganho e renda média do responsável foi r = −0,14 (p = 0,73; n = 9; Figura 4). Não há evidência de que municípios com maior renda tenham tido maior ganho educacional.</w:t>
       </w:r>
     </w:p>
-    <w:tbl>
-      <w:tblPr>
-        <w:tblStyle w:val="FigureTable"/>
-        <w:tblW w:type="auto" w:w="0"/>
-        <w:jc w:val="center"/>
-        <w:tblLook w:firstRow="0" w:lastRow="0" w:firstColumn="0" w:lastColumn="0"/>
-      </w:tblPr>
-      <w:tblGrid>
-        <w:gridCol w:w="7920"/>
-      </w:tblGrid>
-      <w:tr>
-        <w:tc>
-          <w:tcPr/>
-          <w:p>
-            <w:pPr>
-              <w:pStyle w:val="Compact"/>
-              <w:jc w:val="center"/>
-            </w:pPr>
-            <w:r>
-              <w:t xml:space="preserve">Figura 4 — Ganho de IDEB (2007→2025, anos iniciais) e renda média do responsável (Censo 2022).</w:t>
-            </w:r>
-          </w:p>
-        </w:tc>
-      </w:tr>
-    </w:tbl>
+    <w:p>
+      <w:pPr>
+        <w:pStyle w:val="BodyText"/>
+      </w:pPr>
+      <w:r>
+        <w:t xml:space="preserve">O cumprimento quase universal das metas projetadas — em uma região de pobreza estrutural — é um resultado substantivo em si. As metas do INEP foram desenhadas como projeções de convergência (Soares; Xavier, 2013): cada unidade deveria progredir de seu ponto de partida em direção à média dos países da OCDE. Que nove municípios pequenos do Semiárido tenham superado sistematicamente suas próprias projeções indica um ritmo de melhora acima do programado institucionalmente, e não apenas</w:t>
+      </w:r>
+      <w:r>
+        <w:t xml:space="preserve"> </w:t>
+      </w:r>
+      <w:r>
+        <w:t xml:space="preserve">“cumprimento de tabela”</w:t>
+      </w:r>
+      <w:r>
+        <w:t xml:space="preserve">. O ganho médio de 5,93 pontos em 18 anos equivale a mais de um terço da escala do IDEB (0–10), o que situa a microrregião entre as trajetórias mais aceleradas do país — sem associação com a renda local, como mostra a correlação nula do ganho com a renda do responsável.</w:t>
+      </w:r>
+    </w:p>
+    <w:p>
+      <w:pPr>
+        <w:pStyle w:val="CaptionedFigure"/>
+      </w:pPr>
+      <w:r>
+        <w:drawing>
+          <wp:inline>
+            <wp:extent cx="5753100" cy="3835400"/>
+            <wp:effectExtent b="0" l="0" r="0" t="0"/>
+            <wp:docPr descr="Figura 4 — Ganho de IDEB (2007→2025, anos iniciais) e renda média do responsável (Censo 2022)." title="" id="36" name="Picture"/>
+            <a:graphic>
+              <a:graphicData uri="http://schemas.openxmlformats.org/drawingml/2006/picture">
+                <pic:pic>
+                  <pic:nvPicPr>
+                    <pic:cNvPr descr="outputs/figuras/fig_scatter_ganho_renda.png" id="37" name="Picture"/>
+                    <pic:cNvPicPr>
+                      <a:picLocks noChangeArrowheads="1" noChangeAspect="1"/>
+                    </pic:cNvPicPr>
+                  </pic:nvPicPr>
+                  <pic:blipFill>
+                    <a:blip r:embed="rId35"/>
+                    <a:stretch>
+                      <a:fillRect/>
+                    </a:stretch>
+                  </pic:blipFill>
+                  <pic:spPr bwMode="auto">
+                    <a:xfrm>
+                      <a:off x="0" y="0"/>
+                      <a:ext cx="5753100" cy="3835400"/>
+                    </a:xfrm>
+                    <a:prstGeom prst="rect">
+                      <a:avLst/>
+                    </a:prstGeom>
+                    <a:noFill/>
+                    <a:ln w="9525">
+                      <a:noFill/>
+                      <a:headEnd/>
+                      <a:tailEnd/>
+                    </a:ln>
+                  </pic:spPr>
+                </pic:pic>
+              </a:graphicData>
+            </a:graphic>
+          </wp:inline>
+        </w:drawing>
+      </w:r>
+    </w:p>
     <w:p>
       <w:pPr>
         <w:pStyle w:val="ImageCaption"/>
@@ -3340,8 +3711,8 @@
         </w:tc>
       </w:tr>
     </w:tbl>
-    <w:bookmarkEnd w:id="26"/>
-    <w:bookmarkStart w:id="27" w:name="robustez-da-defasagem"/>
+    <w:bookmarkEnd w:id="38"/>
+    <w:bookmarkStart w:id="39" w:name="robustez-da-defasagem"/>
     <w:p>
       <w:pPr>
         <w:pStyle w:val="Heading3"/>
@@ -3358,8 +3729,8 @@
         <w:t xml:space="preserve">Para as defasagens 0–4, a correlação pooled (níveis) variou entre r = 0,16 e r = 0,26 na microrregião e as primeiras diferenças oscilaram entre −0,07 e +0,18, sem padrão monotônico — reforçando que nenhuma especificação produz associação temporal discernível na microrregião.</w:t>
       </w:r>
     </w:p>
-    <w:bookmarkEnd w:id="27"/>
-    <w:bookmarkStart w:id="28" w:name="mapas"/>
+    <w:bookmarkEnd w:id="39"/>
+    <w:bookmarkStart w:id="46" w:name="mapas"/>
     <w:p>
       <w:pPr>
         <w:pStyle w:val="Heading3"/>
@@ -3376,31 +3747,53 @@
         <w:t xml:space="preserve">Os mapas coropléticos (Figuras 5 e 6) apresentam os dois proxies oficiais de desenvolvimento por município: renda média mensal do responsável (Censo 2022, IBGE) e PIB per capita (2021, IBGE). Crateús, sede regional, destaca-se em ambos os indicadores; os demais municípios concentram-se nas faixas inferiores, retratando a heterogeneidade intra-regional que a análise transversal explora.</w:t>
       </w:r>
     </w:p>
-    <w:tbl>
-      <w:tblPr>
-        <w:tblStyle w:val="FigureTable"/>
-        <w:tblW w:type="auto" w:w="0"/>
-        <w:jc w:val="center"/>
-        <w:tblLook w:firstRow="0" w:lastRow="0" w:firstColumn="0" w:lastColumn="0"/>
-      </w:tblPr>
-      <w:tblGrid>
-        <w:gridCol w:w="7920"/>
-      </w:tblGrid>
-      <w:tr>
-        <w:tc>
-          <w:tcPr/>
-          <w:p>
-            <w:pPr>
-              <w:pStyle w:val="Compact"/>
-              <w:jc w:val="center"/>
-            </w:pPr>
-            <w:r>
-              <w:t xml:space="preserve">Figura 5 — Renda média mensal do responsável por município (Censo 2022, IBGE).</w:t>
-            </w:r>
-          </w:p>
-        </w:tc>
-      </w:tr>
-    </w:tbl>
+    <w:p>
+      <w:pPr>
+        <w:pStyle w:val="CaptionedFigure"/>
+      </w:pPr>
+      <w:r>
+        <w:drawing>
+          <wp:inline>
+            <wp:extent cx="5753100" cy="5890876"/>
+            <wp:effectExtent b="0" l="0" r="0" t="0"/>
+            <wp:docPr descr="Figura 5 — Renda média mensal do responsável por município (Censo 2022, IBGE)." title="" id="41" name="Picture"/>
+            <a:graphic>
+              <a:graphicData uri="http://schemas.openxmlformats.org/drawingml/2006/picture">
+                <pic:pic>
+                  <pic:nvPicPr>
+                    <pic:cNvPr descr="outputs/mapas/mapa_renda_responsavel_censo2022.png" id="42" name="Picture"/>
+                    <pic:cNvPicPr>
+                      <a:picLocks noChangeArrowheads="1" noChangeAspect="1"/>
+                    </pic:cNvPicPr>
+                  </pic:nvPicPr>
+                  <pic:blipFill>
+                    <a:blip r:embed="rId40"/>
+                    <a:stretch>
+                      <a:fillRect/>
+                    </a:stretch>
+                  </pic:blipFill>
+                  <pic:spPr bwMode="auto">
+                    <a:xfrm>
+                      <a:off x="0" y="0"/>
+                      <a:ext cx="5753100" cy="5890876"/>
+                    </a:xfrm>
+                    <a:prstGeom prst="rect">
+                      <a:avLst/>
+                    </a:prstGeom>
+                    <a:noFill/>
+                    <a:ln w="9525">
+                      <a:noFill/>
+                      <a:headEnd/>
+                      <a:tailEnd/>
+                    </a:ln>
+                  </pic:spPr>
+                </pic:pic>
+              </a:graphicData>
+            </a:graphic>
+          </wp:inline>
+        </w:drawing>
+      </w:r>
+    </w:p>
     <w:p>
       <w:pPr>
         <w:pStyle w:val="ImageCaption"/>
@@ -3409,31 +3802,53 @@
         <w:t xml:space="preserve">Figura 5 — Renda média mensal do responsável por município (Censo 2022, IBGE).</w:t>
       </w:r>
     </w:p>
-    <w:tbl>
-      <w:tblPr>
-        <w:tblStyle w:val="FigureTable"/>
-        <w:tblW w:type="auto" w:w="0"/>
-        <w:jc w:val="center"/>
-        <w:tblLook w:firstRow="0" w:lastRow="0" w:firstColumn="0" w:lastColumn="0"/>
-      </w:tblPr>
-      <w:tblGrid>
-        <w:gridCol w:w="7920"/>
-      </w:tblGrid>
-      <w:tr>
-        <w:tc>
-          <w:tcPr/>
-          <w:p>
-            <w:pPr>
-              <w:pStyle w:val="Compact"/>
-              <w:jc w:val="center"/>
-            </w:pPr>
-            <w:r>
-              <w:t xml:space="preserve">Figura 6 — PIB per capita por município (2021, IBGE).</w:t>
-            </w:r>
-          </w:p>
-        </w:tc>
-      </w:tr>
-    </w:tbl>
+    <w:p>
+      <w:pPr>
+        <w:pStyle w:val="CaptionedFigure"/>
+      </w:pPr>
+      <w:r>
+        <w:drawing>
+          <wp:inline>
+            <wp:extent cx="5753100" cy="6294568"/>
+            <wp:effectExtent b="0" l="0" r="0" t="0"/>
+            <wp:docPr descr="Figura 6 — PIB per capita por município (2021, IBGE)." title="" id="44" name="Picture"/>
+            <a:graphic>
+              <a:graphicData uri="http://schemas.openxmlformats.org/drawingml/2006/picture">
+                <pic:pic>
+                  <pic:nvPicPr>
+                    <pic:cNvPr descr="outputs/mapas/mapa_pib_per_capita_2021.png" id="45" name="Picture"/>
+                    <pic:cNvPicPr>
+                      <a:picLocks noChangeArrowheads="1" noChangeAspect="1"/>
+                    </pic:cNvPicPr>
+                  </pic:nvPicPr>
+                  <pic:blipFill>
+                    <a:blip r:embed="rId43"/>
+                    <a:stretch>
+                      <a:fillRect/>
+                    </a:stretch>
+                  </pic:blipFill>
+                  <pic:spPr bwMode="auto">
+                    <a:xfrm>
+                      <a:off x="0" y="0"/>
+                      <a:ext cx="5753100" cy="6294568"/>
+                    </a:xfrm>
+                    <a:prstGeom prst="rect">
+                      <a:avLst/>
+                    </a:prstGeom>
+                    <a:noFill/>
+                    <a:ln w="9525">
+                      <a:noFill/>
+                      <a:headEnd/>
+                      <a:tailEnd/>
+                    </a:ln>
+                  </pic:spPr>
+                </pic:pic>
+              </a:graphicData>
+            </a:graphic>
+          </wp:inline>
+        </w:drawing>
+      </w:r>
+    </w:p>
     <w:p>
       <w:pPr>
         <w:pStyle w:val="ImageCaption"/>
@@ -3442,9 +3857,9 @@
         <w:t xml:space="preserve">Figura 6 — PIB per capita por município (2021, IBGE).</w:t>
       </w:r>
     </w:p>
-    <w:bookmarkEnd w:id="28"/>
-    <w:bookmarkEnd w:id="29"/>
-    <w:bookmarkStart w:id="30" w:name="discussão"/>
+    <w:bookmarkEnd w:id="46"/>
+    <w:bookmarkEnd w:id="47"/>
+    <w:bookmarkStart w:id="49" w:name="discussão"/>
     <w:p>
       <w:pPr>
         <w:pStyle w:val="Heading2"/>
@@ -3500,7 +3915,40 @@
         <w:pStyle w:val="BodyText"/>
       </w:pPr>
       <w:r>
-        <w:t xml:space="preserve">As limitações são explícitas: (i) n municipal de 9 e 108 observações implica poder estatístico baixo (MDES ≈ 6,0 com erro clusterizado), tornando a ausência de associação temporal e transversal uma</w:t>
+        <w:t xml:space="preserve">A leitura em duas dimensões ajuda a conciliar resultados que, isolados, pareceriam contraditórios. A associação transversal no Brasil (r = 0,49) reproduz o que a literatura documenta há décadas: municípios e estados mais ricos tendem a ter melhor desempenho médio (Duarte, 2013; Andrews; Vries, 2012). Mas esse padrão, quando observado no interior de um único estado pobre, desaparece: no Ceará o between foi r = 0,03, e na microrregião, r = −0,24. Isso indica que a associação nacional é, em grande parte, um artefato de comparação entre contextos muito heterogêneos (estados ricos do Sul e Sudeste versus municípios pobres do Semiárido), e não uma regularidade que se mantenha quando se compara apenas unidades semelhantes. A ausência de associação temporal dentro das unidades reforça a mesma conclusão: mesmo quando o PIB municipal varia, o IDEB não acompanha — o que é consistente com a hipótese de que os determinantes do desempenho estão mais próximos da política educacional (formação, materiais, gestão, avaliação) do que do ciclo econômico local.</w:t>
+      </w:r>
+    </w:p>
+    <w:bookmarkStart w:id="48" w:name="limitações-e-agenda-de-pesquisa"/>
+    <w:p>
+      <w:pPr>
+        <w:pStyle w:val="Heading3"/>
+      </w:pPr>
+      <w:r>
+        <w:t xml:space="preserve">5.3 Limitações e agenda de pesquisa</w:t>
+      </w:r>
+    </w:p>
+    <w:p>
+      <w:pPr>
+        <w:pStyle w:val="FirstParagraph"/>
+      </w:pPr>
+      <w:r>
+        <w:t xml:space="preserve">As limitações são explícitas e determinam o alcance das conclusões. (i)</w:t>
+      </w:r>
+      <w:r>
+        <w:t xml:space="preserve"> </w:t>
+      </w:r>
+      <w:r>
+        <w:rPr>
+          <w:b/>
+          <w:bCs/>
+        </w:rPr>
+        <w:t xml:space="preserve">Poder estatístico:</w:t>
+      </w:r>
+      <w:r>
+        <w:t xml:space="preserve"> </w:t>
+      </w:r>
+      <w:r>
+        <w:t xml:space="preserve">n municipal de 9 e 108 observações implica poder baixo (MDES ≈ 6,0 com erro clusterizado), de modo que a ausência de associação temporal e transversal é uma</w:t>
       </w:r>
       <w:r>
         <w:t xml:space="preserve"> </w:t>
@@ -3516,11 +3964,92 @@
         <w:t xml:space="preserve"> </w:t>
       </w:r>
       <w:r>
-        <w:t xml:space="preserve">e não uma prova de ausência; (ii) com G = 9, o teste t cluster pode super-rejeitar — daí o wild cluster bootstrap como robustez (MacKinnon; Webb, 2017); (iii) o PIB municipal e a renda do responsável são proxies do desenvolvimento local — o IPCE original não é auditável; (iv) não há pretensão causal; (v) os efeitos fixos controlam fatores invariantes no tempo e choques comuns por ano, mas não outros confundidores variáveis; (vi) a comparação das metas do INEP é descritiva e não controla por tendências subjacentes.</w:t>
-      </w:r>
-    </w:p>
-    <w:bookmarkEnd w:id="30"/>
-    <w:bookmarkStart w:id="31" w:name="considerações-finais"/>
+        <w:t xml:space="preserve">e não uma prova de ausência; a única afirmação segura é a de precisão insuficiente para efeitos plausíveis. (ii)</w:t>
+      </w:r>
+      <w:r>
+        <w:t xml:space="preserve"> </w:t>
+      </w:r>
+      <w:r>
+        <w:rPr>
+          <w:b/>
+          <w:bCs/>
+        </w:rPr>
+        <w:t xml:space="preserve">Número de clusters:</w:t>
+      </w:r>
+      <w:r>
+        <w:t xml:space="preserve"> </w:t>
+      </w:r>
+      <w:r>
+        <w:t xml:space="preserve">com G = 9, o teste t cluster pode super-rejeitar — daí o wild cluster bootstrap como robustez (MacKinnon; Webb, 2017); ainda assim, a distribuição bootstrap é discreta e o valor-p tem granularidade própria desse contexto. (iii)</w:t>
+      </w:r>
+      <w:r>
+        <w:t xml:space="preserve"> </w:t>
+      </w:r>
+      <w:r>
+        <w:rPr>
+          <w:b/>
+          <w:bCs/>
+        </w:rPr>
+        <w:t xml:space="preserve">Proxies de desenvolvimento:</w:t>
+      </w:r>
+      <w:r>
+        <w:t xml:space="preserve"> </w:t>
+      </w:r>
+      <w:r>
+        <w:t xml:space="preserve">o PIB municipal e a renda do responsável são proxies imperfeitas do desenvolvimento local; o IPCE (Índice de Pobreza, Ceará) original não é auditável publicamente, o que motivou a escolha de fontes oficiais verificáveis. (iv)</w:t>
+      </w:r>
+      <w:r>
+        <w:t xml:space="preserve"> </w:t>
+      </w:r>
+      <w:r>
+        <w:rPr>
+          <w:b/>
+          <w:bCs/>
+        </w:rPr>
+        <w:t xml:space="preserve">Causalidade:</w:t>
+      </w:r>
+      <w:r>
+        <w:t xml:space="preserve"> </w:t>
+      </w:r>
+      <w:r>
+        <w:t xml:space="preserve">não há pretensão causal; os efeitos fixos controlam fatores invariantes no tempo e choques comuns por ano, mas não outros confundidores variáveis no tempo (mudanças de gestão, transferências federais, oferta de creches). (v)</w:t>
+      </w:r>
+      <w:r>
+        <w:t xml:space="preserve"> </w:t>
+      </w:r>
+      <w:r>
+        <w:rPr>
+          <w:b/>
+          <w:bCs/>
+        </w:rPr>
+        <w:t xml:space="preserve">Metas do INEP:</w:t>
+      </w:r>
+      <w:r>
+        <w:t xml:space="preserve"> </w:t>
+      </w:r>
+      <w:r>
+        <w:t xml:space="preserve">a comparação com as metas é descritiva e não controla por tendências subjacentes nem por comportamento estratégico de municípios. (vi)</w:t>
+      </w:r>
+      <w:r>
+        <w:t xml:space="preserve"> </w:t>
+      </w:r>
+      <w:r>
+        <w:rPr>
+          <w:b/>
+          <w:bCs/>
+        </w:rPr>
+        <w:t xml:space="preserve">Generalização:</w:t>
+      </w:r>
+      <w:r>
+        <w:t xml:space="preserve"> </w:t>
+      </w:r>
+      <w:r>
+        <w:t xml:space="preserve">os resultados se referem a uma microrregião de 9 municípios; sua validade externa para o Semiárido ou o país deve ser estabelecida por replicação. Para a agenda de pesquisa, recomenda-se ampliar o painel para todas as microrregiões cearenses e estaduais (aumentando o número efetivo de unidades e, portanto, o poder), incorporar controles de política (PAIC, ICMS educacional, FUNDEB per capita) e utilizar estratégias quase-experimentais — descontinuidades nas regras de repasse ou no sorteio de programas — para testar mecanismos causais específicos.</w:t>
+      </w:r>
+    </w:p>
+    <w:bookmarkEnd w:id="48"/>
+    <w:bookmarkEnd w:id="49"/>
+    <w:bookmarkStart w:id="50" w:name="considerações-finais"/>
     <w:p>
       <w:pPr>
         <w:pStyle w:val="Heading2"/>
@@ -3553,8 +4082,16 @@
         <w:t xml:space="preserve">— a associação transversal observada no agregado nacional não se reproduz na microrregião, e a variação temporal da renda não acompanha a variação do desempenho. Adicionalmente, os dados oficiais mostram que os nove municípios atingiram ou superaram as metas projetadas pelo INEP na grande maioria das 108 comparações município-etapa-ano (99,1%; único desvio em Ipaporanga, 2013) — e, em 2021, todos os 18 pares cumpriram a meta —, com ganhos médios de cerca de seis pontos no período 2007–2025 e IDEB 2025 elevado mesmo em municípios de baixa renda. A ausência de associação entre ganho educacional e renda sugere que fatores de política educacional — e não a variação econômica — estão associados à trajetória observada, em linha com a literatura do Ceará. Recomenda-se, para estudos futuros, ampliar o painel para todas as microrregiões cearenses e estaduais (aumentando o número efetivo de unidades), incorporar controles de política (PAIC, ICMS educacional) e utilizar estratégias quase-experimentais para testar mecanismos causais específicos.</w:t>
       </w:r>
     </w:p>
-    <w:bookmarkEnd w:id="31"/>
-    <w:bookmarkStart w:id="32" w:name="referências"/>
+    <w:p>
+      <w:pPr>
+        <w:pStyle w:val="BodyText"/>
+      </w:pPr>
+      <w:r>
+        <w:t xml:space="preserve">As implicações práticas decorrentes são diretamente utilizáveis por gestores municipais e estaduais. Primeiro, o nível de renda municipal não deve ser tratado como destino: a trajetória da microrregião mostra que municípios pobres podem sustentar ganhos educacionais acelerados e cumprir metas institucionais quando há coordenação de política (formação, materiais, avaliação, regime de colaboração). Segundo, indicadores de desempenho baseados exclusivamente em proficiência e fluxo, embora necessários, são insuficientes para diagnosticar desigualdades de contexto; a leitura conjunta com indicadores socioeconômicos (como aqui feito com o PIB e a renda do responsável) evita atribuições equivocadas de sucesso ou fracasso. Terceiro, a distinção entre associação transversal e temporal deve orientar o monitoramento: metas de convergência fazem sentido porque o avanço temporal é alcançável mesmo onde o nível socioeconômico é adverso — desde que a política educacional atue de forma contínua e coordenada, como no caso cearense (Costa; Carnoy, 2015; Carnoy et al., 2017).</w:t>
+      </w:r>
+    </w:p>
+    <w:bookmarkEnd w:id="50"/>
+    <w:bookmarkStart w:id="51" w:name="referências"/>
     <w:p>
       <w:pPr>
         <w:pStyle w:val="Heading2"/>
@@ -3941,8 +4478,8 @@
         <w:t xml:space="preserve">, Campinas, v. 34, n. 124, p. 903–923, 2013. https://doi.org/10.1590/S0101-73302013000300013</w:t>
       </w:r>
     </w:p>
-    <w:bookmarkEnd w:id="32"/>
-    <w:bookmarkStart w:id="33" w:name="Xb81c9ee436544be0586c5f0ff6fd02321a9d8f1"/>
+    <w:bookmarkEnd w:id="51"/>
+    <w:bookmarkStart w:id="52" w:name="Xb81c9ee436544be0586c5f0ff6fd02321a9d8f1"/>
     <w:p>
       <w:pPr>
         <w:pStyle w:val="Heading2"/>
@@ -4189,8 +4726,8 @@
         <w:t xml:space="preserve">Declaração de limites: evidência associativa; n municipal de 9; MDES ≈ 6,0 (cluster); não-detecção ≠ equivalência; IPCE substituído por proxies oficiais; G=9 com wild cluster bootstrap (MacKinnon; Webb, 2017).</w:t>
       </w:r>
     </w:p>
-    <w:bookmarkEnd w:id="33"/>
-    <w:bookmarkEnd w:id="34"/>
+    <w:bookmarkEnd w:id="52"/>
+    <w:bookmarkEnd w:id="53"/>
     <w:sectPr>
       <w:footnotePr>
         <w:numRestart w:val="eachSect"/>

</xml_diff>